<commit_message>
Add command sweeper, fix channel labeling, decode status beacon
- ble_sweep_PWT.py: sweep command ids (default 0x01-0x0f, safe range) to find
  which opcode wakes the DATA channel (61080004); flags hits, logs per-cmd.
- whoop_protocol_PWT.py: add cname()/CHAR_NAMES and SEVEN_CHAR_UUID so channels
  are labeled unambiguously (all WHOOP chars share the ...b0f8dcc6 suffix; they
  differ in the first block).
- ble_stream_PWT.py, ble_command_PWT.py: use cname() instead of last-8-chars.
- docs/BUILD_LOG_PWT.md: record that cmd 0x03 only yields the ~2s EVENT-channel
  status beacon (decoded: fw 17.2.2.0, hw harvard_r10, codename boylston), the
  labeling fix, the sweeper, and updated next steps. Regenerated PDF/DOCX.

Co-Authored-By: Claude Opus 4.8 <noreply@anthropic.com>
Claude-Session: https://claude.ai/code/session_01PeXJzKdFE3zg9AVZQtc4Pw
</commit_message>
<xml_diff>
--- a/docs/BUILD_LOG_PWT.docx
+++ b/docs/BUILD_LOG_PWT.docx
@@ -45,7 +45,7 @@
         <w:t>Last updated:</w:t>
       </w:r>
       <w:r>
-        <w:t xml:space="preserve"> 2026-09-30</w:t>
+        <w:t xml:space="preserve"> 2026-10-01</w:t>
       </w:r>
     </w:p>
     <w:p>
@@ -814,6 +814,32 @@
           </w:p>
         </w:tc>
       </w:tr>
+      <w:tr>
+        <w:tc>
+          <w:tcPr>
+            <w:tcW w:type="dxa" w:w="4320"/>
+          </w:tcPr>
+          <w:p>
+            <w:r>
+              <w:rPr>
+                <w:rFonts w:ascii="Consolas" w:hAnsi="Consolas"/>
+                <w:sz w:val="18"/>
+              </w:rPr>
+              <w:t>ble_sweep_PWT.py</w:t>
+            </w:r>
+          </w:p>
+        </w:tc>
+        <w:tc>
+          <w:tcPr>
+            <w:tcW w:type="dxa" w:w="4320"/>
+          </w:tcPr>
+          <w:p>
+            <w:r>
+              <w:t>Sweep a range of command IDs to find which one wakes the data channel.</w:t>
+            </w:r>
+          </w:p>
+        </w:tc>
+      </w:tr>
     </w:tbl>
     <w:p>
       <w:r>
@@ -1093,25 +1119,206 @@
         <w:rPr>
           <w:b/>
         </w:rPr>
-        <w:t>← You are here.</w:t>
-      </w:r>
-      <w:r>
-        <w:t xml:space="preserve"> Next run: </w:t>
+        <w:t>Ran the full HELLO → START sequence (`ble_stream_PWT.py`).</w:t>
+      </w:r>
+      <w:r>
+        <w:t xml:space="preserve"> The band came</w:t>
+      </w:r>
+    </w:p>
+    <w:p>
+      <w:r>
+        <w:t xml:space="preserve">alive — </w:t>
+      </w:r>
+      <w:r>
+        <w:rPr>
+          <w:b/>
+        </w:rPr>
+        <w:t>15 packets in 30s</w:t>
+      </w:r>
+      <w:r>
+        <w:t xml:space="preserve"> — but </w:t>
+      </w:r>
+      <w:r>
+        <w:rPr>
+          <w:b/>
+        </w:rPr>
+        <w:t>all on the EVENT channel (61080003)</w:t>
+      </w:r>
+      <w:r>
+        <w:t xml:space="preserve">, a repeating ~2s </w:t>
+      </w:r>
+      <w:r>
+        <w:rPr>
+          <w:b/>
+        </w:rPr>
+        <w:t>status beacon</w:t>
+      </w:r>
+      <w:r>
+        <w:t>, *not* the 96-byte sensor stream on the DATA channel (61080004, which stayed silent). Two outcomes:</w:t>
+      </w:r>
+    </w:p>
+    <w:p>
+      <w:pPr>
+        <w:pStyle w:val="ListBullet"/>
+      </w:pPr>
+      <w:r>
+        <w:rPr>
+          <w:b/>
+        </w:rPr>
+        <w:t>Decoded the beacon's identity fields</w:t>
+      </w:r>
+      <w:r>
+        <w:t xml:space="preserve"> (see §6.5): codename </w:t>
       </w:r>
       <w:r>
         <w:rPr>
           <w:rFonts w:ascii="Consolas" w:hAnsi="Consolas"/>
           <w:sz w:val="18"/>
         </w:rPr>
-        <w:t>ble_stream_PWT.py</w:t>
-      </w:r>
-      <w:r>
-        <w:t xml:space="preserve"> to capture data-channel</w:t>
+        <w:t>boylston</w:t>
+      </w:r>
+      <w:r>
+        <w:t>,</w:t>
       </w:r>
     </w:p>
     <w:p>
       <w:r>
-        <w:t>packets, then build the decoder.</w:t>
+        <w:t xml:space="preserve">firmware </w:t>
+      </w:r>
+      <w:r>
+        <w:rPr>
+          <w:b/>
+        </w:rPr>
+        <w:t>17.2.2.0</w:t>
+      </w:r>
+      <w:r>
+        <w:t xml:space="preserve">, hardware </w:t>
+      </w:r>
+      <w:r>
+        <w:rPr>
+          <w:b/>
+        </w:rPr>
+        <w:t>harvard_r10</w:t>
+      </w:r>
+      <w:r>
+        <w:t>.</w:t>
+      </w:r>
+    </w:p>
+    <w:p>
+      <w:pPr>
+        <w:pStyle w:val="ListBullet"/>
+      </w:pPr>
+      <w:r>
+        <w:rPr>
+          <w:b/>
+        </w:rPr>
+        <w:t>Found &amp; fixed a display bug:</w:t>
+      </w:r>
+      <w:r>
+        <w:t xml:space="preserve"> the tools labelled channels by the *last* 8</w:t>
+      </w:r>
+    </w:p>
+    <w:p>
+      <w:r>
+        <w:t xml:space="preserve">UUID chars, but every WHOOP characteristic ends in </w:t>
+      </w:r>
+      <w:r>
+        <w:rPr>
+          <w:rFonts w:ascii="Consolas" w:hAnsi="Consolas"/>
+          <w:sz w:val="18"/>
+        </w:rPr>
+        <w:t>…b0f8dcc6</w:t>
+      </w:r>
+      <w:r>
+        <w:t>, so all channels printed the same label. They differ in the *first* block (</w:t>
+      </w:r>
+      <w:r>
+        <w:rPr>
+          <w:rFonts w:ascii="Consolas" w:hAnsi="Consolas"/>
+          <w:sz w:val="18"/>
+        </w:rPr>
+        <w:t>6108000x</w:t>
+      </w:r>
+      <w:r>
+        <w:t>); labelling now uses a clear name map (</w:t>
+      </w:r>
+      <w:r>
+        <w:rPr>
+          <w:rFonts w:ascii="Consolas" w:hAnsi="Consolas"/>
+          <w:sz w:val="18"/>
+        </w:rPr>
+        <w:t>EVENT(03)</w:t>
+      </w:r>
+      <w:r>
+        <w:t xml:space="preserve">, </w:t>
+      </w:r>
+      <w:r>
+        <w:rPr>
+          <w:rFonts w:ascii="Consolas" w:hAnsi="Consolas"/>
+          <w:sz w:val="18"/>
+        </w:rPr>
+        <w:t>DATA(04)</w:t>
+      </w:r>
+      <w:r>
+        <w:t>…).</w:t>
+      </w:r>
+    </w:p>
+    <w:p>
+      <w:pPr>
+        <w:pStyle w:val="ListNumber"/>
+      </w:pPr>
+      <w:r>
+        <w:rPr>
+          <w:b/>
+        </w:rPr>
+        <w:t>Concluded cmd `0x03` is not the real "start streaming" opcode</w:t>
+      </w:r>
+      <w:r>
+        <w:t xml:space="preserve"> (the command</w:t>
+      </w:r>
+    </w:p>
+    <w:p>
+      <w:r>
+        <w:t xml:space="preserve">IDs were always community guesses). Built </w:t>
+      </w:r>
+      <w:r>
+        <w:rPr>
+          <w:rFonts w:ascii="Consolas" w:hAnsi="Consolas"/>
+          <w:sz w:val="18"/>
+        </w:rPr>
+        <w:t>ble_sweep_PWT.py</w:t>
+      </w:r>
+      <w:r>
+        <w:t xml:space="preserve"> to brute-force the correct opcode — the same empirical approach that cracked the CRC framing.</w:t>
+      </w:r>
+    </w:p>
+    <w:p>
+      <w:pPr>
+        <w:pStyle w:val="ListNumber"/>
+      </w:pPr>
+      <w:r>
+        <w:rPr>
+          <w:b/>
+        </w:rPr>
+        <w:t>← You are here.</w:t>
+      </w:r>
+      <w:r>
+        <w:t xml:space="preserve"> Next run: </w:t>
+      </w:r>
+      <w:r>
+        <w:rPr>
+          <w:rFonts w:ascii="Consolas" w:hAnsi="Consolas"/>
+          <w:sz w:val="18"/>
+        </w:rPr>
+        <w:t>ble_sweep_PWT.py</w:t>
+      </w:r>
+      <w:r>
+        <w:t xml:space="preserve"> to find the opcode that wakes</w:t>
+      </w:r>
+    </w:p>
+    <w:p>
+      <w:r>
+        <w:t>the DATA channel, then build the decoder.</w:t>
       </w:r>
     </w:p>
     <w:p>
@@ -1996,6 +2203,178 @@
       </w:r>
     </w:p>
     <w:p>
+      <w:pPr>
+        <w:pStyle w:val="Heading2"/>
+      </w:pPr>
+      <w:r>
+        <w:t>6.5 Status beacon (EVENT channel `61080003`) — decoded identity</w:t>
+      </w:r>
+    </w:p>
+    <w:p>
+      <w:r>
+        <w:t xml:space="preserve">When we subscribe, the band emits a ~97-byte </w:t>
+      </w:r>
+      <w:r>
+        <w:rPr>
+          <w:b/>
+        </w:rPr>
+        <w:t>status beacon every ~2 seconds</w:t>
+      </w:r>
+      <w:r>
+        <w:t xml:space="preserve"> on the EVENT channel. It is a protobuf body (starts </w:t>
+      </w:r>
+      <w:r>
+        <w:rPr>
+          <w:rFonts w:ascii="Consolas" w:hAnsi="Consolas"/>
+          <w:sz w:val="18"/>
+        </w:rPr>
+        <w:t>08 02 a6 02 …</w:t>
+      </w:r>
+      <w:r>
+        <w:t>) carrying the device identity plus a changing counter near the tail. Decoded ASCII fields:</w:t>
+      </w:r>
+    </w:p>
+    <w:tbl>
+      <w:tblPr>
+        <w:tblStyle w:val="LightGrid-Accent1"/>
+        <w:tblW w:type="auto" w:w="0"/>
+        <w:tblLook w:firstColumn="1" w:firstRow="1" w:lastColumn="0" w:lastRow="0" w:noHBand="0" w:noVBand="1" w:val="04A0"/>
+      </w:tblPr>
+      <w:tblGrid>
+        <w:gridCol w:w="4320"/>
+        <w:gridCol w:w="4320"/>
+      </w:tblGrid>
+      <w:tr>
+        <w:tc>
+          <w:tcPr>
+            <w:tcW w:type="dxa" w:w="4320"/>
+          </w:tcPr>
+          <w:p>
+            <w:r>
+              <w:rPr>
+                <w:b/>
+              </w:rPr>
+              <w:t>Field</w:t>
+            </w:r>
+          </w:p>
+        </w:tc>
+        <w:tc>
+          <w:tcPr>
+            <w:tcW w:type="dxa" w:w="4320"/>
+          </w:tcPr>
+          <w:p>
+            <w:r>
+              <w:rPr>
+                <w:b/>
+              </w:rPr>
+              <w:t>Value</w:t>
+            </w:r>
+          </w:p>
+        </w:tc>
+      </w:tr>
+      <w:tr>
+        <w:tc>
+          <w:tcPr>
+            <w:tcW w:type="dxa" w:w="4320"/>
+          </w:tcPr>
+          <w:p>
+            <w:r>
+              <w:t>Codename</w:t>
+            </w:r>
+          </w:p>
+        </w:tc>
+        <w:tc>
+          <w:tcPr>
+            <w:tcW w:type="dxa" w:w="4320"/>
+          </w:tcPr>
+          <w:p>
+            <w:r>
+              <w:rPr>
+                <w:rFonts w:ascii="Consolas" w:hAnsi="Consolas"/>
+                <w:sz w:val="18"/>
+              </w:rPr>
+              <w:t>boylston</w:t>
+            </w:r>
+          </w:p>
+        </w:tc>
+      </w:tr>
+      <w:tr>
+        <w:tc>
+          <w:tcPr>
+            <w:tcW w:type="dxa" w:w="4320"/>
+          </w:tcPr>
+          <w:p>
+            <w:r>
+              <w:t>Firmware / version</w:t>
+            </w:r>
+          </w:p>
+        </w:tc>
+        <w:tc>
+          <w:tcPr>
+            <w:tcW w:type="dxa" w:w="4320"/>
+          </w:tcPr>
+          <w:p>
+            <w:r>
+              <w:rPr>
+                <w:rFonts w:ascii="Consolas" w:hAnsi="Consolas"/>
+                <w:sz w:val="18"/>
+              </w:rPr>
+              <w:t>17.2.2.0</w:t>
+            </w:r>
+          </w:p>
+        </w:tc>
+      </w:tr>
+      <w:tr>
+        <w:tc>
+          <w:tcPr>
+            <w:tcW w:type="dxa" w:w="4320"/>
+          </w:tcPr>
+          <w:p>
+            <w:r>
+              <w:t>Hardware revision</w:t>
+            </w:r>
+          </w:p>
+        </w:tc>
+        <w:tc>
+          <w:tcPr>
+            <w:tcW w:type="dxa" w:w="4320"/>
+          </w:tcPr>
+          <w:p>
+            <w:r>
+              <w:rPr>
+                <w:rFonts w:ascii="Consolas" w:hAnsi="Consolas"/>
+                <w:sz w:val="18"/>
+              </w:rPr>
+              <w:t>harvard_r10</w:t>
+            </w:r>
+          </w:p>
+        </w:tc>
+      </w:tr>
+    </w:tbl>
+    <w:p>
+      <w:r>
+        <w:t xml:space="preserve">This is a </w:t>
+      </w:r>
+      <w:r>
+        <w:rPr>
+          <w:b/>
+        </w:rPr>
+        <w:t>heartbeat/status</w:t>
+      </w:r>
+      <w:r>
+        <w:t xml:space="preserve"> feed, not the per-sample sensor stream. The per-sample sensor data (PPG / accel / HR) is expected as ~96-byte packets on the </w:t>
+      </w:r>
+      <w:r>
+        <w:rPr>
+          <w:b/>
+        </w:rPr>
+        <w:t>DATA channel `61080004`</w:t>
+      </w:r>
+      <w:r>
+        <w:t>, which is still silent — see §9 next steps.</w:t>
+      </w:r>
+    </w:p>
+    <w:p>
       <w:r>
         <w:t>________________________________________</w:t>
       </w:r>
@@ -2329,10 +2708,25 @@
         <w:rPr>
           <w:b/>
         </w:rPr>
-        <w:t>Start streaming</w:t>
-      </w:r>
-      <w:r>
-        <w:t xml:space="preserve"> (wear the band, tight skin contact):</w:t>
+        <w:t>Find the stream opcode</w:t>
+      </w:r>
+      <w:r>
+        <w:t xml:space="preserve"> (current task — see §9):</w:t>
+      </w:r>
+    </w:p>
+    <w:p>
+      <w:r>
+        <w:rPr>
+          <w:rFonts w:ascii="Consolas" w:hAnsi="Consolas"/>
+          <w:color w:val="2A2A2A"/>
+          <w:sz w:val="18"/>
+        </w:rPr>
+        <w:t xml:space="preserve">   python ble_sweep_PWT.py &lt;ADDRESS&gt;</w:t>
+      </w:r>
+    </w:p>
+    <w:p>
+      <w:r>
+        <w:t>Once we know the right opcode, stream with:</w:t>
       </w:r>
     </w:p>
     <w:p>
@@ -2443,7 +2837,20 @@
         <w:pStyle w:val="ListBullet"/>
       </w:pPr>
       <w:r>
-        <w:t>Tooling for scan / explore / log / command / stream.</w:t>
+        <w:t>Confirmed two-way comms live; decoded the device-identity status beacon</w:t>
+      </w:r>
+    </w:p>
+    <w:p>
+      <w:r>
+        <w:t>(firmware 17.2.2.0, hardware harvard_r10).</w:t>
+      </w:r>
+    </w:p>
+    <w:p>
+      <w:pPr>
+        <w:pStyle w:val="ListBullet"/>
+      </w:pPr>
+      <w:r>
+        <w:t>Tooling for scan / explore / log / command / stream / sweep.</w:t>
       </w:r>
     </w:p>
     <w:p>
@@ -2459,7 +2866,56 @@
         <w:pStyle w:val="ListNumber"/>
       </w:pPr>
       <w:r>
-        <w:t xml:space="preserve">Run </w:t>
+        <w:rPr>
+          <w:b/>
+        </w:rPr>
+        <w:t>Run `ble_sweep_PWT.py &lt;ADDRESS&gt;`</w:t>
+      </w:r>
+      <w:r>
+        <w:t xml:space="preserve"> to find the command id that wakes the DATA</w:t>
+      </w:r>
+    </w:p>
+    <w:p>
+      <w:r>
+        <w:t xml:space="preserve">channel (61080004). Try </w:t>
+      </w:r>
+      <w:r>
+        <w:rPr>
+          <w:rFonts w:ascii="Consolas" w:hAnsi="Consolas"/>
+          <w:sz w:val="18"/>
+        </w:rPr>
+        <w:t>--with-response</w:t>
+      </w:r>
+      <w:r>
+        <w:t xml:space="preserve"> and a </w:t>
+      </w:r>
+      <w:r>
+        <w:rPr>
+          <w:rFonts w:ascii="Consolas" w:hAnsi="Consolas"/>
+          <w:sz w:val="18"/>
+        </w:rPr>
+        <w:t>--data 01</w:t>
+      </w:r>
+      <w:r>
+        <w:t xml:space="preserve"> payload if the default range is silent. Send Claude the </w:t>
+      </w:r>
+      <w:r>
+        <w:rPr>
+          <w:rFonts w:ascii="Consolas" w:hAnsi="Consolas"/>
+          <w:sz w:val="18"/>
+        </w:rPr>
+        <w:t>logs\sweep_*.jsonl</w:t>
+      </w:r>
+      <w:r>
+        <w:t>.</w:t>
+      </w:r>
+    </w:p>
+    <w:p>
+      <w:pPr>
+        <w:pStyle w:val="ListNumber"/>
+      </w:pPr>
+      <w:r>
+        <w:t xml:space="preserve">Once the start opcode is known, lock it into </w:t>
       </w:r>
       <w:r>
         <w:rPr>
@@ -2469,16 +2925,12 @@
         <w:t>ble_stream_PWT.py</w:t>
       </w:r>
       <w:r>
-        <w:t xml:space="preserve"> and capture </w:t>
-      </w:r>
-      <w:r>
-        <w:rPr>
-          <w:b/>
-        </w:rPr>
-        <w:t>data-channel (61080004)</w:t>
-      </w:r>
-      <w:r>
-        <w:t xml:space="preserve"> packets.</w:t>
+        <w:t xml:space="preserve"> and capture a</w:t>
+      </w:r>
+    </w:p>
+    <w:p>
+      <w:r>
+        <w:t>real sensor stream (wear the band, tight skin contact).</w:t>
       </w:r>
     </w:p>
     <w:p>

</xml_diff>

<commit_message>
Add pairing (fix for Insufficient Authentication); document findings
Key discovery from live sweep: the command characteristic requires an encrypted
/ paired link (ATT error 0x05, Insufficient Authentication). Write-without-
response was silently ignored, so no command had actually reached the band.
Separately, DATA(04) packets were motion/tap triggered (type 0x30, 0xAA-framed,
timestamped), not command responses.

- ble_pair_PWT.py: pair/bond with the band (and --unpair).
- ble_sweep_PWT.py, ble_stream_PWT.py: add --pair flag.
- docs/BUILD_LOG_PWT.md: document the auth requirement (6.6), the motion-
  triggered DATA(04) event framing (6.7), and the pair-first next steps.
  Regenerated PDF/DOCX.

Co-Authored-By: Claude Opus 4.8 <noreply@anthropic.com>
Claude-Session: https://claude.ai/code/session_01PeXJzKdFE3zg9AVZQtc4Pw
</commit_message>
<xml_diff>
--- a/docs/BUILD_LOG_PWT.docx
+++ b/docs/BUILD_LOG_PWT.docx
@@ -840,6 +840,32 @@
           </w:p>
         </w:tc>
       </w:tr>
+      <w:tr>
+        <w:tc>
+          <w:tcPr>
+            <w:tcW w:type="dxa" w:w="4320"/>
+          </w:tcPr>
+          <w:p>
+            <w:r>
+              <w:rPr>
+                <w:rFonts w:ascii="Consolas" w:hAnsi="Consolas"/>
+                <w:sz w:val="18"/>
+              </w:rPr>
+              <w:t>ble_pair_PWT.py</w:t>
+            </w:r>
+          </w:p>
+        </w:tc>
+        <w:tc>
+          <w:tcPr>
+            <w:tcW w:type="dxa" w:w="4320"/>
+          </w:tcPr>
+          <w:p>
+            <w:r>
+              <w:t>Pair/bond with the band so it will accept our commands (encrypted link).</w:t>
+            </w:r>
+          </w:p>
+        </w:tc>
+      </w:tr>
     </w:tbl>
     <w:p>
       <w:r>
@@ -1300,25 +1326,161 @@
         <w:rPr>
           <w:b/>
         </w:rPr>
-        <w:t>← You are here.</w:t>
-      </w:r>
-      <w:r>
-        <w:t xml:space="preserve"> Next run: </w:t>
-      </w:r>
+        <w:t>Swept command IDs (`ble_sweep_PWT.py`) — and learned two big things:</w:t>
+      </w:r>
+    </w:p>
+    <w:p>
+      <w:pPr>
+        <w:pStyle w:val="ListBullet"/>
+      </w:pPr>
+      <w:r>
+        <w:rPr>
+          <w:b/>
+        </w:rPr>
+        <w:t>The band ignores unauthenticated commands.</w:t>
+      </w:r>
+      <w:r>
+        <w:t xml:space="preserve"> Write-*with*-response returned</w:t>
+      </w:r>
+    </w:p>
+    <w:p>
       <w:r>
         <w:rPr>
           <w:rFonts w:ascii="Consolas" w:hAnsi="Consolas"/>
           <w:sz w:val="18"/>
         </w:rPr>
-        <w:t>ble_sweep_PWT.py</w:t>
-      </w:r>
-      <w:r>
-        <w:t xml:space="preserve"> to find the opcode that wakes</w:t>
+        <w:t>GATT Protocol Error: Insufficient Authentication</w:t>
+      </w:r>
+      <w:r>
+        <w:t xml:space="preserve"> (ATT error 0x05 — the command characteristic needs an </w:t>
+      </w:r>
+      <w:r>
+        <w:rPr>
+          <w:b/>
+        </w:rPr>
+        <w:t>encrypted / paired link</w:t>
+      </w:r>
+      <w:r>
+        <w:t xml:space="preserve">). Write-*without*-response (our default) doesn't error, but the band </w:t>
+      </w:r>
+      <w:r>
+        <w:rPr>
+          <w:b/>
+        </w:rPr>
+        <w:t>silently ignores it</w:t>
+      </w:r>
+      <w:r>
+        <w:t>. So *none of our commands had ever actually reached the band* — every "reply" so far was the subscribe-triggered status beacon or physical motion.</w:t>
       </w:r>
     </w:p>
     <w:p>
-      <w:r>
-        <w:t>the DATA channel, then build the decoder.</w:t>
+      <w:pPr>
+        <w:pStyle w:val="ListBullet"/>
+      </w:pPr>
+      <w:r>
+        <w:rPr>
+          <w:b/>
+        </w:rPr>
+        <w:t>DATA(04) is currently a motion/tap event feed.</w:t>
+      </w:r>
+      <w:r>
+        <w:t xml:space="preserve"> The DATA-channel packets</w:t>
+      </w:r>
+    </w:p>
+    <w:p>
+      <w:r>
+        <w:t xml:space="preserve">lined up with *tapping / shaking / putting the charger on*, not with any command. They use our verified </w:t>
+      </w:r>
+      <w:r>
+        <w:rPr>
+          <w:rFonts w:ascii="Consolas" w:hAnsi="Consolas"/>
+          <w:sz w:val="18"/>
+        </w:rPr>
+        <w:t>0xAA</w:t>
+      </w:r>
+      <w:r>
+        <w:t xml:space="preserve"> framing, </w:t>
+      </w:r>
+      <w:r>
+        <w:rPr>
+          <w:b/>
+        </w:rPr>
+        <w:t>type `0x30`</w:t>
+      </w:r>
+      <w:r>
+        <w:t xml:space="preserve">, with an incrementing sequence and a monotonic </w:t>
+      </w:r>
+      <w:r>
+        <w:rPr>
+          <w:b/>
+        </w:rPr>
+        <w:t>timestamp</w:t>
+      </w:r>
+      <w:r>
+        <w:t xml:space="preserve"> — i.e. timestamped accelerometer/activity events (useful later for gesture detection).</w:t>
+      </w:r>
+    </w:p>
+    <w:p>
+      <w:pPr>
+        <w:pStyle w:val="ListNumber"/>
+      </w:pPr>
+      <w:r>
+        <w:rPr>
+          <w:b/>
+        </w:rPr>
+        <w:t>Built `ble_pair_PWT.py`</w:t>
+      </w:r>
+      <w:r>
+        <w:t xml:space="preserve"> and added </w:t>
+      </w:r>
+      <w:r>
+        <w:rPr>
+          <w:rFonts w:ascii="Consolas" w:hAnsi="Consolas"/>
+          <w:sz w:val="18"/>
+        </w:rPr>
+        <w:t>--pair</w:t>
+      </w:r>
+      <w:r>
+        <w:t xml:space="preserve"> to the sweep/stream tools.</w:t>
+      </w:r>
+    </w:p>
+    <w:p>
+      <w:r>
+        <w:t>Pairing establishes the encrypted link so the band will honour commands.</w:t>
+      </w:r>
+    </w:p>
+    <w:p>
+      <w:pPr>
+        <w:pStyle w:val="ListNumber"/>
+      </w:pPr>
+      <w:r>
+        <w:rPr>
+          <w:b/>
+        </w:rPr>
+        <w:t>← You are here.</w:t>
+      </w:r>
+      <w:r>
+        <w:t xml:space="preserve"> Next: </w:t>
+      </w:r>
+      <w:r>
+        <w:rPr>
+          <w:b/>
+        </w:rPr>
+        <w:t>pair</w:t>
+      </w:r>
+      <w:r>
+        <w:t xml:space="preserve">, then re-sweep </w:t>
+      </w:r>
+      <w:r>
+        <w:rPr>
+          <w:b/>
+        </w:rPr>
+        <w:t>with the band held still</w:t>
+      </w:r>
+    </w:p>
+    <w:p>
+      <w:r>
+        <w:t>so any DATA response is attributable to the command (not motion), find the real start opcode, then build the decoder.</w:t>
       </w:r>
     </w:p>
     <w:p>
@@ -2375,6 +2537,154 @@
       </w:r>
     </w:p>
     <w:p>
+      <w:pPr>
+        <w:pStyle w:val="Heading2"/>
+      </w:pPr>
+      <w:r>
+        <w:t>6.6 Authentication requirement (the key blocker)</w:t>
+      </w:r>
+    </w:p>
+    <w:p>
+      <w:r>
+        <w:t>The command characteristic (</w:t>
+      </w:r>
+      <w:r>
+        <w:rPr>
+          <w:rFonts w:ascii="Consolas" w:hAnsi="Consolas"/>
+          <w:sz w:val="18"/>
+        </w:rPr>
+        <w:t>61080002</w:t>
+      </w:r>
+      <w:r>
+        <w:t xml:space="preserve">) requires an </w:t>
+      </w:r>
+      <w:r>
+        <w:rPr>
+          <w:b/>
+        </w:rPr>
+        <w:t>encrypted/paired BLE link</w:t>
+      </w:r>
+      <w:r>
+        <w:t xml:space="preserve">. Evidence: write-with-response returns </w:t>
+      </w:r>
+      <w:r>
+        <w:rPr>
+          <w:rFonts w:ascii="Consolas" w:hAnsi="Consolas"/>
+          <w:sz w:val="18"/>
+        </w:rPr>
+        <w:t>GATT Protocol Error: Insufficient Authentication</w:t>
+      </w:r>
+      <w:r>
+        <w:t xml:space="preserve"> (ATT error </w:t>
+      </w:r>
+      <w:r>
+        <w:rPr>
+          <w:rFonts w:ascii="Consolas" w:hAnsi="Consolas"/>
+          <w:sz w:val="18"/>
+        </w:rPr>
+        <w:t>0x05</w:t>
+      </w:r>
+      <w:r>
+        <w:t xml:space="preserve">). Write-without-response doesn't raise, but the band silently discards the write. </w:t>
+      </w:r>
+      <w:r>
+        <w:rPr>
+          <w:b/>
+        </w:rPr>
+        <w:t>Therefore commands only take effect after we pair/bond</w:t>
+      </w:r>
+      <w:r>
+        <w:t xml:space="preserve"> (</w:t>
+      </w:r>
+      <w:r>
+        <w:rPr>
+          <w:rFonts w:ascii="Consolas" w:hAnsi="Consolas"/>
+          <w:sz w:val="18"/>
+        </w:rPr>
+        <w:t>ble_pair_PWT.py</w:t>
+      </w:r>
+      <w:r>
+        <w:t xml:space="preserve">, or </w:t>
+      </w:r>
+      <w:r>
+        <w:rPr>
+          <w:rFonts w:ascii="Consolas" w:hAnsi="Consolas"/>
+          <w:sz w:val="18"/>
+        </w:rPr>
+        <w:t>--pair</w:t>
+      </w:r>
+      <w:r>
+        <w:t>). Until then the band only emits the status beacon and motion events, regardless of what we send.</w:t>
+      </w:r>
+    </w:p>
+    <w:p>
+      <w:pPr>
+        <w:pStyle w:val="Heading2"/>
+      </w:pPr>
+      <w:r>
+        <w:t>6.7 DATA(04) event packets (motion-triggered) — framing confirmed</w:t>
+      </w:r>
+    </w:p>
+    <w:p>
+      <w:r>
+        <w:t xml:space="preserve">The DATA-channel packets observed so far are our </w:t>
+      </w:r>
+      <w:r>
+        <w:rPr>
+          <w:rFonts w:ascii="Consolas" w:hAnsi="Consolas"/>
+          <w:sz w:val="18"/>
+        </w:rPr>
+        <w:t>0xAA</w:t>
+      </w:r>
+      <w:r>
+        <w:t xml:space="preserve"> frame with </w:t>
+      </w:r>
+      <w:r>
+        <w:rPr>
+          <w:b/>
+        </w:rPr>
+        <w:t>type `0x30`</w:t>
+      </w:r>
+      <w:r>
+        <w:t>:</w:t>
+      </w:r>
+    </w:p>
+    <w:p>
+      <w:r>
+        <w:rPr>
+          <w:rFonts w:ascii="Consolas" w:hAnsi="Consolas"/>
+          <w:color w:val="2A2A2A"/>
+          <w:sz w:val="18"/>
+        </w:rPr>
+        <w:t>aa | len(2 LE) | crc8(len) | 30 | seq | .. | timestamp(uint32 LE) | .. | crc32</w:t>
+      </w:r>
+    </w:p>
+    <w:p>
+      <w:r>
+        <w:t xml:space="preserve">Example: </w:t>
+      </w:r>
+      <w:r>
+        <w:rPr>
+          <w:rFonts w:ascii="Consolas" w:hAnsi="Consolas"/>
+          <w:sz w:val="18"/>
+        </w:rPr>
+        <w:t>aa 10 00 57 30 24 0e 00 c8 87 e2 01 80 44 00 00 …</w:t>
+      </w:r>
+      <w:r>
+        <w:t xml:space="preserve"> → len=16, crc8 OK, type=0x30, seq=0x24, timestamp=</w:t>
+      </w:r>
+      <w:r>
+        <w:rPr>
+          <w:rFonts w:ascii="Consolas" w:hAnsi="Consolas"/>
+          <w:sz w:val="18"/>
+        </w:rPr>
+        <w:t>0x01e287c8</w:t>
+      </w:r>
+      <w:r>
+        <w:t xml:space="preserve"> (monotonic). These fire on tap/shake/charger — accelerometer/activity events, not the continuous PPG stream we still need to unlock (via pairing + the right opcode).</w:t>
+      </w:r>
+    </w:p>
+    <w:p>
       <w:r>
         <w:t>________________________________________</w:t>
       </w:r>
@@ -2708,10 +3018,25 @@
         <w:rPr>
           <w:b/>
         </w:rPr>
-        <w:t>Find the stream opcode</w:t>
-      </w:r>
-      <w:r>
-        <w:t xml:space="preserve"> (current task — see §9):</w:t>
+        <w:t>Pair once</w:t>
+      </w:r>
+      <w:r>
+        <w:t xml:space="preserve"> (only needed the first time, or after </w:t>
+      </w:r>
+      <w:r>
+        <w:rPr>
+          <w:rFonts w:ascii="Consolas" w:hAnsi="Consolas"/>
+          <w:sz w:val="18"/>
+        </w:rPr>
+        <w:t>--unpair</w:t>
+      </w:r>
+      <w:r>
+        <w:t>; the bond</w:t>
+      </w:r>
+    </w:p>
+    <w:p>
+      <w:r>
+        <w:t>persists across sessions):</w:t>
       </w:r>
     </w:p>
     <w:p>
@@ -2721,12 +3046,21 @@
           <w:color w:val="2A2A2A"/>
           <w:sz w:val="18"/>
         </w:rPr>
-        <w:t xml:space="preserve">   python ble_sweep_PWT.py &lt;ADDRESS&gt;</w:t>
+        <w:t xml:space="preserve">   python ble_pair_PWT.py &lt;ADDRESS&gt;</w:t>
       </w:r>
     </w:p>
     <w:p>
-      <w:r>
-        <w:t>Once we know the right opcode, stream with:</w:t>
+      <w:pPr>
+        <w:pStyle w:val="ListNumber"/>
+      </w:pPr>
+      <w:r>
+        <w:rPr>
+          <w:b/>
+        </w:rPr>
+        <w:t>Find the stream opcode</w:t>
+      </w:r>
+      <w:r>
+        <w:t xml:space="preserve"> (current task — see §9), band held still:</w:t>
       </w:r>
     </w:p>
     <w:p>
@@ -2736,7 +3070,22 @@
           <w:color w:val="2A2A2A"/>
           <w:sz w:val="18"/>
         </w:rPr>
-        <w:t xml:space="preserve">   python ble_stream_PWT.py &lt;ADDRESS&gt; --seconds 30</w:t>
+        <w:t xml:space="preserve">   python ble_sweep_PWT.py &lt;ADDRESS&gt; --pair --with-response</w:t>
+      </w:r>
+    </w:p>
+    <w:p>
+      <w:r>
+        <w:t>Once we know the right opcode, stream with:</w:t>
+      </w:r>
+    </w:p>
+    <w:p>
+      <w:r>
+        <w:rPr>
+          <w:rFonts w:ascii="Consolas" w:hAnsi="Consolas"/>
+          <w:color w:val="2A2A2A"/>
+          <w:sz w:val="18"/>
+        </w:rPr>
+        <w:t xml:space="preserve">   python ble_stream_PWT.py &lt;ADDRESS&gt; --pair --with-response --seconds 30</w:t>
       </w:r>
     </w:p>
     <w:p>
@@ -2869,35 +3218,56 @@
         <w:rPr>
           <w:b/>
         </w:rPr>
-        <w:t>Run `ble_sweep_PWT.py &lt;ADDRESS&gt;`</w:t>
-      </w:r>
-      <w:r>
-        <w:t xml:space="preserve"> to find the command id that wakes the DATA</w:t>
+        <w:t>Pair with the band (one time):</w:t>
       </w:r>
     </w:p>
     <w:p>
       <w:r>
-        <w:t xml:space="preserve">channel (61080004). Try </w:t>
-      </w:r>
-      <w:r>
         <w:rPr>
           <w:rFonts w:ascii="Consolas" w:hAnsi="Consolas"/>
+          <w:color w:val="2A2A2A"/>
           <w:sz w:val="18"/>
         </w:rPr>
-        <w:t>--with-response</w:t>
-      </w:r>
-      <w:r>
-        <w:t xml:space="preserve"> and a </w:t>
-      </w:r>
+        <w:t xml:space="preserve">   python ble_pair_PWT.py &lt;ADDRESS&gt;</w:t>
+      </w:r>
+    </w:p>
+    <w:p>
+      <w:r>
+        <w:t>Accept any Windows pairing prompt. "already paired" is fine.</w:t>
+      </w:r>
+    </w:p>
+    <w:p>
+      <w:pPr>
+        <w:pStyle w:val="ListNumber"/>
+      </w:pPr>
+      <w:r>
+        <w:rPr>
+          <w:b/>
+        </w:rPr>
+        <w:t>Re-sweep over the encrypted link, band held perfectly still</w:t>
+      </w:r>
+      <w:r>
+        <w:t xml:space="preserve"> (so any DATA</w:t>
+      </w:r>
+    </w:p>
+    <w:p>
+      <w:r>
+        <w:t>response is from the command, not motion):</w:t>
+      </w:r>
+    </w:p>
+    <w:p>
       <w:r>
         <w:rPr>
           <w:rFonts w:ascii="Consolas" w:hAnsi="Consolas"/>
+          <w:color w:val="2A2A2A"/>
           <w:sz w:val="18"/>
         </w:rPr>
-        <w:t>--data 01</w:t>
-      </w:r>
-      <w:r>
-        <w:t xml:space="preserve"> payload if the default range is silent. Send Claude the </w:t>
+        <w:t xml:space="preserve">   python ble_sweep_PWT.py &lt;ADDRESS&gt; --pair --with-response</w:t>
+      </w:r>
+    </w:p>
+    <w:p>
+      <w:r>
+        <w:t xml:space="preserve">Watch for the command id whose DATA(04) response *continues after the dwell* (a real stream), vs. a one-off reply. Send Claude the </w:t>
       </w:r>
       <w:r>
         <w:rPr>
@@ -2915,7 +3285,7 @@
         <w:pStyle w:val="ListNumber"/>
       </w:pPr>
       <w:r>
-        <w:t xml:space="preserve">Once the start opcode is known, lock it into </w:t>
+        <w:t xml:space="preserve">Lock the start opcode into </w:t>
       </w:r>
       <w:r>
         <w:rPr>
@@ -2925,12 +3295,22 @@
         <w:t>ble_stream_PWT.py</w:t>
       </w:r>
       <w:r>
-        <w:t xml:space="preserve"> and capture a</w:t>
+        <w:t xml:space="preserve"> and capture a real sensor stream</w:t>
       </w:r>
     </w:p>
     <w:p>
       <w:r>
-        <w:t>real sensor stream (wear the band, tight skin contact).</w:t>
+        <w:t>(wear the band, tight skin contact):</w:t>
+      </w:r>
+    </w:p>
+    <w:p>
+      <w:r>
+        <w:rPr>
+          <w:rFonts w:ascii="Consolas" w:hAnsi="Consolas"/>
+          <w:color w:val="2A2A2A"/>
+          <w:sz w:val="18"/>
+        </w:rPr>
+        <w:t xml:space="preserve">   python ble_stream_PWT.py &lt;ADDRESS&gt; --pair --with-response --seconds 30</w:t>
       </w:r>
     </w:p>
     <w:p>
@@ -2961,7 +3341,7 @@
         <w:pStyle w:val="ListNumber"/>
       </w:pPr>
       <w:r>
-        <w:t>Once decoding is solid: gesture recognition from the accelerometer stream.</w:t>
+        <w:t>Gesture recognition from the accelerometer stream.</w:t>
       </w:r>
     </w:p>
     <w:p>

</xml_diff>

<commit_message>
Stream tool: full-packet hex + --start-data; document pairing milestone
Pairing succeeded: authenticated link established, no more Insufficient
Authentication, and commands 0x01-0x04 return type-0x30 replies on DATA(04).
Continuous streaming still needs unlocking (payload and/or skin contact).

- ble_stream_PWT.py: log full packet hex (was truncated to 16 bytes), drop the
  bogus HR peek, add --start-data to attach a payload to START.
- docs/BUILD_LOG_PWT.md: record the pairing/command milestone and next steps.
  Regenerated PDF/DOCX.

Co-Authored-By: Claude Opus 4.8 <noreply@anthropic.com>
Claude-Session: https://claude.ai/code/session_01PeXJzKdFE3zg9AVZQtc4Pw
</commit_message>
<xml_diff>
--- a/docs/BUILD_LOG_PWT.docx
+++ b/docs/BUILD_LOG_PWT.docx
@@ -1457,30 +1457,145 @@
         <w:rPr>
           <w:b/>
         </w:rPr>
-        <w:t>← You are here.</w:t>
-      </w:r>
-      <w:r>
-        <w:t xml:space="preserve"> Next: </w:t>
+        <w:t>PAIRED — and the band now answers our commands.</w:t>
+      </w:r>
+      <w:r>
+        <w:t xml:space="preserve"> After pairing, a sweep</w:t>
+      </w:r>
+    </w:p>
+    <w:p>
+      <w:r>
+        <w:t xml:space="preserve">with write-with-response showed </w:t>
       </w:r>
       <w:r>
         <w:rPr>
           <w:b/>
         </w:rPr>
-        <w:t>pair</w:t>
-      </w:r>
-      <w:r>
-        <w:t xml:space="preserve">, then re-sweep </w:t>
+        <w:t>no more `Insufficient Authentication`</w:t>
+      </w:r>
+      <w:r>
+        <w:t xml:space="preserve">, and commands </w:t>
       </w:r>
       <w:r>
         <w:rPr>
           <w:b/>
         </w:rPr>
-        <w:t>with the band held still</w:t>
+        <w:t>`0x01`–`0x04` each returned a genuine 32-byte type-`0x30` reply</w:t>
+      </w:r>
+      <w:r>
+        <w:t xml:space="preserve"> on DATA(04) (confirmed: band untouched, timestamps incrementing </w:t>
+      </w:r>
+      <w:r>
+        <w:rPr>
+          <w:rFonts w:ascii="Consolas" w:hAnsi="Consolas"/>
+          <w:sz w:val="18"/>
+        </w:rPr>
+        <w:t>0x01e28a92 → …95 → …98 → …9c</w:t>
+      </w:r>
+      <w:r>
+        <w:t xml:space="preserve">). cmd </w:t>
+      </w:r>
+      <w:r>
+        <w:rPr>
+          <w:rFonts w:ascii="Consolas" w:hAnsi="Consolas"/>
+          <w:sz w:val="18"/>
+        </w:rPr>
+        <w:t>0x0b</w:t>
+      </w:r>
+      <w:r>
+        <w:t xml:space="preserve"> was a physical tap. </w:t>
+      </w:r>
+      <w:r>
+        <w:rPr>
+          <w:b/>
+        </w:rPr>
+        <w:t>Two-way authenticated command/response is working.</w:t>
       </w:r>
     </w:p>
     <w:p>
-      <w:r>
-        <w:t>so any DATA response is attributable to the command (not motion), find the real start opcode, then build the decoder.</w:t>
+      <w:pPr>
+        <w:pStyle w:val="ListNumber"/>
+      </w:pPr>
+      <w:r>
+        <w:rPr>
+          <w:b/>
+        </w:rPr>
+        <w:t>Open item: continuous streaming.</w:t>
+      </w:r>
+      <w:r>
+        <w:t xml:space="preserve"> Each command returns a *single* reply, not</w:t>
+      </w:r>
+    </w:p>
+    <w:p>
+      <w:r>
+        <w:t xml:space="preserve">a continuous stream — so </w:t>
+      </w:r>
+      <w:r>
+        <w:rPr>
+          <w:rFonts w:ascii="Consolas" w:hAnsi="Consolas"/>
+          <w:sz w:val="18"/>
+        </w:rPr>
+        <w:t>0x03</w:t>
+      </w:r>
+      <w:r>
+        <w:t xml:space="preserve"> alone doesn't flip on realtime. Likely the start command needs a </w:t>
+      </w:r>
+      <w:r>
+        <w:rPr>
+          <w:b/>
+        </w:rPr>
+        <w:t>payload</w:t>
+      </w:r>
+      <w:r>
+        <w:t xml:space="preserve"> (enable flag / sensor mask) and/or the PPG stream only flows </w:t>
+      </w:r>
+      <w:r>
+        <w:rPr>
+          <w:b/>
+        </w:rPr>
+        <w:t>while worn</w:t>
+      </w:r>
+      <w:r>
+        <w:t xml:space="preserve"> (skin contact). Added </w:t>
+      </w:r>
+      <w:r>
+        <w:rPr>
+          <w:rFonts w:ascii="Consolas" w:hAnsi="Consolas"/>
+          <w:sz w:val="18"/>
+        </w:rPr>
+        <w:t>--start-data</w:t>
+      </w:r>
+      <w:r>
+        <w:t xml:space="preserve"> and full-packet hex logging to </w:t>
+      </w:r>
+      <w:r>
+        <w:rPr>
+          <w:rFonts w:ascii="Consolas" w:hAnsi="Consolas"/>
+          <w:sz w:val="18"/>
+        </w:rPr>
+        <w:t>ble_stream_PWT.py</w:t>
+      </w:r>
+      <w:r>
+        <w:t xml:space="preserve"> to chase this.</w:t>
+      </w:r>
+    </w:p>
+    <w:p>
+      <w:pPr>
+        <w:pStyle w:val="ListNumber"/>
+      </w:pPr>
+      <w:r>
+        <w:rPr>
+          <w:b/>
+        </w:rPr>
+        <w:t>← You are here.</w:t>
+      </w:r>
+      <w:r>
+        <w:t xml:space="preserve"> Next: wear the band and run the stream tool (paired); if no</w:t>
+      </w:r>
+    </w:p>
+    <w:p>
+      <w:r>
+        <w:t>continuous flow, sweep start-command payloads.</w:t>
       </w:r>
     </w:p>
     <w:p>
@@ -3207,6 +3322,63 @@
         <w:rPr>
           <w:b/>
         </w:rPr>
+        <w:t>Done (new)</w:t>
+      </w:r>
+    </w:p>
+    <w:p>
+      <w:pPr>
+        <w:pStyle w:val="ListBullet"/>
+      </w:pPr>
+      <w:r>
+        <w:rPr>
+          <w:b/>
+        </w:rPr>
+        <w:t>Pairing works</w:t>
+      </w:r>
+      <w:r>
+        <w:t xml:space="preserve"> (Windows ConfirmOnly ceremony); the authenticated link lets</w:t>
+      </w:r>
+    </w:p>
+    <w:p>
+      <w:r>
+        <w:t xml:space="preserve">the band accept commands. Commands </w:t>
+      </w:r>
+      <w:r>
+        <w:rPr>
+          <w:rFonts w:ascii="Consolas" w:hAnsi="Consolas"/>
+          <w:sz w:val="18"/>
+        </w:rPr>
+        <w:t>0x01</w:t>
+      </w:r>
+      <w:r>
+        <w:t>–</w:t>
+      </w:r>
+      <w:r>
+        <w:rPr>
+          <w:rFonts w:ascii="Consolas" w:hAnsi="Consolas"/>
+          <w:sz w:val="18"/>
+        </w:rPr>
+        <w:t>0x04</w:t>
+      </w:r>
+      <w:r>
+        <w:t xml:space="preserve"> return type-</w:t>
+      </w:r>
+      <w:r>
+        <w:rPr>
+          <w:rFonts w:ascii="Consolas" w:hAnsi="Consolas"/>
+          <w:sz w:val="18"/>
+        </w:rPr>
+        <w:t>0x30</w:t>
+      </w:r>
+      <w:r>
+        <w:t xml:space="preserve"> replies.</w:t>
+      </w:r>
+    </w:p>
+    <w:p>
+      <w:r>
+        <w:rPr>
+          <w:b/>
+        </w:rPr>
         <w:t>Next</w:t>
       </w:r>
     </w:p>
@@ -3218,7 +3390,10 @@
         <w:rPr>
           <w:b/>
         </w:rPr>
-        <w:t>Pair with the band (one time):</w:t>
+        <w:t>Wear the band (snug, skin contact)</w:t>
+      </w:r>
+      <w:r>
+        <w:t xml:space="preserve"> and try for a continuous stream:</w:t>
       </w:r>
     </w:p>
     <w:p>
@@ -3228,12 +3403,22 @@
           <w:color w:val="2A2A2A"/>
           <w:sz w:val="18"/>
         </w:rPr>
-        <w:t xml:space="preserve">   python ble_pair_PWT.py &lt;ADDRESS&gt;</w:t>
+        <w:t xml:space="preserve">   python ble_stream_PWT.py &lt;ADDRESS&gt; --with-response --seconds 30</w:t>
       </w:r>
     </w:p>
     <w:p>
       <w:r>
-        <w:t>Accept any Windows pairing prompt. "already paired" is fine.</w:t>
+        <w:t xml:space="preserve">(Pairing persists, so </w:t>
+      </w:r>
+      <w:r>
+        <w:rPr>
+          <w:rFonts w:ascii="Consolas" w:hAnsi="Consolas"/>
+          <w:sz w:val="18"/>
+        </w:rPr>
+        <w:t>--pair</w:t>
+      </w:r>
+      <w:r>
+        <w:t xml:space="preserve"> is optional now.) If DATA(04) floods with packets while you hold still, that's the live sensor stream — send Claude the log.</w:t>
       </w:r>
     </w:p>
     <w:p>
@@ -3241,18 +3426,16 @@
         <w:pStyle w:val="ListNumber"/>
       </w:pPr>
       <w:r>
+        <w:t xml:space="preserve">If it's still single replies, sweep the </w:t>
+      </w:r>
+      <w:r>
         <w:rPr>
           <w:b/>
         </w:rPr>
-        <w:t>Re-sweep over the encrypted link, band held perfectly still</w:t>
-      </w:r>
-      <w:r>
-        <w:t xml:space="preserve"> (so any DATA</w:t>
-      </w:r>
-    </w:p>
-    <w:p>
-      <w:r>
-        <w:t>response is from the command, not motion):</w:t>
+        <w:t>start-command payload</w:t>
+      </w:r>
+      <w:r>
+        <w:t>:</w:t>
       </w:r>
     </w:p>
     <w:p>
@@ -3262,55 +3445,44 @@
           <w:color w:val="2A2A2A"/>
           <w:sz w:val="18"/>
         </w:rPr>
-        <w:t xml:space="preserve">   python ble_sweep_PWT.py &lt;ADDRESS&gt; --pair --with-response</w:t>
+        <w:t xml:space="preserve">   python ble_stream_PWT.py &lt;ADDRESS&gt; --with-response --start-data 01 --seconds 15</w:t>
+        <w:br/>
+        <w:t xml:space="preserve">   python ble_stream_PWT.py &lt;ADDRESS&gt; --with-response --start-data 02 --seconds 15</w:t>
       </w:r>
     </w:p>
     <w:p>
       <w:r>
-        <w:t xml:space="preserve">Watch for the command id whose DATA(04) response *continues after the dwell* (a real stream), vs. a one-off reply. Send Claude the </w:t>
+        <w:t xml:space="preserve">Also decode the </w:t>
       </w:r>
       <w:r>
         <w:rPr>
           <w:rFonts w:ascii="Consolas" w:hAnsi="Consolas"/>
           <w:sz w:val="18"/>
         </w:rPr>
-        <w:t>logs\sweep_*.jsonl</w:t>
-      </w:r>
-      <w:r>
-        <w:t>.</w:t>
-      </w:r>
-    </w:p>
-    <w:p>
-      <w:pPr>
-        <w:pStyle w:val="ListNumber"/>
-      </w:pPr>
-      <w:r>
-        <w:t xml:space="preserve">Lock the start opcode into </w:t>
+        <w:t>0x01</w:t>
+      </w:r>
+      <w:r>
+        <w:t>/</w:t>
       </w:r>
       <w:r>
         <w:rPr>
           <w:rFonts w:ascii="Consolas" w:hAnsi="Consolas"/>
           <w:sz w:val="18"/>
         </w:rPr>
-        <w:t>ble_stream_PWT.py</w:t>
-      </w:r>
-      <w:r>
-        <w:t xml:space="preserve"> and capture a real sensor stream</w:t>
-      </w:r>
-    </w:p>
-    <w:p>
-      <w:r>
-        <w:t>(wear the band, tight skin contact):</w:t>
-      </w:r>
-    </w:p>
-    <w:p>
+        <w:t>0x02</w:t>
+      </w:r>
+      <w:r>
+        <w:t xml:space="preserve"> replies (likely battery / device info) to confirm the command map — paste the full </w:t>
+      </w:r>
       <w:r>
         <w:rPr>
           <w:rFonts w:ascii="Consolas" w:hAnsi="Consolas"/>
-          <w:color w:val="2A2A2A"/>
           <w:sz w:val="18"/>
         </w:rPr>
-        <w:t xml:space="preserve">   python ble_stream_PWT.py &lt;ADDRESS&gt; --pair --with-response --seconds 30</w:t>
+        <w:t>logs\stream_*.jsonl</w:t>
+      </w:r>
+      <w:r>
+        <w:t>.</w:t>
       </w:r>
     </w:p>
     <w:p>

</xml_diff>

<commit_message>
Correct characteristic mapping: real-time DATA is 61080005, not 61080004
Comparing the reference char roles against our scan revealed a +1 shift (our
service is at ...0001, so the write char is ...0002 and every notify char is
shifted up). Aligned by role: 0003=response/status, 0004=events (acks, taps),
0005=real-time sensor stream, 0007=diagnostics. We had been watching 0004 (the
event channel) for sensor data the whole time.

- whoop_protocol_PWT.py: remap RESP(03)/EVT(04)/DATA(05)/DIAG(07); DATA_CHAR_UUID
  now 61080005; updated CHAR_NAMES.
- ble_stream_PWT.py / ble_sweep_PWT.py: corrected DATA labels.
- docs/BUILD_LOG_PWT.md: corrected GATT map (6.1), the channel-remap finding, and
  wear-the-band next steps. Regenerated PDF/DOCX.

Co-Authored-By: Claude Opus 4.8 <noreply@anthropic.com>
Claude-Session: https://claude.ai/code/session_01PeXJzKdFE3zg9AVZQtc4Pw
</commit_message>
<xml_diff>
--- a/docs/BUILD_LOG_PWT.docx
+++ b/docs/BUILD_LOG_PWT.docx
@@ -1520,63 +1520,91 @@
         <w:rPr>
           <w:b/>
         </w:rPr>
-        <w:t>Open item: continuous streaming.</w:t>
-      </w:r>
-      <w:r>
-        <w:t xml:space="preserve"> Each command returns a *single* reply, not</w:t>
+        <w:t>Found the real cause — we were watching the WRONG channel.</w:t>
+      </w:r>
+      <w:r>
+        <w:t xml:space="preserve"> Comparing the</w:t>
       </w:r>
     </w:p>
     <w:p>
       <w:r>
-        <w:t xml:space="preserve">a continuous stream — so </w:t>
+        <w:t>reference (</w:t>
       </w:r>
       <w:r>
         <w:rPr>
           <w:rFonts w:ascii="Consolas" w:hAnsi="Consolas"/>
           <w:sz w:val="18"/>
         </w:rPr>
-        <w:t>0x03</w:t>
-      </w:r>
-      <w:r>
-        <w:t xml:space="preserve"> alone doesn't flip on realtime. Likely the start command needs a </w:t>
+        <w:t>christianmeurer/whoop-reader</w:t>
+      </w:r>
+      <w:r>
+        <w:t xml:space="preserve">) char constants against our own scan showed an </w:t>
       </w:r>
       <w:r>
         <w:rPr>
           <w:b/>
         </w:rPr>
-        <w:t>payload</w:t>
-      </w:r>
-      <w:r>
-        <w:t xml:space="preserve"> (enable flag / sensor mask) and/or the PPG stream only flows </w:t>
-      </w:r>
-      <w:r>
-        <w:rPr>
-          <w:b/>
-        </w:rPr>
-        <w:t>while worn</w:t>
-      </w:r>
-      <w:r>
-        <w:t xml:space="preserve"> (skin contact). Added </w:t>
+        <w:t>off-by-one</w:t>
+      </w:r>
+      <w:r>
+        <w:t xml:space="preserve">: the reference assumes the write char is </w:t>
       </w:r>
       <w:r>
         <w:rPr>
           <w:rFonts w:ascii="Consolas" w:hAnsi="Consolas"/>
           <w:sz w:val="18"/>
         </w:rPr>
-        <w:t>--start-data</w:t>
-      </w:r>
-      <w:r>
-        <w:t xml:space="preserve"> and full-packet hex logging to </w:t>
+        <w:t>…0001</w:t>
+      </w:r>
+      <w:r>
+        <w:t xml:space="preserve">, but on our band </w:t>
       </w:r>
       <w:r>
         <w:rPr>
           <w:rFonts w:ascii="Consolas" w:hAnsi="Consolas"/>
           <w:sz w:val="18"/>
         </w:rPr>
-        <w:t>ble_stream_PWT.py</w:t>
-      </w:r>
-      <w:r>
-        <w:t xml:space="preserve"> to chase this.</w:t>
+        <w:t>…0001</w:t>
+      </w:r>
+      <w:r>
+        <w:t xml:space="preserve"> is the *service* and the write char is </w:t>
+      </w:r>
+      <w:r>
+        <w:rPr>
+          <w:rFonts w:ascii="Consolas" w:hAnsi="Consolas"/>
+          <w:sz w:val="18"/>
+        </w:rPr>
+        <w:t>…0002</w:t>
+      </w:r>
+      <w:r>
+        <w:t xml:space="preserve">, so every characteristic is shifted +1. Aligning by role (write + 4 notify, in handle order) means </w:t>
+      </w:r>
+      <w:r>
+        <w:rPr>
+          <w:b/>
+        </w:rPr>
+        <w:t>the real-time sensor stream is on `61080005`</w:t>
+      </w:r>
+      <w:r>
+        <w:t xml:space="preserve"> — the channel we had dismissed as "diagnostics". What we called "DATA(04)" is actually the *event* channel (hence one-off command acks + taps). See §6.1 for the corrected map. Also: the reference's start sequence is identical to ours (subscribe → HELLO 0x05 → START 0x03, no payload, response=True), so the opcode was never wrong — the </w:t>
+      </w:r>
+      <w:r>
+        <w:rPr>
+          <w:b/>
+        </w:rPr>
+        <w:t>channel</w:t>
+      </w:r>
+      <w:r>
+        <w:t xml:space="preserve"> was. And every test so far was </w:t>
+      </w:r>
+      <w:r>
+        <w:rPr>
+          <w:b/>
+        </w:rPr>
+        <w:t>off-wrist</w:t>
+      </w:r>
+      <w:r>
+        <w:t xml:space="preserve"> (WHOOP gates the PPG/HR stream on skin contact).</w:t>
       </w:r>
     </w:p>
     <w:p>
@@ -1590,12 +1618,32 @@
         <w:t>← You are here.</w:t>
       </w:r>
       <w:r>
-        <w:t xml:space="preserve"> Next: wear the band and run the stream tool (paired); if no</w:t>
+        <w:t xml:space="preserve"> Next: fixed the channel map (DATA = </w:t>
+      </w:r>
+      <w:r>
+        <w:rPr>
+          <w:rFonts w:ascii="Consolas" w:hAnsi="Consolas"/>
+          <w:sz w:val="18"/>
+        </w:rPr>
+        <w:t>61080005</w:t>
+      </w:r>
+      <w:r>
+        <w:t>); **wear the</w:t>
       </w:r>
     </w:p>
     <w:p>
       <w:r>
-        <w:t>continuous flow, sweep start-command payloads.</w:t>
+        <w:t xml:space="preserve">band** and stream, watching </w:t>
+      </w:r>
+      <w:r>
+        <w:rPr>
+          <w:rFonts w:ascii="Consolas" w:hAnsi="Consolas"/>
+          <w:sz w:val="18"/>
+        </w:rPr>
+        <w:t>DATA(05)</w:t>
+      </w:r>
+      <w:r>
+        <w:t xml:space="preserve"> for 96-byte packets.</w:t>
       </w:r>
     </w:p>
     <w:p>
@@ -1616,177 +1664,417 @@
         <w:pStyle w:val="Heading2"/>
       </w:pPr>
       <w:r>
-        <w:t>6.1 GATT map (from our own scan — authoritative)</w:t>
+        <w:t>6.1 GATT map (from our own scan — authoritative, roles corrected)</w:t>
       </w:r>
     </w:p>
     <w:p>
-      <w:pPr>
-        <w:pStyle w:val="ListBullet"/>
-      </w:pPr>
+      <w:r>
+        <w:t xml:space="preserve">Our band has the </w:t>
+      </w:r>
       <w:r>
         <w:rPr>
           <w:b/>
         </w:rPr>
-        <w:t>Service:</w:t>
-      </w:r>
-      <w:r>
-        <w:t xml:space="preserve"> </w:t>
+        <w:t>service</w:t>
+      </w:r>
+      <w:r>
+        <w:t xml:space="preserve"> at </w:t>
       </w:r>
       <w:r>
         <w:rPr>
           <w:rFonts w:ascii="Consolas" w:hAnsi="Consolas"/>
           <w:sz w:val="18"/>
         </w:rPr>
-        <w:t>61080001-8d6d-82b8-614a-1c8cb0f8dcc6</w:t>
-      </w:r>
-    </w:p>
-    <w:p>
-      <w:pPr>
-        <w:pStyle w:val="ListBullet"/>
-      </w:pPr>
-      <w:r>
-        <w:rPr>
-          <w:b/>
-        </w:rPr>
-        <w:t>Command (write):</w:t>
-      </w:r>
-      <w:r>
-        <w:t xml:space="preserve"> </w:t>
+        <w:t>…0001</w:t>
+      </w:r>
+      <w:r>
+        <w:t xml:space="preserve">, so the characteristics are shifted +1 versus community write-ups that assume the *write* char is </w:t>
       </w:r>
       <w:r>
         <w:rPr>
           <w:rFonts w:ascii="Consolas" w:hAnsi="Consolas"/>
           <w:sz w:val="18"/>
         </w:rPr>
-        <w:t>61080002-…</w:t>
-      </w:r>
-      <w:r>
-        <w:t xml:space="preserve"> — where we send commands.</w:t>
+        <w:t>…0001</w:t>
+      </w:r>
+      <w:r>
+        <w:t>. Mapping by role (write + 4 notify, in handle order):</w:t>
       </w:r>
     </w:p>
+    <w:tbl>
+      <w:tblPr>
+        <w:tblStyle w:val="LightGrid-Accent1"/>
+        <w:tblW w:type="auto" w:w="0"/>
+        <w:tblLook w:firstColumn="1" w:firstRow="1" w:lastColumn="0" w:lastRow="0" w:noHBand="0" w:noVBand="1" w:val="04A0"/>
+      </w:tblPr>
+      <w:tblGrid>
+        <w:gridCol w:w="2880"/>
+        <w:gridCol w:w="2880"/>
+        <w:gridCol w:w="2880"/>
+      </w:tblGrid>
+      <w:tr>
+        <w:tc>
+          <w:tcPr>
+            <w:tcW w:type="dxa" w:w="2880"/>
+          </w:tcPr>
+          <w:p>
+            <w:r>
+              <w:rPr>
+                <w:b/>
+              </w:rPr>
+              <w:t>UUID (first block)</w:t>
+            </w:r>
+          </w:p>
+        </w:tc>
+        <w:tc>
+          <w:tcPr>
+            <w:tcW w:type="dxa" w:w="2880"/>
+          </w:tcPr>
+          <w:p>
+            <w:r>
+              <w:rPr>
+                <w:b/>
+              </w:rPr>
+              <w:t>Role</w:t>
+            </w:r>
+          </w:p>
+        </w:tc>
+        <w:tc>
+          <w:tcPr>
+            <w:tcW w:type="dxa" w:w="2880"/>
+          </w:tcPr>
+          <w:p>
+            <w:r>
+              <w:rPr>
+                <w:b/>
+              </w:rPr>
+              <w:t>Notes</w:t>
+            </w:r>
+          </w:p>
+        </w:tc>
+      </w:tr>
+      <w:tr>
+        <w:tc>
+          <w:tcPr>
+            <w:tcW w:type="dxa" w:w="2880"/>
+          </w:tcPr>
+          <w:p>
+            <w:r>
+              <w:rPr>
+                <w:rFonts w:ascii="Consolas" w:hAnsi="Consolas"/>
+                <w:sz w:val="18"/>
+              </w:rPr>
+              <w:t>61080001</w:t>
+            </w:r>
+          </w:p>
+        </w:tc>
+        <w:tc>
+          <w:tcPr>
+            <w:tcW w:type="dxa" w:w="2880"/>
+          </w:tcPr>
+          <w:p>
+            <w:r>
+              <w:rPr>
+                <w:b/>
+              </w:rPr>
+              <w:t>Service</w:t>
+            </w:r>
+          </w:p>
+        </w:tc>
+        <w:tc>
+          <w:tcPr>
+            <w:tcW w:type="dxa" w:w="2880"/>
+          </w:tcPr>
+          <w:p>
+            <w:r>
+              <w:t>custom GATT service (not a characteristic)</w:t>
+            </w:r>
+          </w:p>
+        </w:tc>
+      </w:tr>
+      <w:tr>
+        <w:tc>
+          <w:tcPr>
+            <w:tcW w:type="dxa" w:w="2880"/>
+          </w:tcPr>
+          <w:p>
+            <w:r>
+              <w:rPr>
+                <w:rFonts w:ascii="Consolas" w:hAnsi="Consolas"/>
+                <w:sz w:val="18"/>
+              </w:rPr>
+              <w:t>61080002</w:t>
+            </w:r>
+          </w:p>
+        </w:tc>
+        <w:tc>
+          <w:tcPr>
+            <w:tcW w:type="dxa" w:w="2880"/>
+          </w:tcPr>
+          <w:p>
+            <w:r>
+              <w:rPr>
+                <w:b/>
+              </w:rPr>
+              <w:t>Command (write)</w:t>
+            </w:r>
+          </w:p>
+        </w:tc>
+        <w:tc>
+          <w:tcPr>
+            <w:tcW w:type="dxa" w:w="2880"/>
+          </w:tcPr>
+          <w:p>
+            <w:r>
+              <w:t>where we send framed commands</w:t>
+            </w:r>
+          </w:p>
+        </w:tc>
+      </w:tr>
+      <w:tr>
+        <w:tc>
+          <w:tcPr>
+            <w:tcW w:type="dxa" w:w="2880"/>
+          </w:tcPr>
+          <w:p>
+            <w:r>
+              <w:rPr>
+                <w:rFonts w:ascii="Consolas" w:hAnsi="Consolas"/>
+                <w:sz w:val="18"/>
+              </w:rPr>
+              <w:t>61080003</w:t>
+            </w:r>
+          </w:p>
+        </w:tc>
+        <w:tc>
+          <w:tcPr>
+            <w:tcW w:type="dxa" w:w="2880"/>
+          </w:tcPr>
+          <w:p>
+            <w:r>
+              <w:rPr>
+                <w:b/>
+              </w:rPr>
+              <w:t>Response / status</w:t>
+            </w:r>
+          </w:p>
+        </w:tc>
+        <w:tc>
+          <w:tcPr>
+            <w:tcW w:type="dxa" w:w="2880"/>
+          </w:tcPr>
+          <w:p>
+            <w:r>
+              <w:t>command responses + the ~2s status beacon</w:t>
+            </w:r>
+          </w:p>
+        </w:tc>
+      </w:tr>
+      <w:tr>
+        <w:tc>
+          <w:tcPr>
+            <w:tcW w:type="dxa" w:w="2880"/>
+          </w:tcPr>
+          <w:p>
+            <w:r>
+              <w:rPr>
+                <w:rFonts w:ascii="Consolas" w:hAnsi="Consolas"/>
+                <w:sz w:val="18"/>
+              </w:rPr>
+              <w:t>61080004</w:t>
+            </w:r>
+          </w:p>
+        </w:tc>
+        <w:tc>
+          <w:tcPr>
+            <w:tcW w:type="dxa" w:w="2880"/>
+          </w:tcPr>
+          <w:p>
+            <w:r>
+              <w:rPr>
+                <w:b/>
+              </w:rPr>
+              <w:t>Events</w:t>
+            </w:r>
+          </w:p>
+        </w:tc>
+        <w:tc>
+          <w:tcPr>
+            <w:tcW w:type="dxa" w:w="2880"/>
+          </w:tcPr>
+          <w:p>
+            <w:r>
+              <w:t xml:space="preserve">async events — command acks, tap/motion (type </w:t>
+            </w:r>
+            <w:r>
+              <w:rPr>
+                <w:rFonts w:ascii="Consolas" w:hAnsi="Consolas"/>
+                <w:sz w:val="18"/>
+              </w:rPr>
+              <w:t>0x30</w:t>
+            </w:r>
+            <w:r>
+              <w:t>)</w:t>
+            </w:r>
+          </w:p>
+        </w:tc>
+      </w:tr>
+      <w:tr>
+        <w:tc>
+          <w:tcPr>
+            <w:tcW w:type="dxa" w:w="2880"/>
+          </w:tcPr>
+          <w:p>
+            <w:r>
+              <w:rPr>
+                <w:rFonts w:ascii="Consolas" w:hAnsi="Consolas"/>
+                <w:sz w:val="18"/>
+              </w:rPr>
+              <w:t>61080005</w:t>
+            </w:r>
+          </w:p>
+        </w:tc>
+        <w:tc>
+          <w:tcPr>
+            <w:tcW w:type="dxa" w:w="2880"/>
+          </w:tcPr>
+          <w:p>
+            <w:r>
+              <w:rPr>
+                <w:b/>
+              </w:rPr>
+              <w:t>DATA — real-time stream</w:t>
+            </w:r>
+          </w:p>
+        </w:tc>
+        <w:tc>
+          <w:tcPr>
+            <w:tcW w:type="dxa" w:w="2880"/>
+          </w:tcPr>
+          <w:p>
+            <w:r>
+              <w:t>the 96-byte sensor packets live here</w:t>
+            </w:r>
+          </w:p>
+        </w:tc>
+      </w:tr>
+      <w:tr>
+        <w:tc>
+          <w:tcPr>
+            <w:tcW w:type="dxa" w:w="2880"/>
+          </w:tcPr>
+          <w:p>
+            <w:r>
+              <w:rPr>
+                <w:rFonts w:ascii="Consolas" w:hAnsi="Consolas"/>
+                <w:sz w:val="18"/>
+              </w:rPr>
+              <w:t>61080007</w:t>
+            </w:r>
+          </w:p>
+        </w:tc>
+        <w:tc>
+          <w:tcPr>
+            <w:tcW w:type="dxa" w:w="2880"/>
+          </w:tcPr>
+          <w:p>
+            <w:r>
+              <w:rPr>
+                <w:b/>
+              </w:rPr>
+              <w:t>Diagnostics</w:t>
+            </w:r>
+          </w:p>
+        </w:tc>
+        <w:tc>
+          <w:tcPr>
+            <w:tcW w:type="dxa" w:w="2880"/>
+          </w:tcPr>
+          <w:p/>
+        </w:tc>
+      </w:tr>
+      <w:tr>
+        <w:tc>
+          <w:tcPr>
+            <w:tcW w:type="dxa" w:w="2880"/>
+          </w:tcPr>
+          <w:p>
+            <w:r>
+              <w:rPr>
+                <w:rFonts w:ascii="Consolas" w:hAnsi="Consolas"/>
+                <w:sz w:val="18"/>
+              </w:rPr>
+              <w:t>00002a37</w:t>
+            </w:r>
+          </w:p>
+        </w:tc>
+        <w:tc>
+          <w:tcPr>
+            <w:tcW w:type="dxa" w:w="2880"/>
+          </w:tcPr>
+          <w:p>
+            <w:r>
+              <w:t>Standard Heart Rate</w:t>
+            </w:r>
+          </w:p>
+        </w:tc>
+        <w:tc>
+          <w:tcPr>
+            <w:tcW w:type="dxa" w:w="2880"/>
+          </w:tcPr>
+          <w:p>
+            <w:r>
+              <w:t>standard BLE HRM characteristic</w:t>
+            </w:r>
+          </w:p>
+        </w:tc>
+      </w:tr>
+    </w:tbl>
     <w:p>
       <w:pPr>
-        <w:pStyle w:val="ListBullet"/>
+        <w:pStyle w:val="IntenseQuote"/>
       </w:pPr>
       <w:r>
-        <w:rPr>
-          <w:b/>
-        </w:rPr>
-        <w:t>Event / replies (notify):</w:t>
-      </w:r>
-      <w:r>
-        <w:t xml:space="preserve"> </w:t>
+        <w:t xml:space="preserve">We originally mis-labelled </w:t>
       </w:r>
       <w:r>
         <w:rPr>
           <w:rFonts w:ascii="Consolas" w:hAnsi="Consolas"/>
           <w:sz w:val="18"/>
         </w:rPr>
-        <w:t>61080003-…</w:t>
-      </w:r>
-      <w:r>
-        <w:t xml:space="preserve"> — status/report packets.</w:t>
-      </w:r>
-    </w:p>
-    <w:p>
-      <w:pPr>
-        <w:pStyle w:val="ListBullet"/>
-      </w:pPr>
-      <w:r>
-        <w:rPr>
-          <w:b/>
-        </w:rPr>
-        <w:t>Data (notify):</w:t>
-      </w:r>
-      <w:r>
-        <w:t xml:space="preserve"> </w:t>
+        <w:t>61080004</w:t>
+      </w:r>
+      <w:r>
+        <w:t xml:space="preserve"> as "data" and </w:t>
       </w:r>
       <w:r>
         <w:rPr>
           <w:rFonts w:ascii="Consolas" w:hAnsi="Consolas"/>
           <w:sz w:val="18"/>
         </w:rPr>
-        <w:t>61080004-…</w:t>
-      </w:r>
-      <w:r>
-        <w:t xml:space="preserve"> — real-time sensor packets (~96 bytes).</w:t>
-      </w:r>
-    </w:p>
-    <w:p>
-      <w:pPr>
-        <w:pStyle w:val="ListBullet"/>
-      </w:pPr>
+        <w:t>61080005</w:t>
+      </w:r>
+      <w:r>
+        <w:t xml:space="preserve"> as "diagnostics" (by matching the reference's numbers instead of its roles). The +1 shift means </w:t>
+      </w:r>
       <w:r>
         <w:rPr>
           <w:b/>
         </w:rPr>
-        <w:t>Diagnostics (notify):</w:t>
-      </w:r>
-      <w:r>
-        <w:t xml:space="preserve"> </w:t>
+        <w:t>the real sensor stream is on `61080005`.</w:t>
+      </w:r>
+      <w:r>
+        <w:t xml:space="preserve"> Corrected in </w:t>
       </w:r>
       <w:r>
         <w:rPr>
           <w:rFonts w:ascii="Consolas" w:hAnsi="Consolas"/>
           <w:sz w:val="18"/>
         </w:rPr>
-        <w:t>61080005-…</w:t>
-      </w:r>
-    </w:p>
-    <w:p>
-      <w:pPr>
-        <w:pStyle w:val="ListBullet"/>
-      </w:pPr>
-      <w:r>
-        <w:rPr>
-          <w:b/>
-        </w:rPr>
-        <w:t>Extra (notify):</w:t>
-      </w:r>
-      <w:r>
-        <w:t xml:space="preserve"> </w:t>
-      </w:r>
-      <w:r>
-        <w:rPr>
-          <w:rFonts w:ascii="Consolas" w:hAnsi="Consolas"/>
-          <w:sz w:val="18"/>
-        </w:rPr>
-        <w:t>61080007-…</w:t>
-      </w:r>
-    </w:p>
-    <w:p>
-      <w:pPr>
-        <w:pStyle w:val="ListBullet"/>
-      </w:pPr>
-      <w:r>
-        <w:rPr>
-          <w:b/>
-        </w:rPr>
-        <w:t>Standard Heart Rate (notify):</w:t>
-      </w:r>
-      <w:r>
-        <w:t xml:space="preserve"> </w:t>
-      </w:r>
-      <w:r>
-        <w:rPr>
-          <w:rFonts w:ascii="Consolas" w:hAnsi="Consolas"/>
-          <w:sz w:val="18"/>
-        </w:rPr>
-        <w:t>00002a37-0000-1000-8000-00805f9b34fb</w:t>
-      </w:r>
-    </w:p>
-    <w:p>
-      <w:pPr>
-        <w:pStyle w:val="IntenseQuote"/>
-      </w:pPr>
-      <w:r>
-        <w:t xml:space="preserve">Some public repos label these UUIDs off-by-one. </w:t>
-      </w:r>
-      <w:r>
-        <w:rPr>
-          <w:b/>
-        </w:rPr>
-        <w:t>Our scan wins.</w:t>
+        <w:t>whoop_protocol_PWT.py</w:t>
+      </w:r>
+      <w:r>
+        <w:t>.</w:t>
       </w:r>
     </w:p>
     <w:p>
@@ -3390,10 +3678,35 @@
         <w:rPr>
           <w:b/>
         </w:rPr>
-        <w:t>Wear the band (snug, skin contact)</w:t>
-      </w:r>
-      <w:r>
-        <w:t xml:space="preserve"> and try for a continuous stream:</w:t>
+        <w:t>Wear the band (snug, tight skin contact)</w:t>
+      </w:r>
+      <w:r>
+        <w:t xml:space="preserve"> and stream — now watching the</w:t>
+      </w:r>
+    </w:p>
+    <w:p>
+      <w:r>
+        <w:t xml:space="preserve">corrected channel </w:t>
+      </w:r>
+      <w:r>
+        <w:rPr>
+          <w:rFonts w:ascii="Consolas" w:hAnsi="Consolas"/>
+          <w:sz w:val="18"/>
+        </w:rPr>
+        <w:t>DATA(05)</w:t>
+      </w:r>
+      <w:r>
+        <w:t xml:space="preserve"> = </w:t>
+      </w:r>
+      <w:r>
+        <w:rPr>
+          <w:rFonts w:ascii="Consolas" w:hAnsi="Consolas"/>
+          <w:sz w:val="18"/>
+        </w:rPr>
+        <w:t>61080005</w:t>
+      </w:r>
+      <w:r>
+        <w:t>:</w:t>
       </w:r>
     </w:p>
     <w:p>
@@ -3418,7 +3731,17 @@
         <w:t>--pair</w:t>
       </w:r>
       <w:r>
-        <w:t xml:space="preserve"> is optional now.) If DATA(04) floods with packets while you hold still, that's the live sensor stream — send Claude the log.</w:t>
+        <w:t xml:space="preserve"> is optional now.) If </w:t>
+      </w:r>
+      <w:r>
+        <w:rPr>
+          <w:rFonts w:ascii="Consolas" w:hAnsi="Consolas"/>
+          <w:sz w:val="18"/>
+        </w:rPr>
+        <w:t>DATA(05)</w:t>
+      </w:r>
+      <w:r>
+        <w:t xml:space="preserve"> floods with ~96-byte packets while you hold still, that's the live sensor stream — send Claude the log.</w:t>
       </w:r>
     </w:p>
     <w:p>
@@ -3426,16 +3749,7 @@
         <w:pStyle w:val="ListNumber"/>
       </w:pPr>
       <w:r>
-        <w:t xml:space="preserve">If it's still single replies, sweep the </w:t>
-      </w:r>
-      <w:r>
-        <w:rPr>
-          <w:b/>
-        </w:rPr>
-        <w:t>start-command payload</w:t>
-      </w:r>
-      <w:r>
-        <w:t>:</w:t>
+        <w:t>If still quiet, try a start payload and/or longer listen:</w:t>
       </w:r>
     </w:p>
     <w:p>
@@ -3445,44 +3759,7 @@
           <w:color w:val="2A2A2A"/>
           <w:sz w:val="18"/>
         </w:rPr>
-        <w:t xml:space="preserve">   python ble_stream_PWT.py &lt;ADDRESS&gt; --with-response --start-data 01 --seconds 15</w:t>
-        <w:br/>
-        <w:t xml:space="preserve">   python ble_stream_PWT.py &lt;ADDRESS&gt; --with-response --start-data 02 --seconds 15</w:t>
-      </w:r>
-    </w:p>
-    <w:p>
-      <w:r>
-        <w:t xml:space="preserve">Also decode the </w:t>
-      </w:r>
-      <w:r>
-        <w:rPr>
-          <w:rFonts w:ascii="Consolas" w:hAnsi="Consolas"/>
-          <w:sz w:val="18"/>
-        </w:rPr>
-        <w:t>0x01</w:t>
-      </w:r>
-      <w:r>
-        <w:t>/</w:t>
-      </w:r>
-      <w:r>
-        <w:rPr>
-          <w:rFonts w:ascii="Consolas" w:hAnsi="Consolas"/>
-          <w:sz w:val="18"/>
-        </w:rPr>
-        <w:t>0x02</w:t>
-      </w:r>
-      <w:r>
-        <w:t xml:space="preserve"> replies (likely battery / device info) to confirm the command map — paste the full </w:t>
-      </w:r>
-      <w:r>
-        <w:rPr>
-          <w:rFonts w:ascii="Consolas" w:hAnsi="Consolas"/>
-          <w:sz w:val="18"/>
-        </w:rPr>
-        <w:t>logs\stream_*.jsonl</w:t>
-      </w:r>
-      <w:r>
-        <w:t>.</w:t>
+        <w:t xml:space="preserve">   python ble_stream_PWT.py &lt;ADDRESS&gt; --with-response --start-data 01 --seconds 20</w:t>
       </w:r>
     </w:p>
     <w:p>

</xml_diff>

<commit_message>
Real-time HR/RR stream decoded: START=0x03+01, type-0x28 on DATA(05)
Breakthrough via ble_startseq_PWT.py: the start command is 0x03 with payload 0x01
(bare 0x03 does nothing on fw 17.2.2.0). The band then streams ~1 Hz type-0x28
packets on 61080005 carrying heart rate (payload[8]) and N RR intervals
(payload[9] = count, then N uint16 LE ms). Verified: HR 76 with RR 789ms
(60000/789 = 76.0).

- whoop_protocol_PWT.py: add RT_START_PAYLOAD, RT_PACKET_TYPE, unframe(),
  parse_rt(); self-test now also verifies real-time parsing.
- ble_stream_PWT.py: START defaults to payload 01; live-decode DATA(05) to
  HR/RR lines.
- ble_startseq_PWT.py: strategy sweep that found the trigger.
- decode_realtime_PWT.py: offline decode of a capture to HR/RR (+CSV).
- docs/BUILD_LOG_PWT.md: verified 28-byte packet layout, new tools, milestone,
  next steps. Regenerated PDF/DOCX.

Co-Authored-By: Claude Opus 4.8 <noreply@anthropic.com>
Claude-Session: https://claude.ai/code/session_01PeXJzKdFE3zg9AVZQtc4Pw
</commit_message>
<xml_diff>
--- a/docs/BUILD_LOG_PWT.docx
+++ b/docs/BUILD_LOG_PWT.docx
@@ -866,6 +866,58 @@
           </w:p>
         </w:tc>
       </w:tr>
+      <w:tr>
+        <w:tc>
+          <w:tcPr>
+            <w:tcW w:type="dxa" w:w="4320"/>
+          </w:tcPr>
+          <w:p>
+            <w:r>
+              <w:rPr>
+                <w:rFonts w:ascii="Consolas" w:hAnsi="Consolas"/>
+                <w:sz w:val="18"/>
+              </w:rPr>
+              <w:t>ble_startseq_PWT.py</w:t>
+            </w:r>
+          </w:p>
+        </w:tc>
+        <w:tc>
+          <w:tcPr>
+            <w:tcW w:type="dxa" w:w="4320"/>
+          </w:tcPr>
+          <w:p>
+            <w:r>
+              <w:t>Try several start sequences in one connection to find the stream trigger.</w:t>
+            </w:r>
+          </w:p>
+        </w:tc>
+      </w:tr>
+      <w:tr>
+        <w:tc>
+          <w:tcPr>
+            <w:tcW w:type="dxa" w:w="4320"/>
+          </w:tcPr>
+          <w:p>
+            <w:r>
+              <w:rPr>
+                <w:rFonts w:ascii="Consolas" w:hAnsi="Consolas"/>
+                <w:sz w:val="18"/>
+              </w:rPr>
+              <w:t>decode_realtime_PWT.py</w:t>
+            </w:r>
+          </w:p>
+        </w:tc>
+        <w:tc>
+          <w:tcPr>
+            <w:tcW w:type="dxa" w:w="4320"/>
+          </w:tcPr>
+          <w:p>
+            <w:r>
+              <w:t>Decode a saved capture into heart rate + RR intervals (and CSV).</w:t>
+            </w:r>
+          </w:p>
+        </w:tc>
+      </w:tr>
     </w:tbl>
     <w:p>
       <w:r>
@@ -1612,13 +1664,7 @@
         <w:pStyle w:val="ListNumber"/>
       </w:pPr>
       <w:r>
-        <w:rPr>
-          <w:b/>
-        </w:rPr>
-        <w:t>← You are here.</w:t>
-      </w:r>
-      <w:r>
-        <w:t xml:space="preserve"> Next: fixed the channel map (DATA = </w:t>
+        <w:t xml:space="preserve">Fixed the channel map (DATA = </w:t>
       </w:r>
       <w:r>
         <w:rPr>
@@ -1628,22 +1674,112 @@
         <w:t>61080005</w:t>
       </w:r>
       <w:r>
-        <w:t>); **wear the</w:t>
+        <w:t>), solved the Windows idle-drop with a</w:t>
       </w:r>
     </w:p>
     <w:p>
       <w:r>
-        <w:t xml:space="preserve">band** and stream, watching </w:t>
+        <w:t xml:space="preserve">harmless Battery-Level-read keepalive, and built </w:t>
       </w:r>
       <w:r>
         <w:rPr>
           <w:rFonts w:ascii="Consolas" w:hAnsi="Consolas"/>
           <w:sz w:val="18"/>
         </w:rPr>
-        <w:t>DATA(05)</w:t>
-      </w:r>
-      <w:r>
-        <w:t xml:space="preserve"> for 96-byte packets.</w:t>
+        <w:t>ble_startseq_PWT.py</w:t>
+      </w:r>
+      <w:r>
+        <w:t xml:space="preserve"> to try multiple start sequences in one stable connection.</w:t>
+      </w:r>
+    </w:p>
+    <w:p>
+      <w:pPr>
+        <w:pStyle w:val="ListNumber"/>
+      </w:pPr>
+      <w:r>
+        <w:rPr>
+          <w:b/>
+        </w:rPr>
+        <w:t>🎉 REAL-TIME STREAM UNLOCKED.</w:t>
+      </w:r>
+      <w:r>
+        <w:t xml:space="preserve"> The start command is **</w:t>
+      </w:r>
+      <w:r>
+        <w:rPr>
+          <w:rFonts w:ascii="Consolas" w:hAnsi="Consolas"/>
+          <w:sz w:val="18"/>
+        </w:rPr>
+        <w:t>0x03</w:t>
+      </w:r>
+      <w:r>
+        <w:t xml:space="preserve"> with payload</w:t>
+      </w:r>
+    </w:p>
+    <w:p>
+      <w:r>
+        <w:rPr>
+          <w:rFonts w:ascii="Consolas" w:hAnsi="Consolas"/>
+          <w:sz w:val="18"/>
+        </w:rPr>
+        <w:t>0x01</w:t>
+      </w:r>
+      <w:r>
+        <w:rPr>
+          <w:b/>
+        </w:rPr>
+        <w:t xml:space="preserve"> (bare `0x03` does nothing on fw 17.2.2.0). Data then streams on `DATA(05)` as </w:t>
+      </w:r>
+      <w:r>
+        <w:t>~1 Hz type-</w:t>
+      </w:r>
+      <w:r>
+        <w:rPr>
+          <w:rFonts w:ascii="Consolas" w:hAnsi="Consolas"/>
+          <w:sz w:val="18"/>
+        </w:rPr>
+        <w:t>0x28</w:t>
+      </w:r>
+      <w:r>
+        <w:t xml:space="preserve"> packets</w:t>
+      </w:r>
+      <w:r>
+        <w:rPr>
+          <w:b/>
+        </w:rPr>
+        <w:t xml:space="preserve"> carrying </w:t>
+      </w:r>
+      <w:r>
+        <w:t xml:space="preserve">heart rate + RR intervals**. Decoded and verified: one packet reported HR 76 with a single RR of 789 ms, and 60000/789 = 76.0 exactly. Captured HR climbing 67→78 bpm with RR ~740–820 ms. Built </w:t>
+      </w:r>
+      <w:r>
+        <w:rPr>
+          <w:rFonts w:ascii="Consolas" w:hAnsi="Consolas"/>
+          <w:sz w:val="18"/>
+        </w:rPr>
+        <w:t>decode_realtime_PWT.py</w:t>
+      </w:r>
+      <w:r>
+        <w:t xml:space="preserve"> to decode captures to HR/RR/CSV.</w:t>
+      </w:r>
+    </w:p>
+    <w:p>
+      <w:pPr>
+        <w:pStyle w:val="ListNumber"/>
+      </w:pPr>
+      <w:r>
+        <w:rPr>
+          <w:b/>
+        </w:rPr>
+        <w:t>← You are here.</w:t>
+      </w:r>
+      <w:r>
+        <w:t xml:space="preserve"> Validate HR against a manual pulse, then chase the</w:t>
+      </w:r>
+    </w:p>
+    <w:p>
+      <w:r>
+        <w:t>accelerometer stream (likely another subtype / the event channel) for gestures.</w:t>
       </w:r>
     </w:p>
     <w:p>
@@ -2291,6 +2427,16 @@
               </w:rPr>
               <w:t>0x03</w:t>
             </w:r>
+            <w:r>
+              <w:t xml:space="preserve"> + payload </w:t>
+            </w:r>
+            <w:r>
+              <w:rPr>
+                <w:rFonts w:ascii="Consolas" w:hAnsi="Consolas"/>
+                <w:sz w:val="18"/>
+              </w:rPr>
+              <w:t>0x01</w:t>
+            </w:r>
           </w:p>
         </w:tc>
         <w:tc>
@@ -2299,7 +2445,23 @@
           </w:tcPr>
           <w:p>
             <w:r>
+              <w:rPr>
+                <w:b/>
+              </w:rPr>
               <w:t>Start real-time streaming</w:t>
+            </w:r>
+            <w:r>
+              <w:t xml:space="preserve"> (bare </w:t>
+            </w:r>
+            <w:r>
+              <w:rPr>
+                <w:rFonts w:ascii="Consolas" w:hAnsi="Consolas"/>
+                <w:sz w:val="18"/>
+              </w:rPr>
+              <w:t>0x03</w:t>
+            </w:r>
+            <w:r>
+              <w:t xml:space="preserve"> does nothing on fw 17.2.2.0)</w:t>
             </w:r>
           </w:p>
         </w:tc>
@@ -2354,7 +2516,7 @@
               <w:rPr>
                 <w:b/>
               </w:rPr>
-              <w:t>HELLO / handshake — send first</w:t>
+              <w:t>HELLO / handshake</w:t>
             </w:r>
           </w:p>
         </w:tc>
@@ -2365,21 +2527,51 @@
         <w:pStyle w:val="Heading2"/>
       </w:pPr>
       <w:r>
-        <w:t>6.4 Real-time data packet (~96 bytes, on `61080004`) — *tentative layout*</w:t>
+        <w:t>6.4 Real-time data packet — **VERIFIED** (type `0x28`, ~1 Hz, on `61080005`)</w:t>
       </w:r>
     </w:p>
     <w:p>
       <w:r>
-        <w:t xml:space="preserve">Adapted from the reference parser; </w:t>
+        <w:t xml:space="preserve">After </w:t>
+      </w:r>
+      <w:r>
+        <w:rPr>
+          <w:rFonts w:ascii="Consolas" w:hAnsi="Consolas"/>
+          <w:sz w:val="18"/>
+        </w:rPr>
+        <w:t>START</w:t>
+      </w:r>
+      <w:r>
+        <w:t xml:space="preserve"> = </w:t>
+      </w:r>
+      <w:r>
+        <w:rPr>
+          <w:rFonts w:ascii="Consolas" w:hAnsi="Consolas"/>
+          <w:sz w:val="18"/>
+        </w:rPr>
+        <w:t>0x03 01</w:t>
+      </w:r>
+      <w:r>
+        <w:t xml:space="preserve">, the band streams one ~28-byte frame per second on the DATA channel. Our </w:t>
+      </w:r>
+      <w:r>
+        <w:rPr>
+          <w:rFonts w:ascii="Consolas" w:hAnsi="Consolas"/>
+          <w:sz w:val="18"/>
+        </w:rPr>
+        <w:t>0xAA</w:t>
+      </w:r>
+      <w:r>
+        <w:t xml:space="preserve"> framing applies; the </w:t>
       </w:r>
       <w:r>
         <w:rPr>
           <w:b/>
         </w:rPr>
-        <w:t>byte offsets past temperature are guesses</w:t>
-      </w:r>
-      <w:r>
-        <w:t xml:space="preserve"> and will be validated against our own captures before we trust them.</w:t>
+        <w:t>payload</w:t>
+      </w:r>
+      <w:r>
+        <w:t xml:space="preserve"> (after unframing) is:</w:t>
       </w:r>
     </w:p>
     <w:tbl>
@@ -2389,33 +2581,47 @@
         <w:tblLook w:firstColumn="1" w:firstRow="1" w:lastColumn="0" w:lastRow="0" w:noHBand="0" w:noVBand="1" w:val="04A0"/>
       </w:tblPr>
       <w:tblGrid>
-        <w:gridCol w:w="4320"/>
-        <w:gridCol w:w="4320"/>
+        <w:gridCol w:w="2880"/>
+        <w:gridCol w:w="2880"/>
+        <w:gridCol w:w="2880"/>
       </w:tblGrid>
       <w:tr>
         <w:tc>
           <w:tcPr>
-            <w:tcW w:type="dxa" w:w="4320"/>
+            <w:tcW w:type="dxa" w:w="2880"/>
           </w:tcPr>
           <w:p>
             <w:r>
               <w:rPr>
                 <w:b/>
               </w:rPr>
-              <w:t>Bytes</w:t>
+              <w:t>Payload bytes</w:t>
             </w:r>
           </w:p>
         </w:tc>
         <w:tc>
           <w:tcPr>
-            <w:tcW w:type="dxa" w:w="4320"/>
+            <w:tcW w:type="dxa" w:w="2880"/>
           </w:tcPr>
           <w:p>
             <w:r>
               <w:rPr>
                 <w:b/>
               </w:rPr>
-              <w:t>Field (tentative)</w:t>
+              <w:t>Field</w:t>
+            </w:r>
+          </w:p>
+        </w:tc>
+        <w:tc>
+          <w:tcPr>
+            <w:tcW w:type="dxa" w:w="2880"/>
+          </w:tcPr>
+          <w:p>
+            <w:r>
+              <w:rPr>
+                <w:b/>
+              </w:rPr>
+              <w:t>Notes</w:t>
             </w:r>
           </w:p>
         </w:tc>
@@ -2423,7 +2629,7 @@
       <w:tr>
         <w:tc>
           <w:tcPr>
-            <w:tcW w:type="dxa" w:w="4320"/>
+            <w:tcW w:type="dxa" w:w="2880"/>
           </w:tcPr>
           <w:p>
             <w:r>
@@ -2437,11 +2643,25 @@
         </w:tc>
         <w:tc>
           <w:tcPr>
-            <w:tcW w:type="dxa" w:w="4320"/>
+            <w:tcW w:type="dxa" w:w="2880"/>
           </w:tcPr>
           <w:p>
             <w:r>
-              <w:t>sequence</w:t>
+              <w:t>packet type</w:t>
+            </w:r>
+          </w:p>
+        </w:tc>
+        <w:tc>
+          <w:tcPr>
+            <w:tcW w:type="dxa" w:w="2880"/>
+          </w:tcPr>
+          <w:p>
+            <w:r>
+              <w:rPr>
+                <w:rFonts w:ascii="Consolas" w:hAnsi="Consolas"/>
+                <w:sz w:val="18"/>
+              </w:rPr>
+              <w:t>0x28</w:t>
             </w:r>
           </w:p>
         </w:tc>
@@ -2449,7 +2669,7 @@
       <w:tr>
         <w:tc>
           <w:tcPr>
-            <w:tcW w:type="dxa" w:w="4320"/>
+            <w:tcW w:type="dxa" w:w="2880"/>
           </w:tcPr>
           <w:p>
             <w:r>
@@ -2457,17 +2677,34 @@
                 <w:rFonts w:ascii="Consolas" w:hAnsi="Consolas"/>
                 <w:sz w:val="18"/>
               </w:rPr>
-              <w:t>[1:3]</w:t>
+              <w:t>[1]</w:t>
             </w:r>
           </w:p>
         </w:tc>
         <w:tc>
           <w:tcPr>
-            <w:tcW w:type="dxa" w:w="4320"/>
+            <w:tcW w:type="dxa" w:w="2880"/>
           </w:tcPr>
           <w:p>
             <w:r>
-              <w:t>heart rate × 100 (uint16 LE) → BPM</w:t>
+              <w:t>subtype</w:t>
+            </w:r>
+          </w:p>
+        </w:tc>
+        <w:tc>
+          <w:tcPr>
+            <w:tcW w:type="dxa" w:w="2880"/>
+          </w:tcPr>
+          <w:p>
+            <w:r>
+              <w:rPr>
+                <w:rFonts w:ascii="Consolas" w:hAnsi="Consolas"/>
+                <w:sz w:val="18"/>
+              </w:rPr>
+              <w:t>0x02</w:t>
+            </w:r>
+            <w:r>
+              <w:t xml:space="preserve"> = realtime metrics</w:t>
             </w:r>
           </w:p>
         </w:tc>
@@ -2475,7 +2712,7 @@
       <w:tr>
         <w:tc>
           <w:tcPr>
-            <w:tcW w:type="dxa" w:w="4320"/>
+            <w:tcW w:type="dxa" w:w="2880"/>
           </w:tcPr>
           <w:p>
             <w:r>
@@ -2483,17 +2720,27 @@
                 <w:rFonts w:ascii="Consolas" w:hAnsi="Consolas"/>
                 <w:sz w:val="18"/>
               </w:rPr>
-              <w:t>[3:5]</w:t>
+              <w:t>[2:6]</w:t>
             </w:r>
           </w:p>
         </w:tc>
         <w:tc>
           <w:tcPr>
-            <w:tcW w:type="dxa" w:w="4320"/>
+            <w:tcW w:type="dxa" w:w="2880"/>
           </w:tcPr>
           <w:p>
             <w:r>
-              <w:t>RR interval, ms (uint16 LE)</w:t>
+              <w:t>timestamp</w:t>
+            </w:r>
+          </w:p>
+        </w:tc>
+        <w:tc>
+          <w:tcPr>
+            <w:tcW w:type="dxa" w:w="2880"/>
+          </w:tcPr>
+          <w:p>
+            <w:r>
+              <w:t>uint32 LE, device uptime seconds</w:t>
             </w:r>
           </w:p>
         </w:tc>
@@ -2501,7 +2748,7 @@
       <w:tr>
         <w:tc>
           <w:tcPr>
-            <w:tcW w:type="dxa" w:w="4320"/>
+            <w:tcW w:type="dxa" w:w="2880"/>
           </w:tcPr>
           <w:p>
             <w:r>
@@ -2509,17 +2756,27 @@
                 <w:rFonts w:ascii="Consolas" w:hAnsi="Consolas"/>
                 <w:sz w:val="18"/>
               </w:rPr>
-              <w:t>[5]</w:t>
+              <w:t>[6:8]</w:t>
             </w:r>
           </w:p>
         </w:tc>
         <w:tc>
           <w:tcPr>
-            <w:tcW w:type="dxa" w:w="4320"/>
+            <w:tcW w:type="dxa" w:w="2880"/>
           </w:tcPr>
           <w:p>
             <w:r>
-              <w:t>SpO₂</w:t>
+              <w:t>aux</w:t>
+            </w:r>
+          </w:p>
+        </w:tc>
+        <w:tc>
+          <w:tcPr>
+            <w:tcW w:type="dxa" w:w="2880"/>
+          </w:tcPr>
+          <w:p>
+            <w:r>
+              <w:t>uint16 LE — not yet decoded (PPG/activity?)</w:t>
             </w:r>
           </w:p>
         </w:tc>
@@ -2527,7 +2784,7 @@
       <w:tr>
         <w:tc>
           <w:tcPr>
-            <w:tcW w:type="dxa" w:w="4320"/>
+            <w:tcW w:type="dxa" w:w="2880"/>
           </w:tcPr>
           <w:p>
             <w:r>
@@ -2535,17 +2792,30 @@
                 <w:rFonts w:ascii="Consolas" w:hAnsi="Consolas"/>
                 <w:sz w:val="18"/>
               </w:rPr>
-              <w:t>[6]</w:t>
+              <w:t>[8]</w:t>
             </w:r>
           </w:p>
         </w:tc>
         <w:tc>
           <w:tcPr>
-            <w:tcW w:type="dxa" w:w="4320"/>
+            <w:tcW w:type="dxa" w:w="2880"/>
           </w:tcPr>
           <w:p>
             <w:r>
-              <w:t>skin temperature °C (offset +25)</w:t>
+              <w:rPr>
+                <w:b/>
+              </w:rPr>
+              <w:t>heart rate</w:t>
+            </w:r>
+          </w:p>
+        </w:tc>
+        <w:tc>
+          <w:tcPr>
+            <w:tcW w:type="dxa" w:w="2880"/>
+          </w:tcPr>
+          <w:p>
+            <w:r>
+              <w:t>bpm (uint8)</w:t>
             </w:r>
           </w:p>
         </w:tc>
@@ -2553,7 +2823,7 @@
       <w:tr>
         <w:tc>
           <w:tcPr>
-            <w:tcW w:type="dxa" w:w="4320"/>
+            <w:tcW w:type="dxa" w:w="2880"/>
           </w:tcPr>
           <w:p>
             <w:r>
@@ -2561,17 +2831,30 @@
                 <w:rFonts w:ascii="Consolas" w:hAnsi="Consolas"/>
                 <w:sz w:val="18"/>
               </w:rPr>
-              <w:t>[7:9] [9:11] [11:13]</w:t>
+              <w:t>[9]</w:t>
             </w:r>
           </w:p>
         </w:tc>
         <w:tc>
           <w:tcPr>
-            <w:tcW w:type="dxa" w:w="4320"/>
+            <w:tcW w:type="dxa" w:w="2880"/>
           </w:tcPr>
           <w:p>
             <w:r>
-              <w:t>accelerometer X / Y / Z (int16)</w:t>
+              <w:rPr>
+                <w:b/>
+              </w:rPr>
+              <w:t>N</w:t>
+            </w:r>
+          </w:p>
+        </w:tc>
+        <w:tc>
+          <w:tcPr>
+            <w:tcW w:type="dxa" w:w="2880"/>
+          </w:tcPr>
+          <w:p>
+            <w:r>
+              <w:t>number of RR intervals that follow</w:t>
             </w:r>
           </w:p>
         </w:tc>
@@ -2579,7 +2862,7 @@
       <w:tr>
         <w:tc>
           <w:tcPr>
-            <w:tcW w:type="dxa" w:w="4320"/>
+            <w:tcW w:type="dxa" w:w="2880"/>
           </w:tcPr>
           <w:p>
             <w:r>
@@ -2587,152 +2870,64 @@
                 <w:rFonts w:ascii="Consolas" w:hAnsi="Consolas"/>
                 <w:sz w:val="18"/>
               </w:rPr>
-              <w:t>[13]</w:t>
+              <w:t>[10 : 10+2N]</w:t>
             </w:r>
           </w:p>
         </w:tc>
         <w:tc>
           <w:tcPr>
-            <w:tcW w:type="dxa" w:w="4320"/>
-          </w:tcPr>
-          <w:p>
-            <w:r>
-              <w:t>motion flag</w:t>
-            </w:r>
-          </w:p>
-        </w:tc>
-      </w:tr>
-      <w:tr>
-        <w:tc>
-          <w:tcPr>
-            <w:tcW w:type="dxa" w:w="4320"/>
+            <w:tcW w:type="dxa" w:w="2880"/>
           </w:tcPr>
           <w:p>
             <w:r>
               <w:rPr>
-                <w:rFonts w:ascii="Consolas" w:hAnsi="Consolas"/>
-                <w:sz w:val="18"/>
+                <w:b/>
               </w:rPr>
-              <w:t>[14:16]</w:t>
+              <w:t>RR intervals</w:t>
             </w:r>
           </w:p>
         </w:tc>
         <w:tc>
           <w:tcPr>
-            <w:tcW w:type="dxa" w:w="4320"/>
+            <w:tcW w:type="dxa" w:w="2880"/>
           </w:tcPr>
           <w:p>
             <w:r>
-              <w:t>PPG amplitude</w:t>
-            </w:r>
-          </w:p>
-        </w:tc>
-      </w:tr>
-      <w:tr>
-        <w:tc>
-          <w:tcPr>
-            <w:tcW w:type="dxa" w:w="4320"/>
-          </w:tcPr>
-          <w:p>
-            <w:r>
-              <w:rPr>
-                <w:rFonts w:ascii="Consolas" w:hAnsi="Consolas"/>
-                <w:sz w:val="18"/>
-              </w:rPr>
-              <w:t>[16:18]</w:t>
-            </w:r>
-          </w:p>
-        </w:tc>
-        <w:tc>
-          <w:tcPr>
-            <w:tcW w:type="dxa" w:w="4320"/>
-          </w:tcPr>
-          <w:p>
-            <w:r>
-              <w:t>ambient light</w:t>
-            </w:r>
-          </w:p>
-        </w:tc>
-      </w:tr>
-      <w:tr>
-        <w:tc>
-          <w:tcPr>
-            <w:tcW w:type="dxa" w:w="4320"/>
-          </w:tcPr>
-          <w:p>
-            <w:r>
-              <w:rPr>
-                <w:rFonts w:ascii="Consolas" w:hAnsi="Consolas"/>
-                <w:sz w:val="18"/>
-              </w:rPr>
-              <w:t>[18:20]</w:t>
-            </w:r>
-          </w:p>
-        </w:tc>
-        <w:tc>
-          <w:tcPr>
-            <w:tcW w:type="dxa" w:w="4320"/>
-          </w:tcPr>
-          <w:p>
-            <w:r>
-              <w:t>PPG quality</w:t>
-            </w:r>
-          </w:p>
-        </w:tc>
-      </w:tr>
-      <w:tr>
-        <w:tc>
-          <w:tcPr>
-            <w:tcW w:type="dxa" w:w="4320"/>
-          </w:tcPr>
-          <w:p>
-            <w:r>
-              <w:rPr>
-                <w:rFonts w:ascii="Consolas" w:hAnsi="Consolas"/>
-                <w:sz w:val="18"/>
-              </w:rPr>
-              <w:t>[20:91]</w:t>
-            </w:r>
-          </w:p>
-        </w:tc>
-        <w:tc>
-          <w:tcPr>
-            <w:tcW w:type="dxa" w:w="4320"/>
-          </w:tcPr>
-          <w:p>
-            <w:r>
-              <w:t>unknown / reserved</w:t>
-            </w:r>
-          </w:p>
-        </w:tc>
-      </w:tr>
-      <w:tr>
-        <w:tc>
-          <w:tcPr>
-            <w:tcW w:type="dxa" w:w="4320"/>
-          </w:tcPr>
-          <w:p>
-            <w:r>
-              <w:rPr>
-                <w:rFonts w:ascii="Consolas" w:hAnsi="Consolas"/>
-                <w:sz w:val="18"/>
-              </w:rPr>
-              <w:t>[92:96]</w:t>
-            </w:r>
-          </w:p>
-        </w:tc>
-        <w:tc>
-          <w:tcPr>
-            <w:tcW w:type="dxa" w:w="4320"/>
-          </w:tcPr>
-          <w:p>
-            <w:r>
-              <w:t>CRC32 (LE)</w:t>
+              <w:t>N × uint16 LE, milliseconds (beat-to-beat → HRV)</w:t>
             </w:r>
           </w:p>
         </w:tc>
       </w:tr>
     </w:tbl>
+    <w:p>
+      <w:r>
+        <w:rPr>
+          <w:b/>
+        </w:rPr>
+        <w:t>Consistency check:</w:t>
+      </w:r>
+      <w:r>
+        <w:t xml:space="preserve"> a packet with HR=76 carried a single RR of 789 ms, and 60000 ÷ 789 = 76.0. A capture showed HR climbing 67→78 bpm with RR ~740–820 ms. Decoder: </w:t>
+      </w:r>
+      <w:r>
+        <w:rPr>
+          <w:rFonts w:ascii="Consolas" w:hAnsi="Consolas"/>
+          <w:sz w:val="18"/>
+        </w:rPr>
+        <w:t>python decode_realtime_PWT.py &lt;logfile&gt;</w:t>
+      </w:r>
+      <w:r>
+        <w:t>.</w:t>
+      </w:r>
+    </w:p>
+    <w:p>
+      <w:pPr>
+        <w:pStyle w:val="IntenseQuote"/>
+      </w:pPr>
+      <w:r>
+        <w:t>This replaces the earlier *tentative* 96-byte layout from the reference — our firmware streams these compact 28-byte HR/RR packets instead.</w:t>
+      </w:r>
+    </w:p>
     <w:p>
       <w:r>
         <w:t xml:space="preserve">Captured </w:t>
@@ -3624,42 +3819,70 @@
         <w:t>Pairing works</w:t>
       </w:r>
       <w:r>
-        <w:t xml:space="preserve"> (Windows ConfirmOnly ceremony); the authenticated link lets</w:t>
+        <w:t xml:space="preserve"> (Windows ConfirmOnly ceremony); authenticated link accepts commands.</w:t>
       </w:r>
     </w:p>
     <w:p>
-      <w:r>
-        <w:t xml:space="preserve">the band accept commands. Commands </w:t>
+      <w:pPr>
+        <w:pStyle w:val="ListBullet"/>
+      </w:pPr>
+      <w:r>
+        <w:rPr>
+          <w:b/>
+        </w:rPr>
+        <w:t>Windows idle-drop solved</w:t>
+      </w:r>
+      <w:r>
+        <w:t xml:space="preserve"> with a Battery-Level-read keepalive.</w:t>
+      </w:r>
+    </w:p>
+    <w:p>
+      <w:pPr>
+        <w:pStyle w:val="ListBullet"/>
+      </w:pPr>
+      <w:r>
+        <w:rPr>
+          <w:b/>
+        </w:rPr>
+        <w:t>Real-time HR + RR streaming works</w:t>
+      </w:r>
+      <w:r>
+        <w:t xml:space="preserve"> — </w:t>
       </w:r>
       <w:r>
         <w:rPr>
           <w:rFonts w:ascii="Consolas" w:hAnsi="Consolas"/>
           <w:sz w:val="18"/>
         </w:rPr>
-        <w:t>0x01</w:t>
-      </w:r>
-      <w:r>
-        <w:t>–</w:t>
+        <w:t>START = 0x03 01</w:t>
+      </w:r>
+      <w:r>
+        <w:t xml:space="preserve">, data on </w:t>
       </w:r>
       <w:r>
         <w:rPr>
           <w:rFonts w:ascii="Consolas" w:hAnsi="Consolas"/>
           <w:sz w:val="18"/>
         </w:rPr>
-        <w:t>0x04</w:t>
-      </w:r>
-      <w:r>
-        <w:t xml:space="preserve"> return type-</w:t>
+        <w:t>DATA(05)</w:t>
+      </w:r>
+      <w:r>
+        <w:t xml:space="preserve"> as</w:t>
+      </w:r>
+    </w:p>
+    <w:p>
+      <w:r>
+        <w:t>~1 Hz type-</w:t>
       </w:r>
       <w:r>
         <w:rPr>
           <w:rFonts w:ascii="Consolas" w:hAnsi="Consolas"/>
           <w:sz w:val="18"/>
         </w:rPr>
-        <w:t>0x30</w:t>
-      </w:r>
-      <w:r>
-        <w:t xml:space="preserve"> replies.</w:t>
+        <w:t>0x28</w:t>
+      </w:r>
+      <w:r>
+        <w:t xml:space="preserve"> packets; decoded and verified.</w:t>
       </w:r>
     </w:p>
     <w:p>
@@ -3678,35 +3901,10 @@
         <w:rPr>
           <w:b/>
         </w:rPr>
-        <w:t>Wear the band (snug, tight skin contact)</w:t>
-      </w:r>
-      <w:r>
-        <w:t xml:space="preserve"> and stream — now watching the</w:t>
-      </w:r>
-    </w:p>
-    <w:p>
-      <w:r>
-        <w:t xml:space="preserve">corrected channel </w:t>
-      </w:r>
-      <w:r>
-        <w:rPr>
-          <w:rFonts w:ascii="Consolas" w:hAnsi="Consolas"/>
-          <w:sz w:val="18"/>
-        </w:rPr>
-        <w:t>DATA(05)</w:t>
-      </w:r>
-      <w:r>
-        <w:t xml:space="preserve"> = </w:t>
-      </w:r>
-      <w:r>
-        <w:rPr>
-          <w:rFonts w:ascii="Consolas" w:hAnsi="Consolas"/>
-          <w:sz w:val="18"/>
-        </w:rPr>
-        <w:t>61080005</w:t>
-      </w:r>
-      <w:r>
-        <w:t>:</w:t>
+        <w:t>Watch your live heart rate</w:t>
+      </w:r>
+      <w:r>
+        <w:t xml:space="preserve"> (wear the band, snug):</w:t>
       </w:r>
     </w:p>
     <w:p>
@@ -3721,27 +3919,17 @@
     </w:p>
     <w:p>
       <w:r>
-        <w:t xml:space="preserve">(Pairing persists, so </w:t>
+        <w:t xml:space="preserve">It now prints </w:t>
       </w:r>
       <w:r>
         <w:rPr>
           <w:rFonts w:ascii="Consolas" w:hAnsi="Consolas"/>
           <w:sz w:val="18"/>
         </w:rPr>
-        <w:t>--pair</w:t>
-      </w:r>
-      <w:r>
-        <w:t xml:space="preserve"> is optional now.) If </w:t>
-      </w:r>
-      <w:r>
-        <w:rPr>
-          <w:rFonts w:ascii="Consolas" w:hAnsi="Consolas"/>
-          <w:sz w:val="18"/>
-        </w:rPr>
-        <w:t>DATA(05)</w:t>
-      </w:r>
-      <w:r>
-        <w:t xml:space="preserve"> floods with ~96-byte packets while you hold still, that's the live sensor stream — send Claude the log.</w:t>
+        <w:t>HR=NN bpm RR=...ms</w:t>
+      </w:r>
+      <w:r>
+        <w:t>. Sanity-check HR against a manual pulse count.</w:t>
       </w:r>
     </w:p>
     <w:p>
@@ -3749,7 +3937,7 @@
         <w:pStyle w:val="ListNumber"/>
       </w:pPr>
       <w:r>
-        <w:t>If still quiet, try a start payload and/or longer listen:</w:t>
+        <w:t>Decode any saved capture:</w:t>
       </w:r>
     </w:p>
     <w:p>
@@ -3759,7 +3947,7 @@
           <w:color w:val="2A2A2A"/>
           <w:sz w:val="18"/>
         </w:rPr>
-        <w:t xml:space="preserve">   python ble_stream_PWT.py &lt;ADDRESS&gt; --with-response --start-data 01 --seconds 20</w:t>
+        <w:t xml:space="preserve">   python decode_realtime_PWT.py ..\logs\stream_YYYYMMDD_HHMMSS_PWT.jsonl --csv hr.csv</w:t>
       </w:r>
     </w:p>
     <w:p>
@@ -3767,22 +3955,51 @@
         <w:pStyle w:val="ListNumber"/>
       </w:pPr>
       <w:r>
-        <w:t xml:space="preserve">Build </w:t>
+        <w:t xml:space="preserve">Decode the </w:t>
       </w:r>
       <w:r>
         <w:rPr>
           <w:rFonts w:ascii="Consolas" w:hAnsi="Consolas"/>
           <w:sz w:val="18"/>
         </w:rPr>
-        <w:t>decode_realtime_PWT.py</w:t>
-      </w:r>
-      <w:r>
-        <w:t xml:space="preserve"> from the captured bytes — validate HR against</w:t>
+        <w:t>aux</w:t>
+      </w:r>
+      <w:r>
+        <w:t xml:space="preserve"> field (</w:t>
+      </w:r>
+      <w:r>
+        <w:rPr>
+          <w:rFonts w:ascii="Consolas" w:hAnsi="Consolas"/>
+          <w:sz w:val="18"/>
+        </w:rPr>
+        <w:t>[6:8]</w:t>
+      </w:r>
+      <w:r>
+        <w:t xml:space="preserve">) and hunt the </w:t>
+      </w:r>
+      <w:r>
+        <w:rPr>
+          <w:b/>
+        </w:rPr>
+        <w:t>accelerometer</w:t>
+      </w:r>
+      <w:r>
+        <w:t xml:space="preserve"> stream (likely</w:t>
       </w:r>
     </w:p>
     <w:p>
       <w:r>
-        <w:t>your actual resting heart rate, then lock in the accel / temp / SpO₂ offsets.</w:t>
+        <w:t xml:space="preserve">another </w:t>
+      </w:r>
+      <w:r>
+        <w:rPr>
+          <w:rFonts w:ascii="Consolas" w:hAnsi="Consolas"/>
+          <w:sz w:val="18"/>
+        </w:rPr>
+        <w:t>0x28</w:t>
+      </w:r>
+      <w:r>
+        <w:t xml:space="preserve"> subtype or the event channel) — needed for gesture control.</w:t>
       </w:r>
     </w:p>
     <w:p>
@@ -3790,7 +4007,7 @@
         <w:pStyle w:val="ListNumber"/>
       </w:pPr>
       <w:r>
-        <w:t>Gesture recognition from the accelerometer stream.</w:t>
+        <w:t>Also decode SpO₂ / skin-temp metrics if they appear as other subtypes.</w:t>
       </w:r>
     </w:p>
     <w:p>

</xml_diff>

<commit_message>
Decode accelerometer (type 0x2f float X/Y/Z); battery check; fixes
- whoop_protocol_PWT.py: add ACCEL_PACKET_TYPE 0x2f and parse_accel() — accel is
  float32 X/Y/Z (g) at payload[36] (copy at [52]); verified rest vector ~1.01 g.
  Self-test now covers accel.
- ble_accel_PWT.py: fix crash formatting unknown packet types; live-decode accel
  (type 0x2f) and HR (type 0x28), ignore firmware log text (type 0x32); print
  Battery% at the start of every sweep; add --extra-cmd to send an accel-enabling
  command after START in live mode.
- Tools/export_docs_PWT.py: make inline markup robust to bold/code overlap (was
  crashing the PDF render).
- docs/BUILD_LOG_PWT.md: document the 0x2f accel format (6.8), the opcode-sweep
  finding, Windows recovery notes, new tool, and next steps. Regenerated PDF/DOCX.

Co-Authored-By: Claude Opus 4.8 <noreply@anthropic.com>
Claude-Session: https://claude.ai/code/session_01PeXJzKdFE3zg9AVZQtc4Pw
</commit_message>
<xml_diff>
--- a/docs/BUILD_LOG_PWT.docx
+++ b/docs/BUILD_LOG_PWT.docx
@@ -903,6 +903,32 @@
                 <w:rFonts w:ascii="Consolas" w:hAnsi="Consolas"/>
                 <w:sz w:val="18"/>
               </w:rPr>
+              <w:t>ble_accel_PWT.py</w:t>
+            </w:r>
+          </w:p>
+        </w:tc>
+        <w:tc>
+          <w:tcPr>
+            <w:tcW w:type="dxa" w:w="4320"/>
+          </w:tcPr>
+          <w:p>
+            <w:r>
+              <w:t>Find/stream the accelerometer (payload sweep, opcode sweep, live decode).</w:t>
+            </w:r>
+          </w:p>
+        </w:tc>
+      </w:tr>
+      <w:tr>
+        <w:tc>
+          <w:tcPr>
+            <w:tcW w:type="dxa" w:w="4320"/>
+          </w:tcPr>
+          <w:p>
+            <w:r>
+              <w:rPr>
+                <w:rFonts w:ascii="Consolas" w:hAnsi="Consolas"/>
+                <w:sz w:val="18"/>
+              </w:rPr>
               <w:t>decode_realtime_PWT.py</w:t>
             </w:r>
           </w:p>
@@ -1768,18 +1794,134 @@
         <w:pStyle w:val="ListNumber"/>
       </w:pPr>
       <w:r>
+        <w:t>HR validated against the owner's real resting BPM — decode confirmed.</w:t>
+      </w:r>
+    </w:p>
+    <w:p>
+      <w:pPr>
+        <w:pStyle w:val="ListNumber"/>
+      </w:pPr>
+      <w:r>
+        <w:rPr>
+          <w:b/>
+        </w:rPr>
+        <w:t>ACCELEROMETER FORMAT FOUND.</w:t>
+      </w:r>
+      <w:r>
+        <w:t xml:space="preserve"> Probing opcodes </w:t>
+      </w:r>
+      <w:r>
+        <w:rPr>
+          <w:rFonts w:ascii="Consolas" w:hAnsi="Consolas"/>
+          <w:sz w:val="18"/>
+        </w:rPr>
+        <w:t>0x10–0x1f</w:t>
+      </w:r>
+      <w:r>
+        <w:t xml:space="preserve"> (`ble_accel_PWT.py</w:t>
+      </w:r>
+    </w:p>
+    <w:p>
+      <w:r>
+        <w:t>--cmd-sweep</w:t>
+      </w:r>
+      <w:r>
+        <w:rPr>
+          <w:rFonts w:ascii="Consolas" w:hAnsi="Consolas"/>
+          <w:sz w:val="18"/>
+        </w:rPr>
+        <w:t xml:space="preserve">) unlocked a high-rate burst of **96-byte** </w:t>
+      </w:r>
+      <w:r>
+        <w:t>type 0x2f</w:t>
+      </w:r>
+      <w:r>
+        <w:rPr>
+          <w:rFonts w:ascii="Consolas" w:hAnsi="Consolas"/>
+          <w:sz w:val="18"/>
+        </w:rPr>
+        <w:t xml:space="preserve"> **packets** on DATA(05). Decoded: **accelerometer X/Y/Z as three float32 in g units** at payload offset 36 (a second copy at 52), e.g. a rest vector </w:t>
+      </w:r>
+      <w:r>
+        <w:t>(-0.125, 0.366, 0.934)</w:t>
+      </w:r>
+      <w:r>
+        <w:rPr>
+          <w:rFonts w:ascii="Consolas" w:hAnsi="Consolas"/>
+          <w:sz w:val="18"/>
+        </w:rPr>
+        <w:t xml:space="preserve"> → magnitude **1.01 g** (gravity). The same window also emitted firmware **debug-log text** (</w:t>
+      </w:r>
+      <w:r>
+        <w:t>type 0x32</w:t>
+      </w:r>
+      <w:r>
+        <w:rPr>
+          <w:rFonts w:ascii="Consolas" w:hAnsi="Consolas"/>
+          <w:sz w:val="18"/>
+        </w:rPr>
+        <w:t xml:space="preserve">) and the dump was labelled "Historical Dump" — so </w:t>
+      </w:r>
+      <w:r>
+        <w:t>0x16</w:t>
+      </w:r>
+      <w:r>
+        <w:rPr>
+          <w:rFonts w:ascii="Consolas" w:hAnsi="Consolas"/>
+          <w:sz w:val="18"/>
+        </w:rPr>
+        <w:t xml:space="preserve"> downloads STORED data. Next: confirm the same </w:t>
+      </w:r>
+      <w:r>
+        <w:t>0x2f` float format arrives LIVE while moving the wrist.</w:t>
+      </w:r>
+    </w:p>
+    <w:p>
+      <w:pPr>
+        <w:pStyle w:val="ListNumber"/>
+      </w:pPr>
+      <w:r>
+        <w:rPr>
+          <w:b/>
+        </w:rPr>
+        <w:t>Op notes:</w:t>
+      </w:r>
+      <w:r>
+        <w:t xml:space="preserve"> Windows BLE needs a Bluetooth off/on toggle to recover from the</w:t>
+      </w:r>
+    </w:p>
+    <w:p>
+      <w:r>
+        <w:t xml:space="preserve">"operation was canceled" wedge, and the band must be tapped awake right before running. Fixed a tool crash (formatting unknown packet types) and added live accel/HR decoding + </w:t>
+      </w:r>
+      <w:r>
+        <w:rPr>
+          <w:rFonts w:ascii="Consolas" w:hAnsi="Consolas"/>
+          <w:sz w:val="18"/>
+        </w:rPr>
+        <w:t>--extra-cmd</w:t>
+      </w:r>
+      <w:r>
+        <w:t>.</w:t>
+      </w:r>
+    </w:p>
+    <w:p>
+      <w:pPr>
+        <w:pStyle w:val="ListNumber"/>
+      </w:pPr>
+      <w:r>
         <w:rPr>
           <w:b/>
         </w:rPr>
         <w:t>← You are here.</w:t>
       </w:r>
       <w:r>
-        <w:t xml:space="preserve"> Validate HR against a manual pulse, then chase the</w:t>
+        <w:t xml:space="preserve"> Capture LIVE accel while tilting the wrist; build the</w:t>
       </w:r>
     </w:p>
     <w:p>
       <w:r>
-        <w:t>accelerometer stream (likely another subtype / the event channel) for gestures.</w:t>
+        <w:t>gesture recogniser on the X/Y/Z stream.</w:t>
       </w:r>
     </w:p>
     <w:p>
@@ -2929,6 +3071,291 @@
       </w:r>
     </w:p>
     <w:p>
+      <w:pPr>
+        <w:pStyle w:val="Heading2"/>
+      </w:pPr>
+      <w:r>
+        <w:t>6.8 Accelerometer packet — type `0x2f` (96 bytes, on `61080005`)</w:t>
+      </w:r>
+    </w:p>
+    <w:p>
+      <w:r>
+        <w:t xml:space="preserve">Unlocked by probing opcodes </w:t>
+      </w:r>
+      <w:r>
+        <w:rPr>
+          <w:rFonts w:ascii="Consolas" w:hAnsi="Consolas"/>
+          <w:sz w:val="18"/>
+        </w:rPr>
+        <w:t>0x10–0x1f</w:t>
+      </w:r>
+      <w:r>
+        <w:t xml:space="preserve">. The accelerometer is reported as </w:t>
+      </w:r>
+      <w:r>
+        <w:rPr>
+          <w:b/>
+        </w:rPr>
+        <w:t>float32 (little-endian), in g units</w:t>
+      </w:r>
+      <w:r>
+        <w:t>:</w:t>
+      </w:r>
+    </w:p>
+    <w:tbl>
+      <w:tblPr>
+        <w:tblStyle w:val="LightGrid-Accent1"/>
+        <w:tblW w:type="auto" w:w="0"/>
+        <w:tblLook w:firstColumn="1" w:firstRow="1" w:lastColumn="0" w:lastRow="0" w:noHBand="0" w:noVBand="1" w:val="04A0"/>
+      </w:tblPr>
+      <w:tblGrid>
+        <w:gridCol w:w="4320"/>
+        <w:gridCol w:w="4320"/>
+      </w:tblGrid>
+      <w:tr>
+        <w:tc>
+          <w:tcPr>
+            <w:tcW w:type="dxa" w:w="4320"/>
+          </w:tcPr>
+          <w:p>
+            <w:r>
+              <w:rPr>
+                <w:b/>
+              </w:rPr>
+              <w:t>Payload bytes</w:t>
+            </w:r>
+          </w:p>
+        </w:tc>
+        <w:tc>
+          <w:tcPr>
+            <w:tcW w:type="dxa" w:w="4320"/>
+          </w:tcPr>
+          <w:p>
+            <w:r>
+              <w:rPr>
+                <w:b/>
+              </w:rPr>
+              <w:t>Field</w:t>
+            </w:r>
+          </w:p>
+        </w:tc>
+      </w:tr>
+      <w:tr>
+        <w:tc>
+          <w:tcPr>
+            <w:tcW w:type="dxa" w:w="4320"/>
+          </w:tcPr>
+          <w:p>
+            <w:r>
+              <w:rPr>
+                <w:rFonts w:ascii="Consolas" w:hAnsi="Consolas"/>
+                <w:sz w:val="18"/>
+              </w:rPr>
+              <w:t>[0]</w:t>
+            </w:r>
+          </w:p>
+        </w:tc>
+        <w:tc>
+          <w:tcPr>
+            <w:tcW w:type="dxa" w:w="4320"/>
+          </w:tcPr>
+          <w:p>
+            <w:r>
+              <w:t>packet type (</w:t>
+            </w:r>
+            <w:r>
+              <w:rPr>
+                <w:rFonts w:ascii="Consolas" w:hAnsi="Consolas"/>
+                <w:sz w:val="18"/>
+              </w:rPr>
+              <w:t>0x2f</w:t>
+            </w:r>
+            <w:r>
+              <w:t>)</w:t>
+            </w:r>
+          </w:p>
+        </w:tc>
+      </w:tr>
+      <w:tr>
+        <w:tc>
+          <w:tcPr>
+            <w:tcW w:type="dxa" w:w="4320"/>
+          </w:tcPr>
+          <w:p>
+            <w:r>
+              <w:rPr>
+                <w:rFonts w:ascii="Consolas" w:hAnsi="Consolas"/>
+                <w:sz w:val="18"/>
+              </w:rPr>
+              <w:t>[1]</w:t>
+            </w:r>
+          </w:p>
+        </w:tc>
+        <w:tc>
+          <w:tcPr>
+            <w:tcW w:type="dxa" w:w="4320"/>
+          </w:tcPr>
+          <w:p>
+            <w:r>
+              <w:t>subtype (</w:t>
+            </w:r>
+            <w:r>
+              <w:rPr>
+                <w:rFonts w:ascii="Consolas" w:hAnsi="Consolas"/>
+                <w:sz w:val="18"/>
+              </w:rPr>
+              <w:t>0x0c</w:t>
+            </w:r>
+            <w:r>
+              <w:t>)</w:t>
+            </w:r>
+          </w:p>
+        </w:tc>
+      </w:tr>
+      <w:tr>
+        <w:tc>
+          <w:tcPr>
+            <w:tcW w:type="dxa" w:w="4320"/>
+          </w:tcPr>
+          <w:p>
+            <w:r>
+              <w:rPr>
+                <w:rFonts w:ascii="Consolas" w:hAnsi="Consolas"/>
+                <w:sz w:val="18"/>
+              </w:rPr>
+              <w:t>[36:40] [40:44] [44:48]</w:t>
+            </w:r>
+          </w:p>
+        </w:tc>
+        <w:tc>
+          <w:tcPr>
+            <w:tcW w:type="dxa" w:w="4320"/>
+          </w:tcPr>
+          <w:p>
+            <w:r>
+              <w:rPr>
+                <w:b/>
+              </w:rPr>
+              <w:t>accel X / Y / Z</w:t>
+            </w:r>
+            <w:r>
+              <w:t xml:space="preserve"> — float32, g units</w:t>
+            </w:r>
+          </w:p>
+        </w:tc>
+      </w:tr>
+      <w:tr>
+        <w:tc>
+          <w:tcPr>
+            <w:tcW w:type="dxa" w:w="4320"/>
+          </w:tcPr>
+          <w:p>
+            <w:r>
+              <w:rPr>
+                <w:rFonts w:ascii="Consolas" w:hAnsi="Consolas"/>
+                <w:sz w:val="18"/>
+              </w:rPr>
+              <w:t>[52:64]</w:t>
+            </w:r>
+          </w:p>
+        </w:tc>
+        <w:tc>
+          <w:tcPr>
+            <w:tcW w:type="dxa" w:w="4320"/>
+          </w:tcPr>
+          <w:p>
+            <w:r>
+              <w:t>second X/Y/Z copy (filtered vs raw)</w:t>
+            </w:r>
+          </w:p>
+        </w:tc>
+      </w:tr>
+    </w:tbl>
+    <w:p>
+      <w:r>
+        <w:rPr>
+          <w:b/>
+        </w:rPr>
+        <w:t>Verified:</w:t>
+      </w:r>
+      <w:r>
+        <w:t xml:space="preserve"> a rest packet decoded to </w:t>
+      </w:r>
+      <w:r>
+        <w:rPr>
+          <w:rFonts w:ascii="Consolas" w:hAnsi="Consolas"/>
+          <w:sz w:val="18"/>
+        </w:rPr>
+        <w:t>(-0.125, 0.366, 0.934)</w:t>
+      </w:r>
+      <w:r>
+        <w:t xml:space="preserve">, magnitude </w:t>
+      </w:r>
+      <w:r>
+        <w:rPr>
+          <w:b/>
+        </w:rPr>
+        <w:t>1.01 g</w:t>
+      </w:r>
+      <w:r>
+        <w:t xml:space="preserve"> (gravity). Parser: </w:t>
+      </w:r>
+      <w:r>
+        <w:rPr>
+          <w:rFonts w:ascii="Consolas" w:hAnsi="Consolas"/>
+          <w:sz w:val="18"/>
+        </w:rPr>
+        <w:t>whoop_protocol_PWT.parse_accel()</w:t>
+      </w:r>
+      <w:r>
+        <w:t xml:space="preserve">; live view: </w:t>
+      </w:r>
+      <w:r>
+        <w:rPr>
+          <w:rFonts w:ascii="Consolas" w:hAnsi="Consolas"/>
+          <w:sz w:val="18"/>
+        </w:rPr>
+        <w:t>python ble_accel_PWT.py &lt;ADDR&gt; --start-data 01 --extra-cmd 0x16 --label tilt</w:t>
+      </w:r>
+      <w:r>
+        <w:t>.</w:t>
+      </w:r>
+    </w:p>
+    <w:p>
+      <w:pPr>
+        <w:pStyle w:val="IntenseQuote"/>
+      </w:pPr>
+      <w:r>
+        <w:rPr>
+          <w:rFonts w:ascii="Consolas" w:hAnsi="Consolas"/>
+          <w:sz w:val="18"/>
+        </w:rPr>
+        <w:t>type 0x32</w:t>
+      </w:r>
+      <w:r>
+        <w:t xml:space="preserve"> packets seen alongside are firmware </w:t>
+      </w:r>
+      <w:r>
+        <w:rPr>
+          <w:b/>
+        </w:rPr>
+        <w:t>debug-log text</w:t>
+      </w:r>
+      <w:r>
+        <w:t xml:space="preserve"> (ASCII), not sensor data. The </w:t>
+      </w:r>
+      <w:r>
+        <w:rPr>
+          <w:rFonts w:ascii="Consolas" w:hAnsi="Consolas"/>
+          <w:sz w:val="18"/>
+        </w:rPr>
+        <w:t>0x16</w:t>
+      </w:r>
+      <w:r>
+        <w:t xml:space="preserve"> dump is labelled "Historical" — confirming LIVE accel is the next step.</w:t>
+      </w:r>
+    </w:p>
+    <w:p>
       <w:r>
         <w:t xml:space="preserve">Captured </w:t>
       </w:r>
@@ -3882,7 +4309,31 @@
         <w:t>0x28</w:t>
       </w:r>
       <w:r>
-        <w:t xml:space="preserve"> packets; decoded and verified.</w:t>
+        <w:t xml:space="preserve"> packets; decoded and verified against the owner's resting BPM.</w:t>
+      </w:r>
+    </w:p>
+    <w:p>
+      <w:pPr>
+        <w:pStyle w:val="ListBullet"/>
+      </w:pPr>
+      <w:r>
+        <w:rPr>
+          <w:b/>
+        </w:rPr>
+        <w:t>Accelerometer format decoded</w:t>
+      </w:r>
+      <w:r>
+        <w:t xml:space="preserve"> — type-</w:t>
+      </w:r>
+      <w:r>
+        <w:rPr>
+          <w:rFonts w:ascii="Consolas" w:hAnsi="Consolas"/>
+          <w:sz w:val="18"/>
+        </w:rPr>
+        <w:t>0x2f</w:t>
+      </w:r>
+      <w:r>
+        <w:t xml:space="preserve"> packets, X/Y/Z float32 (g).</w:t>
       </w:r>
     </w:p>
     <w:p>
@@ -3901,10 +4352,10 @@
         <w:rPr>
           <w:b/>
         </w:rPr>
-        <w:t>Watch your live heart rate</w:t>
-      </w:r>
-      <w:r>
-        <w:t xml:space="preserve"> (wear the band, snug):</w:t>
+        <w:t>Confirm LIVE accel while moving</w:t>
+      </w:r>
+      <w:r>
+        <w:t xml:space="preserve"> (tap the band awake first):</w:t>
       </w:r>
     </w:p>
     <w:p>
@@ -3914,22 +4365,32 @@
           <w:color w:val="2A2A2A"/>
           <w:sz w:val="18"/>
         </w:rPr>
-        <w:t xml:space="preserve">   python ble_stream_PWT.py &lt;ADDRESS&gt; --with-response --seconds 30</w:t>
+        <w:t xml:space="preserve">   python ble_accel_PWT.py &lt;ADDRESS&gt; --start-data 01 --extra-cmd 0x16 --label tilt</w:t>
       </w:r>
     </w:p>
     <w:p>
       <w:r>
-        <w:t xml:space="preserve">It now prints </w:t>
+        <w:t xml:space="preserve">Tilt the wrist slowly; </w:t>
       </w:r>
       <w:r>
         <w:rPr>
           <w:rFonts w:ascii="Consolas" w:hAnsi="Consolas"/>
           <w:sz w:val="18"/>
         </w:rPr>
-        <w:t>HR=NN bpm RR=...ms</w:t>
-      </w:r>
-      <w:r>
-        <w:t>. Sanity-check HR against a manual pulse count.</w:t>
+        <w:t>[ACCEL] x/y/z |g|</w:t>
+      </w:r>
+      <w:r>
+        <w:t xml:space="preserve"> lines should track gravity. If the values only replay stored data and stop, try </w:t>
+      </w:r>
+      <w:r>
+        <w:rPr>
+          <w:rFonts w:ascii="Consolas" w:hAnsi="Consolas"/>
+          <w:sz w:val="18"/>
+        </w:rPr>
+        <w:t>--extra-cmd 0x13</w:t>
+      </w:r>
+      <w:r>
+        <w:t xml:space="preserve"> (continuous).</w:t>
       </w:r>
     </w:p>
     <w:p>
@@ -3937,17 +4398,22 @@
         <w:pStyle w:val="ListNumber"/>
       </w:pPr>
       <w:r>
-        <w:t>Decode any saved capture:</w:t>
+        <w:t xml:space="preserve">Once LIVE accel is confirmed, build </w:t>
+      </w:r>
+      <w:r>
+        <w:rPr>
+          <w:rFonts w:ascii="Consolas" w:hAnsi="Consolas"/>
+          <w:sz w:val="18"/>
+        </w:rPr>
+        <w:t>decode_accel_PWT.py</w:t>
+      </w:r>
+      <w:r>
+        <w:t xml:space="preserve"> + a simple gesture</w:t>
       </w:r>
     </w:p>
     <w:p>
       <w:r>
-        <w:rPr>
-          <w:rFonts w:ascii="Consolas" w:hAnsi="Consolas"/>
-          <w:color w:val="2A2A2A"/>
-          <w:sz w:val="18"/>
-        </w:rPr>
-        <w:t xml:space="preserve">   python decode_realtime_PWT.py ..\logs\stream_YYYYMMDD_HHMMSS_PWT.jsonl --csv hr.csv</w:t>
+        <w:t>recogniser (tilt / flick / hold) on the X/Y/Z stream.</w:t>
       </w:r>
     </w:p>
     <w:p>
@@ -3955,7 +4421,7 @@
         <w:pStyle w:val="ListNumber"/>
       </w:pPr>
       <w:r>
-        <w:t xml:space="preserve">Decode the </w:t>
+        <w:t xml:space="preserve">Decode the HR </w:t>
       </w:r>
       <w:r>
         <w:rPr>
@@ -3965,41 +4431,7 @@
         <w:t>aux</w:t>
       </w:r>
       <w:r>
-        <w:t xml:space="preserve"> field (</w:t>
-      </w:r>
-      <w:r>
-        <w:rPr>
-          <w:rFonts w:ascii="Consolas" w:hAnsi="Consolas"/>
-          <w:sz w:val="18"/>
-        </w:rPr>
-        <w:t>[6:8]</w:t>
-      </w:r>
-      <w:r>
-        <w:t xml:space="preserve">) and hunt the </w:t>
-      </w:r>
-      <w:r>
-        <w:rPr>
-          <w:b/>
-        </w:rPr>
-        <w:t>accelerometer</w:t>
-      </w:r>
-      <w:r>
-        <w:t xml:space="preserve"> stream (likely</w:t>
-      </w:r>
-    </w:p>
-    <w:p>
-      <w:r>
-        <w:t xml:space="preserve">another </w:t>
-      </w:r>
-      <w:r>
-        <w:rPr>
-          <w:rFonts w:ascii="Consolas" w:hAnsi="Consolas"/>
-          <w:sz w:val="18"/>
-        </w:rPr>
-        <w:t>0x28</w:t>
-      </w:r>
-      <w:r>
-        <w:t xml:space="preserve"> subtype or the event channel) — needed for gesture control.</w:t>
+        <w:t xml:space="preserve"> field and any SpO₂ / skin-temp subtypes.</w:t>
       </w:r>
     </w:p>
     <w:p>
@@ -4007,15 +4439,31 @@
         <w:pStyle w:val="ListNumber"/>
       </w:pPr>
       <w:r>
-        <w:t>Also decode SpO₂ / skin-temp metrics if they appear as other subtypes.</w:t>
+        <w:t>Port the verified protocol to C++ for the UE5 phase.</w:t>
+      </w:r>
+    </w:p>
+    <w:p>
+      <w:r>
+        <w:rPr>
+          <w:b/>
+        </w:rPr>
+        <w:t>Windows gotchas (keep handy)</w:t>
       </w:r>
     </w:p>
     <w:p>
       <w:pPr>
-        <w:pStyle w:val="ListNumber"/>
+        <w:pStyle w:val="ListBullet"/>
       </w:pPr>
       <w:r>
-        <w:t>Port the verified protocol to C++ for the UE5 phase.</w:t>
+        <w:t>"operation was canceled by the user" / repeated drops → toggle Bluetooth OFF/ON.</w:t>
+      </w:r>
+    </w:p>
+    <w:p>
+      <w:pPr>
+        <w:pStyle w:val="ListBullet"/>
+      </w:pPr>
+      <w:r>
+        <w:t>Tap the band awake immediately before running any script.</w:t>
       </w:r>
     </w:p>
     <w:p>

</xml_diff>

<commit_message>
Document that 0x16 accel is historical (flash dump), not a live BLE stream
Decoded the 0x2f packet timestamp as a real calendar date (2024-09-18), vs
device-uptime ticks on live packets. 0x16 downloads stored history; raw
accelerometer does not appear to stream live over BLE on fw 17.2.2.0 via opcodes
0x01-0x1f. Live signals confirmed: HR+RR (0x28) and EVT(04) events (0x30).
Recorded the finding and the gesture-control fork in the build log; regenerated
PDF/DOCX.

Co-Authored-By: Claude Opus 4.8 <noreply@anthropic.com>
Claude-Session: https://claude.ai/code/session_01PeXJzKdFE3zg9AVZQtc4Pw
</commit_message>
<xml_diff>
--- a/docs/BUILD_LOG_PWT.docx
+++ b/docs/BUILD_LOG_PWT.docx
@@ -1913,15 +1913,161 @@
         <w:rPr>
           <w:b/>
         </w:rPr>
-        <w:t>← You are here.</w:t>
-      </w:r>
-      <w:r>
-        <w:t xml:space="preserve"> Capture LIVE accel while tilting the wrist; build the</w:t>
+        <w:t>Accel from `0x16` is HISTORICAL, not live.</w:t>
+      </w:r>
+      <w:r>
+        <w:t xml:space="preserve"> Those </w:t>
+      </w:r>
+      <w:r>
+        <w:rPr>
+          <w:rFonts w:ascii="Consolas" w:hAnsi="Consolas"/>
+          <w:sz w:val="18"/>
+        </w:rPr>
+        <w:t>0x2f</w:t>
+      </w:r>
+      <w:r>
+        <w:t xml:space="preserve"> packets carry a real</w:t>
       </w:r>
     </w:p>
     <w:p>
       <w:r>
-        <w:t>gesture recogniser on the X/Y/Z stream.</w:t>
+        <w:t xml:space="preserve">calendar timestamp (decoded: 2024-09-18), whereas live packets use device-uptime ticks. Re-running </w:t>
+      </w:r>
+      <w:r>
+        <w:rPr>
+          <w:rFonts w:ascii="Consolas" w:hAnsi="Consolas"/>
+          <w:sz w:val="18"/>
+        </w:rPr>
+        <w:t>0x16</w:t>
+      </w:r>
+      <w:r>
+        <w:t xml:space="preserve"> moving the wrist produced no new accel — </w:t>
+      </w:r>
+      <w:r>
+        <w:rPr>
+          <w:rFonts w:ascii="Consolas" w:hAnsi="Consolas"/>
+          <w:sz w:val="18"/>
+        </w:rPr>
+        <w:t>0x16</w:t>
+      </w:r>
+      <w:r>
+        <w:t xml:space="preserve"> downloads stored flash records. </w:t>
+      </w:r>
+      <w:r>
+        <w:rPr>
+          <w:b/>
+        </w:rPr>
+        <w:t>Conclusion:</w:t>
+      </w:r>
+      <w:r>
+        <w:t xml:space="preserve"> on fw 17.2.2.0, raw accelerometer is recorded to flash and retrieved as history; it does not appear to stream live over BLE via opcodes </w:t>
+      </w:r>
+      <w:r>
+        <w:rPr>
+          <w:rFonts w:ascii="Consolas" w:hAnsi="Consolas"/>
+          <w:sz w:val="18"/>
+        </w:rPr>
+        <w:t>0x01–0x1f</w:t>
+      </w:r>
+      <w:r>
+        <w:t xml:space="preserve">. Confirmed LIVE signals: HR+RR (type </w:t>
+      </w:r>
+      <w:r>
+        <w:rPr>
+          <w:rFonts w:ascii="Consolas" w:hAnsi="Consolas"/>
+          <w:sz w:val="18"/>
+        </w:rPr>
+        <w:t>0x28</w:t>
+      </w:r>
+      <w:r>
+        <w:t xml:space="preserve">, 1 Hz) and discrete events on </w:t>
+      </w:r>
+      <w:r>
+        <w:rPr>
+          <w:rFonts w:ascii="Consolas" w:hAnsi="Consolas"/>
+          <w:sz w:val="18"/>
+        </w:rPr>
+        <w:t>EVT(04)</w:t>
+      </w:r>
+      <w:r>
+        <w:t xml:space="preserve"> (type </w:t>
+      </w:r>
+      <w:r>
+        <w:rPr>
+          <w:rFonts w:ascii="Consolas" w:hAnsi="Consolas"/>
+          <w:sz w:val="18"/>
+        </w:rPr>
+        <w:t>0x30</w:t>
+      </w:r>
+      <w:r>
+        <w:t>).</w:t>
+      </w:r>
+    </w:p>
+    <w:p>
+      <w:pPr>
+        <w:pStyle w:val="ListNumber"/>
+      </w:pPr>
+      <w:r>
+        <w:rPr>
+          <w:b/>
+        </w:rPr>
+        <w:t>← You are here — fork for gesture control:</w:t>
+      </w:r>
+    </w:p>
+    <w:p>
+      <w:pPr>
+        <w:pStyle w:val="ListBullet"/>
+      </w:pPr>
+      <w:r>
+        <w:t xml:space="preserve">(a) Sweep higher opcodes </w:t>
+      </w:r>
+      <w:r>
+        <w:rPr>
+          <w:rFonts w:ascii="Consolas" w:hAnsi="Consolas"/>
+          <w:sz w:val="18"/>
+        </w:rPr>
+        <w:t>0x21–0x2f</w:t>
+      </w:r>
+      <w:r>
+        <w:t xml:space="preserve"> (skip </w:t>
+      </w:r>
+      <w:r>
+        <w:rPr>
+          <w:rFonts w:ascii="Consolas" w:hAnsi="Consolas"/>
+          <w:sz w:val="18"/>
+        </w:rPr>
+        <w:t>0x20</w:t>
+      </w:r>
+      <w:r>
+        <w:t xml:space="preserve"> = firmware) for a possible</w:t>
+      </w:r>
+    </w:p>
+    <w:p>
+      <w:r>
+        <w:t>live-raw / PPG mode we haven't found yet; or</w:t>
+      </w:r>
+    </w:p>
+    <w:p>
+      <w:pPr>
+        <w:pStyle w:val="ListBullet"/>
+      </w:pPr>
+      <w:r>
+        <w:t xml:space="preserve">(b) Build gestures on the LIVE </w:t>
+      </w:r>
+      <w:r>
+        <w:rPr>
+          <w:rFonts w:ascii="Consolas" w:hAnsi="Consolas"/>
+          <w:sz w:val="18"/>
+        </w:rPr>
+        <w:t>EVT(04)</w:t>
+      </w:r>
+      <w:r>
+        <w:t xml:space="preserve"> motion/tap events (and HR), accepting</w:t>
+      </w:r>
+    </w:p>
+    <w:p>
+      <w:r>
+        <w:t>that fine-grained live accel may not be exposed over BLE.</w:t>
       </w:r>
     </w:p>
     <w:p>
@@ -3342,7 +3488,16 @@
         <w:t>debug-log text</w:t>
       </w:r>
       <w:r>
-        <w:t xml:space="preserve"> (ASCII), not sensor data. The </w:t>
+        <w:t xml:space="preserve"> (ASCII), not sensor data. </w:t>
+      </w:r>
+      <w:r>
+        <w:rPr>
+          <w:b/>
+        </w:rPr>
+        <w:t>Important:</w:t>
+      </w:r>
+      <w:r>
+        <w:t xml:space="preserve"> the </w:t>
       </w:r>
       <w:r>
         <w:rPr>
@@ -3352,7 +3507,17 @@
         <w:t>0x16</w:t>
       </w:r>
       <w:r>
-        <w:t xml:space="preserve"> dump is labelled "Historical" — confirming LIVE accel is the next step.</w:t>
+        <w:t xml:space="preserve"> dump is HISTORICAL — these </w:t>
+      </w:r>
+      <w:r>
+        <w:rPr>
+          <w:rFonts w:ascii="Consolas" w:hAnsi="Consolas"/>
+          <w:sz w:val="18"/>
+        </w:rPr>
+        <w:t>0x2f</w:t>
+      </w:r>
+      <w:r>
+        <w:t xml:space="preserve"> packets carry a real calendar timestamp (2024-09-18), so the accel values are stored flash records, not a live feed. Live raw accel has not been found over BLE on this firmware (opcodes 0x01–0x1f); see §9 for the gesture-control fork.</w:t>
       </w:r>
     </w:p>
     <w:p>

</xml_diff>

<commit_message>
No live accel in 0x01-0x2f; add live EVENT capture tool for gestures
Sweep of 0x21-0x2f returned only baseline HR — confirming raw accelerometer is
not a live BLE stream on fw 17.2.2.0 (history-only). Pivot to discrete live
events:
- whoop_protocol_PWT.py: add EVENT_PACKET_TYPE 0x30 + parse_event() (seq, report
  id, uptime ts, body + int16 view).
- ble_events_PWT.py: stable session (HR on + battery keepalive, reconnect loop),
  decodes EVT(04) events live and logs them tagged by gesture --label.
- docs/BUILD_LOG_PWT.md: record the conclusive no-live-accel finding, the design
  implication for active-hold, the new tool, and the labeled-capture plan.
  Regenerated PDF/DOCX.

Co-Authored-By: Claude Opus 4.8 <noreply@anthropic.com>
Claude-Session: https://claude.ai/code/session_01PeXJzKdFE3zg9AVZQtc4Pw
</commit_message>
<xml_diff>
--- a/docs/BUILD_LOG_PWT.docx
+++ b/docs/BUILD_LOG_PWT.docx
@@ -929,6 +929,42 @@
                 <w:rFonts w:ascii="Consolas" w:hAnsi="Consolas"/>
                 <w:sz w:val="18"/>
               </w:rPr>
+              <w:t>ble_events_PWT.py</w:t>
+            </w:r>
+          </w:p>
+        </w:tc>
+        <w:tc>
+          <w:tcPr>
+            <w:tcW w:type="dxa" w:w="4320"/>
+          </w:tcPr>
+          <w:p>
+            <w:r>
+              <w:t xml:space="preserve">Capture &amp; decode live </w:t>
+            </w:r>
+            <w:r>
+              <w:rPr>
+                <w:rFonts w:ascii="Consolas" w:hAnsi="Consolas"/>
+                <w:sz w:val="18"/>
+              </w:rPr>
+              <w:t>EVT(04)</w:t>
+            </w:r>
+            <w:r>
+              <w:t xml:space="preserve"> events, tagged by gesture label.</w:t>
+            </w:r>
+          </w:p>
+        </w:tc>
+      </w:tr>
+      <w:tr>
+        <w:tc>
+          <w:tcPr>
+            <w:tcW w:type="dxa" w:w="4320"/>
+          </w:tcPr>
+          <w:p>
+            <w:r>
+              <w:rPr>
+                <w:rFonts w:ascii="Consolas" w:hAnsi="Consolas"/>
+                <w:sz w:val="18"/>
+              </w:rPr>
               <w:t>decode_realtime_PWT.py</w:t>
             </w:r>
           </w:p>
@@ -2011,48 +2047,64 @@
         <w:rPr>
           <w:b/>
         </w:rPr>
-        <w:t>← You are here — fork for gesture control:</w:t>
+        <w:t>Swept `0x21–0x2f` (skipping `0x20` firmware) — no live accel.</w:t>
+      </w:r>
+      <w:r>
+        <w:t xml:space="preserve"> Every opcode</w:t>
       </w:r>
     </w:p>
     <w:p>
-      <w:pPr>
-        <w:pStyle w:val="ListBullet"/>
-      </w:pPr>
-      <w:r>
-        <w:t xml:space="preserve">(a) Sweep higher opcodes </w:t>
+      <w:r>
+        <w:t xml:space="preserve">returned only the baseline HR stream (type </w:t>
       </w:r>
       <w:r>
         <w:rPr>
           <w:rFonts w:ascii="Consolas" w:hAnsi="Consolas"/>
           <w:sz w:val="18"/>
         </w:rPr>
-        <w:t>0x21–0x2f</w:t>
-      </w:r>
-      <w:r>
-        <w:t xml:space="preserve"> (skip </w:t>
+        <w:t>0x28</w:t>
+      </w:r>
+      <w:r>
+        <w:t xml:space="preserve">); no </w:t>
       </w:r>
       <w:r>
         <w:rPr>
           <w:rFonts w:ascii="Consolas" w:hAnsi="Consolas"/>
           <w:sz w:val="18"/>
         </w:rPr>
-        <w:t>0x20</w:t>
-      </w:r>
-      <w:r>
-        <w:t xml:space="preserve"> = firmware) for a possible</w:t>
-      </w:r>
-    </w:p>
-    <w:p>
-      <w:r>
-        <w:t>live-raw / PPG mode we haven't found yet; or</w:t>
-      </w:r>
-    </w:p>
-    <w:p>
-      <w:pPr>
-        <w:pStyle w:val="ListBullet"/>
-      </w:pPr>
-      <w:r>
-        <w:t xml:space="preserve">(b) Build gestures on the LIVE </w:t>
+        <w:t>0x2f</w:t>
+      </w:r>
+      <w:r>
+        <w:t xml:space="preserve">, no new subtype, no rate jump. </w:t>
+      </w:r>
+      <w:r>
+        <w:rPr>
+          <w:b/>
+        </w:rPr>
+        <w:t>CONCLUSION (firmware 17.2.2.0): raw accelerometer is NOT exposed as a live BLE stream anywhere in opcodes `0x01–0x2f`.</w:t>
+      </w:r>
+      <w:r>
+        <w:t xml:space="preserve"> It exists only as historical flash records (via </w:t>
+      </w:r>
+      <w:r>
+        <w:rPr>
+          <w:rFonts w:ascii="Consolas" w:hAnsi="Consolas"/>
+          <w:sz w:val="18"/>
+        </w:rPr>
+        <w:t>0x16</w:t>
+      </w:r>
+      <w:r>
+        <w:t>). Live BLE signals available: HR+RR (</w:t>
+      </w:r>
+      <w:r>
+        <w:rPr>
+          <w:rFonts w:ascii="Consolas" w:hAnsi="Consolas"/>
+          <w:sz w:val="18"/>
+        </w:rPr>
+        <w:t>0x28</w:t>
+      </w:r>
+      <w:r>
+        <w:t xml:space="preserve">, 1 Hz) and discrete events on </w:t>
       </w:r>
       <w:r>
         <w:rPr>
@@ -2062,12 +2114,85 @@
         <w:t>EVT(04)</w:t>
       </w:r>
       <w:r>
-        <w:t xml:space="preserve"> motion/tap events (and HR), accepting</w:t>
+        <w:t xml:space="preserve"> (</w:t>
+      </w:r>
+      <w:r>
+        <w:rPr>
+          <w:rFonts w:ascii="Consolas" w:hAnsi="Consolas"/>
+          <w:sz w:val="18"/>
+        </w:rPr>
+        <w:t>0x30</w:t>
+      </w:r>
+      <w:r>
+        <w:t>).</w:t>
       </w:r>
     </w:p>
     <w:p>
-      <w:r>
-        <w:t>that fine-grained live accel may not be exposed over BLE.</w:t>
+      <w:pPr>
+        <w:pStyle w:val="ListNumber"/>
+      </w:pPr>
+      <w:r>
+        <w:rPr>
+          <w:b/>
+        </w:rPr>
+        <w:t>Design implication:</w:t>
+      </w:r>
+      <w:r>
+        <w:t xml:space="preserve"> a smooth continuous "active-hold" wrist gesture isn't</w:t>
+      </w:r>
+    </w:p>
+    <w:p>
+      <w:r>
+        <w:t xml:space="preserve">possible from the band alone over BLE (no live orientation stream). Discrete gestures (tap / double-tap / motion triggers) via </w:t>
+      </w:r>
+      <w:r>
+        <w:rPr>
+          <w:rFonts w:ascii="Consolas" w:hAnsi="Consolas"/>
+          <w:sz w:val="18"/>
+        </w:rPr>
+        <w:t>EVT(04)</w:t>
+      </w:r>
+      <w:r>
+        <w:t xml:space="preserve"> are, plus live HR.</w:t>
+      </w:r>
+    </w:p>
+    <w:p>
+      <w:pPr>
+        <w:pStyle w:val="ListNumber"/>
+      </w:pPr>
+      <w:r>
+        <w:rPr>
+          <w:b/>
+        </w:rPr>
+        <w:t>← You are here — path (b):</w:t>
+      </w:r>
+      <w:r>
+        <w:t xml:space="preserve"> decode the live </w:t>
+      </w:r>
+      <w:r>
+        <w:rPr>
+          <w:rFonts w:ascii="Consolas" w:hAnsi="Consolas"/>
+          <w:sz w:val="18"/>
+        </w:rPr>
+        <w:t>EVT(04)</w:t>
+      </w:r>
+      <w:r>
+        <w:t xml:space="preserve"> events (</w:t>
+      </w:r>
+      <w:r>
+        <w:rPr>
+          <w:rFonts w:ascii="Consolas" w:hAnsi="Consolas"/>
+          <w:sz w:val="18"/>
+        </w:rPr>
+        <w:t>ble_events_PWT.py</w:t>
+      </w:r>
+      <w:r>
+        <w:t>)</w:t>
+      </w:r>
+    </w:p>
+    <w:p>
+      <w:r>
+        <w:t>with labeled gesture captures, and build a discrete-gesture recogniser.</w:t>
       </w:r>
     </w:p>
     <w:p>
@@ -4506,6 +4631,37 @@
         <w:rPr>
           <w:b/>
         </w:rPr>
+        <w:t>Finding:</w:t>
+      </w:r>
+      <w:r>
+        <w:t xml:space="preserve"> live raw accel is NOT available over BLE (swept </w:t>
+      </w:r>
+      <w:r>
+        <w:rPr>
+          <w:rFonts w:ascii="Consolas" w:hAnsi="Consolas"/>
+          <w:sz w:val="18"/>
+        </w:rPr>
+        <w:t>0x01–0x2f</w:t>
+      </w:r>
+      <w:r>
+        <w:t xml:space="preserve">). Accel is historical-only. So gesture control uses the live </w:t>
+      </w:r>
+      <w:r>
+        <w:rPr>
+          <w:rFonts w:ascii="Consolas" w:hAnsi="Consolas"/>
+          <w:sz w:val="18"/>
+        </w:rPr>
+        <w:t>EVT(04)</w:t>
+      </w:r>
+      <w:r>
+        <w:t xml:space="preserve"> events + HR.</w:t>
+      </w:r>
+    </w:p>
+    <w:p>
+      <w:r>
+        <w:rPr>
+          <w:b/>
+        </w:rPr>
         <w:t>Next</w:t>
       </w:r>
     </w:p>
@@ -4517,10 +4673,15 @@
         <w:rPr>
           <w:b/>
         </w:rPr>
-        <w:t>Confirm LIVE accel while moving</w:t>
-      </w:r>
-      <w:r>
-        <w:t xml:space="preserve"> (tap the band awake first):</w:t>
+        <w:t>Capture labeled gestures</w:t>
+      </w:r>
+      <w:r>
+        <w:t xml:space="preserve"> (tap the band awake first; one gesture per run,</w:t>
+      </w:r>
+    </w:p>
+    <w:p>
+      <w:r>
+        <w:t>repeat it the whole window):</w:t>
       </w:r>
     </w:p>
     <w:p>
@@ -4530,32 +4691,30 @@
           <w:color w:val="2A2A2A"/>
           <w:sz w:val="18"/>
         </w:rPr>
-        <w:t xml:space="preserve">   python ble_accel_PWT.py &lt;ADDRESS&gt; --start-data 01 --extra-cmd 0x16 --label tilt</w:t>
+        <w:t xml:space="preserve">   python ble_events_PWT.py &lt;ADDRESS&gt; --label still     --seconds 20</w:t>
+        <w:br/>
+        <w:t xml:space="preserve">   python ble_events_PWT.py &lt;ADDRESS&gt; --label tap       --seconds 20</w:t>
+        <w:br/>
+        <w:t xml:space="preserve">   python ble_events_PWT.py &lt;ADDRESS&gt; --label doubletap --seconds 20</w:t>
+        <w:br/>
+        <w:t xml:space="preserve">   python ble_events_PWT.py &lt;ADDRESS&gt; --label flick     --seconds 20</w:t>
+        <w:br/>
+        <w:t xml:space="preserve">   python ble_events_PWT.py &lt;ADDRESS&gt; --label raise     --seconds 20</w:t>
       </w:r>
     </w:p>
     <w:p>
       <w:r>
-        <w:t xml:space="preserve">Tilt the wrist slowly; </w:t>
+        <w:t xml:space="preserve">Send Claude the </w:t>
       </w:r>
       <w:r>
         <w:rPr>
           <w:rFonts w:ascii="Consolas" w:hAnsi="Consolas"/>
           <w:sz w:val="18"/>
         </w:rPr>
-        <w:t>[ACCEL] x/y/z |g|</w:t>
-      </w:r>
-      <w:r>
-        <w:t xml:space="preserve"> lines should track gravity. If the values only replay stored data and stop, try </w:t>
-      </w:r>
-      <w:r>
-        <w:rPr>
-          <w:rFonts w:ascii="Consolas" w:hAnsi="Consolas"/>
-          <w:sz w:val="18"/>
-        </w:rPr>
-        <w:t>--extra-cmd 0x13</w:t>
-      </w:r>
-      <w:r>
-        <w:t xml:space="preserve"> (continuous).</w:t>
+        <w:t>logs\events_*.jsonl</w:t>
+      </w:r>
+      <w:r>
+        <w:t xml:space="preserve"> files; we diff report-ids/fields per gesture.</w:t>
       </w:r>
     </w:p>
     <w:p>
@@ -4563,22 +4722,7 @@
         <w:pStyle w:val="ListNumber"/>
       </w:pPr>
       <w:r>
-        <w:t xml:space="preserve">Once LIVE accel is confirmed, build </w:t>
-      </w:r>
-      <w:r>
-        <w:rPr>
-          <w:rFonts w:ascii="Consolas" w:hAnsi="Consolas"/>
-          <w:sz w:val="18"/>
-        </w:rPr>
-        <w:t>decode_accel_PWT.py</w:t>
-      </w:r>
-      <w:r>
-        <w:t xml:space="preserve"> + a simple gesture</w:t>
-      </w:r>
-    </w:p>
-    <w:p>
-      <w:r>
-        <w:t>recogniser (tilt / flick / hold) on the X/Y/Z stream.</w:t>
+        <w:t>Build a discrete-gesture recogniser from the distinguishing event(s).</w:t>
       </w:r>
     </w:p>
     <w:p>
@@ -4596,7 +4740,17 @@
         <w:t>aux</w:t>
       </w:r>
       <w:r>
-        <w:t xml:space="preserve"> field and any SpO₂ / skin-temp subtypes.</w:t>
+        <w:t xml:space="preserve"> field; decode historical accel (</w:t>
+      </w:r>
+      <w:r>
+        <w:rPr>
+          <w:rFonts w:ascii="Consolas" w:hAnsi="Consolas"/>
+          <w:sz w:val="18"/>
+        </w:rPr>
+        <w:t>0x2f</w:t>
+      </w:r>
+      <w:r>
+        <w:t>) for offline analysis.</w:t>
       </w:r>
     </w:p>
     <w:p>

</xml_diff>

<commit_message>
Characterize live events (0x0e = tap/flick) and add live gesture recogniser
Labeled captures show report id 0x0e is the impulse/tap/flick event (fires on
sharp motion, ignores slow/large motion); 0x21 is a session-status event; 0x03/
0x3f are occasional activity reports. The only live motion signal is impulse
detection, not continuous orientation.

- gesture_PWT.py: live recogniser clustering 0x0e impulses -> TAP / DOUBLE_TAP /
  FLICK, with a stable session + reconnect and on-screen output.
- ble_events_PWT.py: raw docstring (fix \e SyntaxWarning).
- docs/BUILD_LOG_PWT.md: §6.9 live-events table, step log, new tool, next steps.
  Regenerated PDF/DOCX.

Co-Authored-By: Claude Opus 4.8 <noreply@anthropic.com>
Claude-Session: https://claude.ai/code/session_01PeXJzKdFE3zg9AVZQtc4Pw
</commit_message>
<xml_diff>
--- a/docs/BUILD_LOG_PWT.docx
+++ b/docs/BUILD_LOG_PWT.docx
@@ -965,6 +965,48 @@
                 <w:rFonts w:ascii="Consolas" w:hAnsi="Consolas"/>
                 <w:sz w:val="18"/>
               </w:rPr>
+              <w:t>gesture_PWT.py</w:t>
+            </w:r>
+          </w:p>
+        </w:tc>
+        <w:tc>
+          <w:tcPr>
+            <w:tcW w:type="dxa" w:w="4320"/>
+          </w:tcPr>
+          <w:p>
+            <w:r>
+              <w:rPr>
+                <w:b/>
+              </w:rPr>
+              <w:t>Live gesture recognition</w:t>
+            </w:r>
+            <w:r>
+              <w:t xml:space="preserve"> — TAP / DOUBLE_TAP / FLICK from </w:t>
+            </w:r>
+            <w:r>
+              <w:rPr>
+                <w:rFonts w:ascii="Consolas" w:hAnsi="Consolas"/>
+                <w:sz w:val="18"/>
+              </w:rPr>
+              <w:t>0x0e</w:t>
+            </w:r>
+            <w:r>
+              <w:t xml:space="preserve"> impulses.</w:t>
+            </w:r>
+          </w:p>
+        </w:tc>
+      </w:tr>
+      <w:tr>
+        <w:tc>
+          <w:tcPr>
+            <w:tcW w:type="dxa" w:w="4320"/>
+          </w:tcPr>
+          <w:p>
+            <w:r>
+              <w:rPr>
+                <w:rFonts w:ascii="Consolas" w:hAnsi="Consolas"/>
+                <w:sz w:val="18"/>
+              </w:rPr>
               <w:t>decode_realtime_PWT.py</w:t>
             </w:r>
           </w:p>
@@ -2164,20 +2206,10 @@
         <w:rPr>
           <w:b/>
         </w:rPr>
-        <w:t>← You are here — path (b):</w:t>
-      </w:r>
-      <w:r>
-        <w:t xml:space="preserve"> decode the live </w:t>
-      </w:r>
-      <w:r>
-        <w:rPr>
-          <w:rFonts w:ascii="Consolas" w:hAnsi="Consolas"/>
-          <w:sz w:val="18"/>
-        </w:rPr>
-        <w:t>EVT(04)</w:t>
-      </w:r>
-      <w:r>
-        <w:t xml:space="preserve"> events (</w:t>
+        <w:t>Live events characterized (labeled captures).</w:t>
+      </w:r>
+      <w:r>
+        <w:t xml:space="preserve"> Ran </w:t>
       </w:r>
       <w:r>
         <w:rPr>
@@ -2187,12 +2219,177 @@
         <w:t>ble_events_PWT.py</w:t>
       </w:r>
       <w:r>
-        <w:t>)</w:t>
+        <w:t xml:space="preserve"> for</w:t>
       </w:r>
     </w:p>
     <w:p>
       <w:r>
-        <w:t>with labeled gesture captures, and build a discrete-gesture recogniser.</w:t>
+        <w:t>still / tap / doubletap / flick / raise / armswing. Result:</w:t>
+      </w:r>
+    </w:p>
+    <w:p>
+      <w:pPr>
+        <w:pStyle w:val="ListBullet"/>
+      </w:pPr>
+      <w:r>
+        <w:rPr>
+          <w:rFonts w:ascii="Consolas" w:hAnsi="Consolas"/>
+          <w:sz w:val="18"/>
+        </w:rPr>
+        <w:t>0x0e</w:t>
+      </w:r>
+      <w:r>
+        <w:t xml:space="preserve"> = </w:t>
+      </w:r>
+      <w:r>
+        <w:rPr>
+          <w:b/>
+        </w:rPr>
+        <w:t>impulse event</w:t>
+      </w:r>
+      <w:r>
+        <w:t xml:space="preserve"> (sharp motion): still=0, tap=5, doubletap=6,</w:t>
+      </w:r>
+    </w:p>
+    <w:p>
+      <w:r>
+        <w:t xml:space="preserve">flick=9, raise=0, armswing=0. It fires on taps/flicks and </w:t>
+      </w:r>
+      <w:r>
+        <w:rPr>
+          <w:b/>
+        </w:rPr>
+        <w:t>ignores slow or large motion</w:t>
+      </w:r>
+      <w:r>
+        <w:t xml:space="preserve"> — slow raise and vigorous armswing produced *zero* </w:t>
+      </w:r>
+      <w:r>
+        <w:rPr>
+          <w:rFonts w:ascii="Consolas" w:hAnsi="Consolas"/>
+          <w:sz w:val="18"/>
+        </w:rPr>
+        <w:t>0x0e</w:t>
+      </w:r>
+      <w:r>
+        <w:t xml:space="preserve"> (only HR rose). Green LED = tap registered; taps need to be sharp, flicks are the most reliable primitive.</w:t>
+      </w:r>
+    </w:p>
+    <w:p>
+      <w:pPr>
+        <w:pStyle w:val="ListBullet"/>
+      </w:pPr>
+      <w:r>
+        <w:rPr>
+          <w:rFonts w:ascii="Consolas" w:hAnsi="Consolas"/>
+          <w:sz w:val="18"/>
+        </w:rPr>
+        <w:t>0x21</w:t>
+      </w:r>
+      <w:r>
+        <w:t xml:space="preserve"> = once-per-session status/startup event (not a gesture).</w:t>
+      </w:r>
+    </w:p>
+    <w:p>
+      <w:pPr>
+        <w:pStyle w:val="ListBullet"/>
+      </w:pPr>
+      <w:r>
+        <w:rPr>
+          <w:rFonts w:ascii="Consolas" w:hAnsi="Consolas"/>
+          <w:sz w:val="18"/>
+        </w:rPr>
+        <w:t>0x03</w:t>
+      </w:r>
+      <w:r>
+        <w:t xml:space="preserve"> / </w:t>
+      </w:r>
+      <w:r>
+        <w:rPr>
+          <w:rFonts w:ascii="Consolas" w:hAnsi="Consolas"/>
+          <w:sz w:val="18"/>
+        </w:rPr>
+        <w:t>0x3f</w:t>
+      </w:r>
+      <w:r>
+        <w:t xml:space="preserve"> = occasional richer "activity report" events (multi-field).</w:t>
+      </w:r>
+    </w:p>
+    <w:p>
+      <w:pPr>
+        <w:pStyle w:val="ListBullet"/>
+      </w:pPr>
+      <w:r>
+        <w:t xml:space="preserve">Confirms: the only live motion signal is </w:t>
+      </w:r>
+      <w:r>
+        <w:rPr>
+          <w:b/>
+        </w:rPr>
+        <w:t>impulse detection</w:t>
+      </w:r>
+      <w:r>
+        <w:t>, not continuous</w:t>
+      </w:r>
+    </w:p>
+    <w:p>
+      <w:r>
+        <w:t>orientation.</w:t>
+      </w:r>
+    </w:p>
+    <w:p>
+      <w:pPr>
+        <w:pStyle w:val="ListNumber"/>
+      </w:pPr>
+      <w:r>
+        <w:rPr>
+          <w:b/>
+        </w:rPr>
+        <w:t>Built the live gesture recogniser</w:t>
+      </w:r>
+      <w:r>
+        <w:t xml:space="preserve"> (</w:t>
+      </w:r>
+      <w:r>
+        <w:rPr>
+          <w:rFonts w:ascii="Consolas" w:hAnsi="Consolas"/>
+          <w:sz w:val="18"/>
+        </w:rPr>
+        <w:t>gesture_PWT.py</w:t>
+      </w:r>
+      <w:r>
+        <w:t xml:space="preserve">): clusters </w:t>
+      </w:r>
+      <w:r>
+        <w:rPr>
+          <w:rFonts w:ascii="Consolas" w:hAnsi="Consolas"/>
+          <w:sz w:val="18"/>
+        </w:rPr>
+        <w:t>0x0e</w:t>
+      </w:r>
+    </w:p>
+    <w:p>
+      <w:r>
+        <w:t>impulses in time → TAP (1) / DOUBLE_TAP (2) / FLICK (≥3), with on-screen output and a stable session. This is the L2 discrete-gesture engine.</w:t>
+      </w:r>
+    </w:p>
+    <w:p>
+      <w:pPr>
+        <w:pStyle w:val="ListNumber"/>
+      </w:pPr>
+      <w:r>
+        <w:rPr>
+          <w:b/>
+        </w:rPr>
+        <w:t>← You are here.</w:t>
+      </w:r>
+      <w:r>
+        <w:t xml:space="preserve"> Tune the recogniser on-wrist (gap/flick thresholds), then</w:t>
+      </w:r>
+    </w:p>
+    <w:p>
+      <w:r>
+        <w:t>build the L3 safety state machine on TAP=arm / FLICK=confirm (or similar).</w:t>
       </w:r>
     </w:p>
     <w:p>
@@ -3646,6 +3843,319 @@
       </w:r>
     </w:p>
     <w:p>
+      <w:pPr>
+        <w:pStyle w:val="Heading2"/>
+      </w:pPr>
+      <w:r>
+        <w:t>6.9 Live events — type `0x30` on `EVENT_CHAR` (`61080004`)</w:t>
+      </w:r>
+    </w:p>
+    <w:p>
+      <w:r>
+        <w:t xml:space="preserve">Discrete events. Layout: </w:t>
+      </w:r>
+      <w:r>
+        <w:rPr>
+          <w:rFonts w:ascii="Consolas" w:hAnsi="Consolas"/>
+          <w:sz w:val="18"/>
+        </w:rPr>
+        <w:t>[0]</w:t>
+      </w:r>
+      <w:r>
+        <w:t xml:space="preserve">=type </w:t>
+      </w:r>
+      <w:r>
+        <w:rPr>
+          <w:rFonts w:ascii="Consolas" w:hAnsi="Consolas"/>
+          <w:sz w:val="18"/>
+        </w:rPr>
+        <w:t>0x30</w:t>
+      </w:r>
+      <w:r>
+        <w:t xml:space="preserve">, </w:t>
+      </w:r>
+      <w:r>
+        <w:rPr>
+          <w:rFonts w:ascii="Consolas" w:hAnsi="Consolas"/>
+          <w:sz w:val="18"/>
+        </w:rPr>
+        <w:t>[1]</w:t>
+      </w:r>
+      <w:r>
+        <w:t xml:space="preserve">=seq, </w:t>
+      </w:r>
+      <w:r>
+        <w:rPr>
+          <w:rFonts w:ascii="Consolas" w:hAnsi="Consolas"/>
+          <w:sz w:val="18"/>
+        </w:rPr>
+        <w:t>[2]</w:t>
+      </w:r>
+      <w:r>
+        <w:t>=</w:t>
+      </w:r>
+      <w:r>
+        <w:rPr>
+          <w:b/>
+        </w:rPr>
+        <w:t>report id</w:t>
+      </w:r>
+      <w:r>
+        <w:t xml:space="preserve">, </w:t>
+      </w:r>
+      <w:r>
+        <w:rPr>
+          <w:rFonts w:ascii="Consolas" w:hAnsi="Consolas"/>
+          <w:sz w:val="18"/>
+        </w:rPr>
+        <w:t>[3]</w:t>
+      </w:r>
+      <w:r>
+        <w:t xml:space="preserve">=0, </w:t>
+      </w:r>
+      <w:r>
+        <w:rPr>
+          <w:rFonts w:ascii="Consolas" w:hAnsi="Consolas"/>
+          <w:sz w:val="18"/>
+        </w:rPr>
+        <w:t>[4:8]</w:t>
+      </w:r>
+      <w:r>
+        <w:t xml:space="preserve">=uptime ts, </w:t>
+      </w:r>
+      <w:r>
+        <w:rPr>
+          <w:rFonts w:ascii="Consolas" w:hAnsi="Consolas"/>
+          <w:sz w:val="18"/>
+        </w:rPr>
+        <w:t>[8:]</w:t>
+      </w:r>
+      <w:r>
+        <w:t>=body. Report ids observed, from labeled captures:</w:t>
+      </w:r>
+    </w:p>
+    <w:tbl>
+      <w:tblPr>
+        <w:tblStyle w:val="LightGrid-Accent1"/>
+        <w:tblW w:type="auto" w:w="0"/>
+        <w:tblLook w:firstColumn="1" w:firstRow="1" w:lastColumn="0" w:lastRow="0" w:noHBand="0" w:noVBand="1" w:val="04A0"/>
+      </w:tblPr>
+      <w:tblGrid>
+        <w:gridCol w:w="2880"/>
+        <w:gridCol w:w="2880"/>
+        <w:gridCol w:w="2880"/>
+      </w:tblGrid>
+      <w:tr>
+        <w:tc>
+          <w:tcPr>
+            <w:tcW w:type="dxa" w:w="2880"/>
+          </w:tcPr>
+          <w:p>
+            <w:r>
+              <w:rPr>
+                <w:b/>
+              </w:rPr>
+              <w:t>Report id</w:t>
+            </w:r>
+          </w:p>
+        </w:tc>
+        <w:tc>
+          <w:tcPr>
+            <w:tcW w:type="dxa" w:w="2880"/>
+          </w:tcPr>
+          <w:p>
+            <w:r>
+              <w:rPr>
+                <w:b/>
+              </w:rPr>
+              <w:t>Meaning</w:t>
+            </w:r>
+          </w:p>
+        </w:tc>
+        <w:tc>
+          <w:tcPr>
+            <w:tcW w:type="dxa" w:w="2880"/>
+          </w:tcPr>
+          <w:p>
+            <w:r>
+              <w:rPr>
+                <w:b/>
+              </w:rPr>
+              <w:t>Fires on</w:t>
+            </w:r>
+          </w:p>
+        </w:tc>
+      </w:tr>
+      <w:tr>
+        <w:tc>
+          <w:tcPr>
+            <w:tcW w:type="dxa" w:w="2880"/>
+          </w:tcPr>
+          <w:p>
+            <w:r>
+              <w:rPr>
+                <w:rFonts w:ascii="Consolas" w:hAnsi="Consolas"/>
+                <w:sz w:val="18"/>
+              </w:rPr>
+              <w:t>0x0e</w:t>
+            </w:r>
+          </w:p>
+        </w:tc>
+        <w:tc>
+          <w:tcPr>
+            <w:tcW w:type="dxa" w:w="2880"/>
+          </w:tcPr>
+          <w:p>
+            <w:r>
+              <w:rPr>
+                <w:b/>
+              </w:rPr>
+              <w:t>Impulse</w:t>
+            </w:r>
+            <w:r>
+              <w:t xml:space="preserve"> (tap / flick) — the gesture primitive</w:t>
+            </w:r>
+          </w:p>
+        </w:tc>
+        <w:tc>
+          <w:tcPr>
+            <w:tcW w:type="dxa" w:w="2880"/>
+          </w:tcPr>
+          <w:p>
+            <w:r>
+              <w:t>sharp wrist motion only</w:t>
+            </w:r>
+          </w:p>
+        </w:tc>
+      </w:tr>
+      <w:tr>
+        <w:tc>
+          <w:tcPr>
+            <w:tcW w:type="dxa" w:w="2880"/>
+          </w:tcPr>
+          <w:p>
+            <w:r>
+              <w:rPr>
+                <w:rFonts w:ascii="Consolas" w:hAnsi="Consolas"/>
+                <w:sz w:val="18"/>
+              </w:rPr>
+              <w:t>0x21</w:t>
+            </w:r>
+          </w:p>
+        </w:tc>
+        <w:tc>
+          <w:tcPr>
+            <w:tcW w:type="dxa" w:w="2880"/>
+          </w:tcPr>
+          <w:p>
+            <w:r>
+              <w:t>Session status / startup</w:t>
+            </w:r>
+          </w:p>
+        </w:tc>
+        <w:tc>
+          <w:tcPr>
+            <w:tcW w:type="dxa" w:w="2880"/>
+          </w:tcPr>
+          <w:p>
+            <w:r>
+              <w:t>once on connect</w:t>
+            </w:r>
+          </w:p>
+        </w:tc>
+      </w:tr>
+      <w:tr>
+        <w:tc>
+          <w:tcPr>
+            <w:tcW w:type="dxa" w:w="2880"/>
+          </w:tcPr>
+          <w:p>
+            <w:r>
+              <w:rPr>
+                <w:rFonts w:ascii="Consolas" w:hAnsi="Consolas"/>
+                <w:sz w:val="18"/>
+              </w:rPr>
+              <w:t>0x03</w:t>
+            </w:r>
+            <w:r>
+              <w:t xml:space="preserve">, </w:t>
+            </w:r>
+            <w:r>
+              <w:rPr>
+                <w:rFonts w:ascii="Consolas" w:hAnsi="Consolas"/>
+                <w:sz w:val="18"/>
+              </w:rPr>
+              <w:t>0x3f</w:t>
+            </w:r>
+          </w:p>
+        </w:tc>
+        <w:tc>
+          <w:tcPr>
+            <w:tcW w:type="dxa" w:w="2880"/>
+          </w:tcPr>
+          <w:p>
+            <w:r>
+              <w:t>Activity report (multi-field body)</w:t>
+            </w:r>
+          </w:p>
+        </w:tc>
+        <w:tc>
+          <w:tcPr>
+            <w:tcW w:type="dxa" w:w="2880"/>
+          </w:tcPr>
+          <w:p>
+            <w:r>
+              <w:t>occasionally during motion</w:t>
+            </w:r>
+          </w:p>
+        </w:tc>
+      </w:tr>
+    </w:tbl>
+    <w:p>
+      <w:r>
+        <w:t xml:space="preserve">Key behaviour: </w:t>
+      </w:r>
+      <w:r>
+        <w:rPr>
+          <w:b/>
+        </w:rPr>
+        <w:t>slow or large motion produces no event</w:t>
+      </w:r>
+      <w:r>
+        <w:t xml:space="preserve"> (a slow arm-raise and a vigorous arm-swing both yielded zero </w:t>
+      </w:r>
+      <w:r>
+        <w:rPr>
+          <w:rFonts w:ascii="Consolas" w:hAnsi="Consolas"/>
+          <w:sz w:val="18"/>
+        </w:rPr>
+        <w:t>0x0e</w:t>
+      </w:r>
+      <w:r>
+        <w:t xml:space="preserve"> — only heart rate rose). So the band's only live motion signal is impulse detection. Gesture vocabulary is built by clustering </w:t>
+      </w:r>
+      <w:r>
+        <w:rPr>
+          <w:rFonts w:ascii="Consolas" w:hAnsi="Consolas"/>
+          <w:sz w:val="18"/>
+        </w:rPr>
+        <w:t>0x0e</w:t>
+      </w:r>
+      <w:r>
+        <w:t xml:space="preserve"> in time (</w:t>
+      </w:r>
+      <w:r>
+        <w:rPr>
+          <w:rFonts w:ascii="Consolas" w:hAnsi="Consolas"/>
+          <w:sz w:val="18"/>
+        </w:rPr>
+        <w:t>gesture_PWT.py</w:t>
+      </w:r>
+      <w:r>
+        <w:t>): 1 → TAP, 2 → DOUBLE_TAP, ≥3 → FLICK.</w:t>
+      </w:r>
+    </w:p>
+    <w:p>
       <w:r>
         <w:t xml:space="preserve">Captured </w:t>
       </w:r>
@@ -4662,6 +5172,37 @@
         <w:rPr>
           <w:b/>
         </w:rPr>
+        <w:t>Done (new):</w:t>
+      </w:r>
+      <w:r>
+        <w:t xml:space="preserve"> live events characterized (</w:t>
+      </w:r>
+      <w:r>
+        <w:rPr>
+          <w:rFonts w:ascii="Consolas" w:hAnsi="Consolas"/>
+          <w:sz w:val="18"/>
+        </w:rPr>
+        <w:t>0x0e</w:t>
+      </w:r>
+      <w:r>
+        <w:t xml:space="preserve"> = tap/flick impulse) and a live gesture recogniser built (</w:t>
+      </w:r>
+      <w:r>
+        <w:rPr>
+          <w:rFonts w:ascii="Consolas" w:hAnsi="Consolas"/>
+          <w:sz w:val="18"/>
+        </w:rPr>
+        <w:t>gesture_PWT.py</w:t>
+      </w:r>
+      <w:r>
+        <w:t>: TAP / DOUBLE_TAP / FLICK).</w:t>
+      </w:r>
+    </w:p>
+    <w:p>
+      <w:r>
+        <w:rPr>
+          <w:b/>
+        </w:rPr>
         <w:t>Next</w:t>
       </w:r>
     </w:p>
@@ -4673,15 +5214,10 @@
         <w:rPr>
           <w:b/>
         </w:rPr>
-        <w:t>Capture labeled gestures</w:t>
-      </w:r>
-      <w:r>
-        <w:t xml:space="preserve"> (tap the band awake first; one gesture per run,</w:t>
-      </w:r>
-    </w:p>
-    <w:p>
-      <w:r>
-        <w:t>repeat it the whole window):</w:t>
+        <w:t>Tune the recogniser on-wrist</w:t>
+      </w:r>
+      <w:r>
+        <w:t xml:space="preserve"> (tap the band awake first):</w:t>
       </w:r>
     </w:p>
     <w:p>
@@ -4691,20 +5227,32 @@
           <w:color w:val="2A2A2A"/>
           <w:sz w:val="18"/>
         </w:rPr>
-        <w:t xml:space="preserve">   python ble_events_PWT.py &lt;ADDRESS&gt; --label still     --seconds 20</w:t>
-        <w:br/>
-        <w:t xml:space="preserve">   python ble_events_PWT.py &lt;ADDRESS&gt; --label tap       --seconds 20</w:t>
-        <w:br/>
-        <w:t xml:space="preserve">   python ble_events_PWT.py &lt;ADDRESS&gt; --label doubletap --seconds 20</w:t>
-        <w:br/>
-        <w:t xml:space="preserve">   python ble_events_PWT.py &lt;ADDRESS&gt; --label flick     --seconds 20</w:t>
-        <w:br/>
-        <w:t xml:space="preserve">   python ble_events_PWT.py &lt;ADDRESS&gt; --label raise     --seconds 20</w:t>
+        <w:t xml:space="preserve">   python gesture_PWT.py &lt;ADDRESS&gt; --seconds 120</w:t>
       </w:r>
     </w:p>
     <w:p>
       <w:r>
-        <w:t xml:space="preserve">Send Claude the </w:t>
+        <w:t xml:space="preserve">Flick a few times, tap sharply, double-tap. Adjust </w:t>
+      </w:r>
+      <w:r>
+        <w:rPr>
+          <w:rFonts w:ascii="Consolas" w:hAnsi="Consolas"/>
+          <w:sz w:val="18"/>
+        </w:rPr>
+        <w:t>--gap</w:t>
+      </w:r>
+      <w:r>
+        <w:t xml:space="preserve"> (cluster window) and </w:t>
+      </w:r>
+      <w:r>
+        <w:rPr>
+          <w:rFonts w:ascii="Consolas" w:hAnsi="Consolas"/>
+          <w:sz w:val="18"/>
+        </w:rPr>
+        <w:t>--flick</w:t>
+      </w:r>
+      <w:r>
+        <w:t xml:space="preserve"> (impulses for a flick) until TAP vs FLICK feel right. Send Claude a couple of </w:t>
       </w:r>
       <w:r>
         <w:rPr>
@@ -4714,7 +5262,17 @@
         <w:t>logs\events_*.jsonl</w:t>
       </w:r>
       <w:r>
-        <w:t xml:space="preserve"> files; we diff report-ids/fields per gesture.</w:t>
+        <w:t xml:space="preserve"> so we can decode the </w:t>
+      </w:r>
+      <w:r>
+        <w:rPr>
+          <w:rFonts w:ascii="Consolas" w:hAnsi="Consolas"/>
+          <w:sz w:val="18"/>
+        </w:rPr>
+        <w:t>0x0e</w:t>
+      </w:r>
+      <w:r>
+        <w:t xml:space="preserve"> body (impact field).</w:t>
       </w:r>
     </w:p>
     <w:p>
@@ -4722,7 +5280,21 @@
         <w:pStyle w:val="ListNumber"/>
       </w:pPr>
       <w:r>
-        <w:t>Build a discrete-gesture recogniser from the distinguishing event(s).</w:t>
+        <w:t xml:space="preserve">Build the </w:t>
+      </w:r>
+      <w:r>
+        <w:rPr>
+          <w:b/>
+        </w:rPr>
+        <w:t>L3 safety state machine</w:t>
+      </w:r>
+      <w:r>
+        <w:t xml:space="preserve"> (unit-tested, no hardware) driven by the</w:t>
+      </w:r>
+    </w:p>
+    <w:p>
+      <w:r>
+        <w:t>recogniser: e.g. FLICK = arm/disarm, with fail-closed guards.</w:t>
       </w:r>
     </w:p>
     <w:p>
@@ -4750,7 +5322,7 @@
         <w:t>0x2f</w:t>
       </w:r>
       <w:r>
-        <w:t>) for offline analysis.</w:t>
+        <w:t>) offline.</w:t>
       </w:r>
     </w:p>
     <w:p>

</xml_diff>

<commit_message>
gesture: confirm strength=impact field; sensible defaults; document firmware floor
Live data shows the 0x0e body's first int16 is impact strength (real flick
initial ~7k-31k; ringing ~1.4k-4.8k, clear gap). Default --strength 6000 +
--cooldown 0.6 so each hard flick = one clean FLICK. Documented that the
"must flick hard" effort is a firmware floor (not host-tunable) and that a
deliberate firm flick is acceptable as a discrete arm/confirm trigger.

Co-Authored-By: Claude Opus 4.8 <noreply@anthropic.com>
Claude-Session: https://claude.ai/code/session_01PeXJzKdFE3zg9AVZQtc4Pw
</commit_message>
<xml_diff>
--- a/docs/BUILD_LOG_PWT.docx
+++ b/docs/BUILD_LOG_PWT.docx
@@ -2381,15 +2381,120 @@
         <w:rPr>
           <w:b/>
         </w:rPr>
-        <w:t>← You are here.</w:t>
-      </w:r>
-      <w:r>
-        <w:t xml:space="preserve"> Tune the recogniser on-wrist (gap/flick thresholds), then</w:t>
+        <w:t>Impulse strength field confirmed + firmware floor is real.</w:t>
+      </w:r>
+      <w:r>
+        <w:t xml:space="preserve"> The </w:t>
+      </w:r>
+      <w:r>
+        <w:rPr>
+          <w:rFonts w:ascii="Consolas" w:hAnsi="Consolas"/>
+          <w:sz w:val="18"/>
+        </w:rPr>
+        <w:t>0x0e</w:t>
+      </w:r>
+      <w:r>
+        <w:t xml:space="preserve"> body's</w:t>
       </w:r>
     </w:p>
     <w:p>
       <w:r>
-        <w:t>build the L3 safety state machine on TAP=arm / FLICK=confirm (or similar).</w:t>
+        <w:t xml:space="preserve">first int16 is an </w:t>
+      </w:r>
+      <w:r>
+        <w:rPr>
+          <w:b/>
+        </w:rPr>
+        <w:t>impact-strength</w:t>
+      </w:r>
+      <w:r>
+        <w:t xml:space="preserve"> value: a real flick's initial impulse reads ~7000–31000, while the ringing/settle that follows reads ~1400–4800 (clear gap). So each hard flick can be reduced to one clean </w:t>
+      </w:r>
+      <w:r>
+        <w:rPr>
+          <w:rFonts w:ascii="Consolas" w:hAnsi="Consolas"/>
+          <w:sz w:val="18"/>
+        </w:rPr>
+        <w:t>FLICK</w:t>
+      </w:r>
+      <w:r>
+        <w:t xml:space="preserve"> (strength filter + burst grouping + cooldown; defaults: </w:t>
+      </w:r>
+      <w:r>
+        <w:rPr>
+          <w:rFonts w:ascii="Consolas" w:hAnsi="Consolas"/>
+          <w:sz w:val="18"/>
+        </w:rPr>
+        <w:t>--strength 6000 --cooldown 0.6</w:t>
+      </w:r>
+      <w:r>
+        <w:t xml:space="preserve">). </w:t>
+      </w:r>
+      <w:r>
+        <w:rPr>
+          <w:b/>
+        </w:rPr>
+        <w:t>But the "must flick hard" requirement is a FIRMWARE floor</w:t>
+      </w:r>
+      <w:r>
+        <w:t xml:space="preserve"> — the band only emits the event above its own threshold; no host setting lowers it (confirmed; no sensitivity command exists). A host strength filter only improves *accuracy*, not *sensitivity*.</w:t>
+      </w:r>
+    </w:p>
+    <w:p>
+      <w:pPr>
+        <w:pStyle w:val="ListNumber"/>
+      </w:pPr>
+      <w:r>
+        <w:rPr>
+          <w:b/>
+        </w:rPr>
+        <w:t>Design note:</w:t>
+      </w:r>
+      <w:r>
+        <w:t xml:space="preserve"> a deliberate firm flick is acceptable — even desirable — as a</w:t>
+      </w:r>
+    </w:p>
+    <w:p>
+      <w:r>
+        <w:t xml:space="preserve">discrete </w:t>
+      </w:r>
+      <w:r>
+        <w:rPr>
+          <w:b/>
+        </w:rPr>
+        <w:t>arm / confirm</w:t>
+      </w:r>
+      <w:r>
+        <w:t xml:space="preserve"> trigger (you don't want an accidental light motion firing a vehicle/IoT command). Continuous "active-hold" still needs the 2nd sensor per the architecture; discrete confirm = hard flick from the band is fine.</w:t>
+      </w:r>
+    </w:p>
+    <w:p>
+      <w:pPr>
+        <w:pStyle w:val="ListNumber"/>
+      </w:pPr>
+      <w:r>
+        <w:rPr>
+          <w:b/>
+        </w:rPr>
+        <w:t>← You are here.</w:t>
+      </w:r>
+      <w:r>
+        <w:t xml:space="preserve"> Lock </w:t>
+      </w:r>
+      <w:r>
+        <w:rPr>
+          <w:rFonts w:ascii="Consolas" w:hAnsi="Consolas"/>
+          <w:sz w:val="18"/>
+        </w:rPr>
+        <w:t>FLICK = confirm</w:t>
+      </w:r>
+      <w:r>
+        <w:t xml:space="preserve"> as the band's reliable discrete gesture,</w:t>
+      </w:r>
+    </w:p>
+    <w:p>
+      <w:r>
+        <w:t>then build the L3 safety state machine (pure logic, unit-tested, no hardware).</w:t>
       </w:r>
     </w:p>
     <w:p>

</xml_diff>

<commit_message>
Add L3 fail-closed safety state machine (pure logic, 7 unit tests pass)
safety_state_machine_PWT.py: the only component allowed to authorize motion.
States IDLE/ARMED/HOLDING/STOPPING, default fail-closed. Consumes gesture
(FLICK=arm/disarm), hold (continuous source), heartbeat, tick; emits guarded
ARM/DISARM/MOVE/STOP with a TTL on MOVE. Fail-safes: hold watchdog (0.2s),
heartbeat-loss stop, arm timeout, disarm, and STOPPING can't re-enter HOLDING
without a fresh arm. Runnable self-test covers all 7 cases. Documented in the
build log; regenerated PDF/DOCX.

Co-Authored-By: Claude Opus 4.8 <noreply@anthropic.com>
Claude-Session: https://claude.ai/code/session_01PeXJzKdFE3zg9AVZQtc4Pw
</commit_message>
<xml_diff>
--- a/docs/BUILD_LOG_PWT.docx
+++ b/docs/BUILD_LOG_PWT.docx
@@ -981,7 +981,7 @@
               <w:t>Live gesture recognition</w:t>
             </w:r>
             <w:r>
-              <w:t xml:space="preserve"> — TAP / DOUBLE_TAP / FLICK from </w:t>
+              <w:t xml:space="preserve"> — tunable FLICK trigger from </w:t>
             </w:r>
             <w:r>
               <w:rPr>
@@ -991,7 +991,39 @@
               <w:t>0x0e</w:t>
             </w:r>
             <w:r>
-              <w:t xml:space="preserve"> impulses.</w:t>
+              <w:t xml:space="preserve"> impulses (+ strength filter).</w:t>
+            </w:r>
+          </w:p>
+        </w:tc>
+      </w:tr>
+      <w:tr>
+        <w:tc>
+          <w:tcPr>
+            <w:tcW w:type="dxa" w:w="4320"/>
+          </w:tcPr>
+          <w:p>
+            <w:r>
+              <w:rPr>
+                <w:rFonts w:ascii="Consolas" w:hAnsi="Consolas"/>
+                <w:sz w:val="18"/>
+              </w:rPr>
+              <w:t>safety_state_machine_PWT.py</w:t>
+            </w:r>
+          </w:p>
+        </w:tc>
+        <w:tc>
+          <w:tcPr>
+            <w:tcW w:type="dxa" w:w="4320"/>
+          </w:tcPr>
+          <w:p>
+            <w:r>
+              <w:rPr>
+                <w:b/>
+              </w:rPr>
+              <w:t>L3 fail-closed safety core</w:t>
+            </w:r>
+            <w:r>
+              <w:t xml:space="preserve"> — pure logic, 7 unit tests, no hardware.</w:t>
             </w:r>
           </w:p>
         </w:tc>
@@ -2476,25 +2508,133 @@
         <w:rPr>
           <w:b/>
         </w:rPr>
-        <w:t>← You are here.</w:t>
-      </w:r>
-      <w:r>
-        <w:t xml:space="preserve"> Lock </w:t>
+        <w:t>Built the L3 safety state machine</w:t>
+      </w:r>
+      <w:r>
+        <w:t xml:space="preserve"> (</w:t>
       </w:r>
       <w:r>
         <w:rPr>
           <w:rFonts w:ascii="Consolas" w:hAnsi="Consolas"/>
           <w:sz w:val="18"/>
         </w:rPr>
-        <w:t>FLICK = confirm</w:t>
-      </w:r>
-      <w:r>
-        <w:t xml:space="preserve"> as the band's reliable discrete gesture,</w:t>
+        <w:t>safety_state_machine_PWT.py</w:t>
+      </w:r>
+      <w:r>
+        <w:t>) — pure,</w:t>
       </w:r>
     </w:p>
     <w:p>
       <w:r>
-        <w:t>then build the L3 safety state machine (pure logic, unit-tested, no hardware).</w:t>
+        <w:t xml:space="preserve">hardware-free, fail-closed logic (IDLE/ARMED/HOLDING/STOPPING) consuming </w:t>
+      </w:r>
+      <w:r>
+        <w:rPr>
+          <w:rFonts w:ascii="Consolas" w:hAnsi="Consolas"/>
+          <w:sz w:val="18"/>
+        </w:rPr>
+        <w:t>gesture</w:t>
+      </w:r>
+      <w:r>
+        <w:t xml:space="preserve"> (FLICK=arm/disarm), </w:t>
+      </w:r>
+      <w:r>
+        <w:rPr>
+          <w:rFonts w:ascii="Consolas" w:hAnsi="Consolas"/>
+          <w:sz w:val="18"/>
+        </w:rPr>
+        <w:t>hold</w:t>
+      </w:r>
+      <w:r>
+        <w:t xml:space="preserve"> (continuous source), </w:t>
+      </w:r>
+      <w:r>
+        <w:rPr>
+          <w:rFonts w:ascii="Consolas" w:hAnsi="Consolas"/>
+          <w:sz w:val="18"/>
+        </w:rPr>
+        <w:t>heartbeat</w:t>
+      </w:r>
+      <w:r>
+        <w:t xml:space="preserve">, </w:t>
+      </w:r>
+      <w:r>
+        <w:rPr>
+          <w:rFonts w:ascii="Consolas" w:hAnsi="Consolas"/>
+          <w:sz w:val="18"/>
+        </w:rPr>
+        <w:t>tick</w:t>
+      </w:r>
+      <w:r>
+        <w:t xml:space="preserve">, and emitting guarded </w:t>
+      </w:r>
+      <w:r>
+        <w:rPr>
+          <w:rFonts w:ascii="Consolas" w:hAnsi="Consolas"/>
+          <w:sz w:val="18"/>
+        </w:rPr>
+        <w:t>ARM/DISARM/MOVE/STOP</w:t>
+      </w:r>
+      <w:r>
+        <w:t xml:space="preserve"> commands with a TTL on MOVE. </w:t>
+      </w:r>
+      <w:r>
+        <w:rPr>
+          <w:b/>
+        </w:rPr>
+        <w:t>7 unit tests pass</w:t>
+      </w:r>
+      <w:r>
+        <w:t xml:space="preserve"> covering: happy path, continuous-hold MOVE cadence, hold-without-arm (nothing), disarm-stops, arm-timeout, heartbeat-loss stop, and STOPPING can't jump back to HOLDING. Runs with </w:t>
+      </w:r>
+      <w:r>
+        <w:rPr>
+          <w:rFonts w:ascii="Consolas" w:hAnsi="Consolas"/>
+          <w:sz w:val="18"/>
+        </w:rPr>
+        <w:t>python safety_state_machine_PWT.py</w:t>
+      </w:r>
+      <w:r>
+        <w:t>.</w:t>
+      </w:r>
+    </w:p>
+    <w:p>
+      <w:pPr>
+        <w:pStyle w:val="ListNumber"/>
+      </w:pPr>
+      <w:r>
+        <w:rPr>
+          <w:b/>
+        </w:rPr>
+        <w:t>← You are here.</w:t>
+      </w:r>
+      <w:r>
+        <w:t xml:space="preserve"> Wire the live </w:t>
+      </w:r>
+      <w:r>
+        <w:rPr>
+          <w:rFonts w:ascii="Consolas" w:hAnsi="Consolas"/>
+          <w:sz w:val="18"/>
+        </w:rPr>
+        <w:t>FLICK</w:t>
+      </w:r>
+      <w:r>
+        <w:t xml:space="preserve"> recogniser into the state machine as the</w:t>
+      </w:r>
+    </w:p>
+    <w:p>
+      <w:r>
+        <w:t xml:space="preserve">arm/confirm input; stand up the continuous-hold source (phone IMU) for the </w:t>
+      </w:r>
+      <w:r>
+        <w:rPr>
+          <w:rFonts w:ascii="Consolas" w:hAnsi="Consolas"/>
+          <w:sz w:val="18"/>
+        </w:rPr>
+        <w:t>hold</w:t>
+      </w:r>
+      <w:r>
+        <w:t xml:space="preserve"> input; then a harmless IoT actuator to prove the pipeline end-to-end.</w:t>
       </w:r>
     </w:p>
     <w:p>

</xml_diff>

<commit_message>
Add ble_stop_PWT.py to clear the stuck HR LED; document the behaviour
START (0x03 01) powers the optical HR sensor (green LED); STOP (0x04) turns it
off on a clean finish, but Ctrl+C/closed window skips STOP so the band keeps
streaming (battery drain, LED on off-wrist). ble_stop_PWT.py sends HELLO then
STOP to switch it off on demand. Documented as a Windows gotcha.

Co-Authored-By: Claude Opus 4.8 <noreply@anthropic.com>
Claude-Session: https://claude.ai/code/session_01PeXJzKdFE3zg9AVZQtc4Pw
</commit_message>
<xml_diff>
--- a/docs/BUILD_LOG_PWT.docx
+++ b/docs/BUILD_LOG_PWT.docx
@@ -862,6 +862,32 @@
           <w:p>
             <w:r>
               <w:t>Pair/bond with the band so it will accept our commands (encrypted link).</w:t>
+            </w:r>
+          </w:p>
+        </w:tc>
+      </w:tr>
+      <w:tr>
+        <w:tc>
+          <w:tcPr>
+            <w:tcW w:type="dxa" w:w="4320"/>
+          </w:tcPr>
+          <w:p>
+            <w:r>
+              <w:rPr>
+                <w:rFonts w:ascii="Consolas" w:hAnsi="Consolas"/>
+                <w:sz w:val="18"/>
+              </w:rPr>
+              <w:t>ble_stop_PWT.py</w:t>
+            </w:r>
+          </w:p>
+        </w:tc>
+        <w:tc>
+          <w:tcPr>
+            <w:tcW w:type="dxa" w:w="4320"/>
+          </w:tcPr>
+          <w:p>
+            <w:r>
+              <w:t>Send STOP (0x04) to switch the realtime stream + green HR LED back off.</w:t>
             </w:r>
           </w:p>
         </w:tc>
@@ -5603,6 +5629,55 @@
       </w:r>
     </w:p>
     <w:p>
+      <w:pPr>
+        <w:pStyle w:val="ListBullet"/>
+      </w:pPr>
+      <w:r>
+        <w:rPr>
+          <w:b/>
+        </w:rPr>
+        <w:t>Green HR LED stays on after a run?</w:t>
+      </w:r>
+      <w:r>
+        <w:t xml:space="preserve"> </w:t>
+      </w:r>
+      <w:r>
+        <w:rPr>
+          <w:rFonts w:ascii="Consolas" w:hAnsi="Consolas"/>
+          <w:sz w:val="18"/>
+        </w:rPr>
+        <w:t>START (0x03 01)</w:t>
+      </w:r>
+      <w:r>
+        <w:t xml:space="preserve"> powers the optical HR</w:t>
+      </w:r>
+    </w:p>
+    <w:p>
+      <w:r>
+        <w:t xml:space="preserve">sensor (green LED); tools send </w:t>
+      </w:r>
+      <w:r>
+        <w:rPr>
+          <w:rFonts w:ascii="Consolas" w:hAnsi="Consolas"/>
+          <w:sz w:val="18"/>
+        </w:rPr>
+        <w:t>STOP (0x04)</w:t>
+      </w:r>
+      <w:r>
+        <w:t xml:space="preserve"> on a clean finish, but a Ctrl+C / closed window skips it, so the band keeps streaming (battery drain, LED on even off-wrist). Fix: </w:t>
+      </w:r>
+      <w:r>
+        <w:rPr>
+          <w:rFonts w:ascii="Consolas" w:hAnsi="Consolas"/>
+          <w:sz w:val="18"/>
+        </w:rPr>
+        <w:t>python ble_stop_PWT.py &lt;ADDRESS&gt;</w:t>
+      </w:r>
+      <w:r>
+        <w:t xml:space="preserve"> (or just let it idle/ disconnect and it stops on its own). Behaviour of the band, driven by our last command — not a fault.</w:t>
+      </w:r>
+    </w:p>
+    <w:p>
       <w:r>
         <w:t>________________________________________</w:t>
       </w:r>

</xml_diff>

<commit_message>
Pursue firmware-config sensitivity lead; add debug-log string miner
The band's own debug logs (type 0x32) say "Sensors: Realtime raw disabled" — a
raw sensor mode off by default. Enabling it over BLE (a config command, not
firmware patching) could yield live raw accel and bypass the tap threshold.
decode_debuglog_PWT.py extracts the firmware's ASCII log strings from a capture
to find the command vocabulary. Documented; binary patching ruled out
(signed/brick-risk). Regenerated PDF/DOCX.

Co-Authored-By: Claude Opus 4.8 <noreply@anthropic.com>
Claude-Session: https://claude.ai/code/session_01PeXJzKdFE3zg9AVZQtc4Pw
</commit_message>
<xml_diff>
--- a/docs/BUILD_LOG_PWT.docx
+++ b/docs/BUILD_LOG_PWT.docx
@@ -1080,6 +1080,42 @@
           </w:p>
         </w:tc>
       </w:tr>
+      <w:tr>
+        <w:tc>
+          <w:tcPr>
+            <w:tcW w:type="dxa" w:w="4320"/>
+          </w:tcPr>
+          <w:p>
+            <w:r>
+              <w:rPr>
+                <w:rFonts w:ascii="Consolas" w:hAnsi="Consolas"/>
+                <w:sz w:val="18"/>
+              </w:rPr>
+              <w:t>decode_debuglog_PWT.py</w:t>
+            </w:r>
+          </w:p>
+        </w:tc>
+        <w:tc>
+          <w:tcPr>
+            <w:tcW w:type="dxa" w:w="4320"/>
+          </w:tcPr>
+          <w:p>
+            <w:r>
+              <w:t xml:space="preserve">Mine the band's own firmware debug-log strings (type </w:t>
+            </w:r>
+            <w:r>
+              <w:rPr>
+                <w:rFonts w:ascii="Consolas" w:hAnsi="Consolas"/>
+                <w:sz w:val="18"/>
+              </w:rPr>
+              <w:t>0x32</w:t>
+            </w:r>
+            <w:r>
+              <w:t>) from a capture.</w:t>
+            </w:r>
+          </w:p>
+        </w:tc>
+      </w:tr>
     </w:tbl>
     <w:p>
       <w:r>
@@ -2632,35 +2668,100 @@
         <w:rPr>
           <w:b/>
         </w:rPr>
-        <w:t>← You are here.</w:t>
-      </w:r>
-      <w:r>
-        <w:t xml:space="preserve"> Wire the live </w:t>
-      </w:r>
+        <w:t>Firmware-config lead (sensitivity):</w:t>
+      </w:r>
+      <w:r>
+        <w:t xml:space="preserve"> the band's own debug-log text (type</w:t>
+      </w:r>
+    </w:p>
+    <w:p>
       <w:r>
         <w:rPr>
           <w:rFonts w:ascii="Consolas" w:hAnsi="Consolas"/>
           <w:sz w:val="18"/>
         </w:rPr>
-        <w:t>FLICK</w:t>
-      </w:r>
-      <w:r>
-        <w:t xml:space="preserve"> recogniser into the state machine as the</w:t>
+        <w:t>0x32</w:t>
+      </w:r>
+      <w:r>
+        <w:t xml:space="preserve">, captured during the </w:t>
+      </w:r>
+      <w:r>
+        <w:rPr>
+          <w:rFonts w:ascii="Consolas" w:hAnsi="Consolas"/>
+          <w:sz w:val="18"/>
+        </w:rPr>
+        <w:t>0x16</w:t>
+      </w:r>
+      <w:r>
+        <w:t xml:space="preserve"> historical dump) includes </w:t>
+      </w:r>
+      <w:r>
+        <w:rPr>
+          <w:rFonts w:ascii="Consolas" w:hAnsi="Consolas"/>
+          <w:sz w:val="18"/>
+        </w:rPr>
+        <w:t>Sensors: Realtime HR disabled</w:t>
+      </w:r>
+      <w:r>
+        <w:t xml:space="preserve"> and </w:t>
+      </w:r>
+      <w:r>
+        <w:rPr>
+          <w:rFonts w:ascii="Consolas" w:hAnsi="Consolas"/>
+          <w:sz w:val="18"/>
+        </w:rPr>
+        <w:t>Sensors: Realtime raw disabled</w:t>
+      </w:r>
+      <w:r>
+        <w:t xml:space="preserve"> — i.e. a </w:t>
+      </w:r>
+      <w:r>
+        <w:rPr>
+          <w:b/>
+        </w:rPr>
+        <w:t>raw sensor mode that is off by default</w:t>
+      </w:r>
+      <w:r>
+        <w:t xml:space="preserve">. Enabling it over BLE (a config command, NOT firmware patching — the image is signed/brick-risk) could give live raw accel and make the tap threshold irrelevant. Built </w:t>
+      </w:r>
+      <w:r>
+        <w:rPr>
+          <w:rFonts w:ascii="Consolas" w:hAnsi="Consolas"/>
+          <w:sz w:val="18"/>
+        </w:rPr>
+        <w:t>decode_debuglog_PWT.py</w:t>
+      </w:r>
+      <w:r>
+        <w:t xml:space="preserve"> to mine those strings for the command vocabulary. (Binary firmware patching is out of scope: signed, needs SWD/JTAG + key, bricking risk.)</w:t>
       </w:r>
     </w:p>
     <w:p>
-      <w:r>
-        <w:t xml:space="preserve">arm/confirm input; stand up the continuous-hold source (phone IMU) for the </w:t>
+      <w:pPr>
+        <w:pStyle w:val="ListNumber"/>
+      </w:pPr>
+      <w:r>
+        <w:rPr>
+          <w:b/>
+        </w:rPr>
+        <w:t>← You are here.</w:t>
+      </w:r>
+      <w:r>
+        <w:t xml:space="preserve"> Mine the firmware strings → probe an "enable realtime raw"</w:t>
+      </w:r>
+    </w:p>
+    <w:p>
+      <w:r>
+        <w:t xml:space="preserve">command. In parallel: wire live </w:t>
       </w:r>
       <w:r>
         <w:rPr>
           <w:rFonts w:ascii="Consolas" w:hAnsi="Consolas"/>
           <w:sz w:val="18"/>
         </w:rPr>
-        <w:t>hold</w:t>
-      </w:r>
-      <w:r>
-        <w:t xml:space="preserve"> input; then a harmless IoT actuator to prove the pipeline end-to-end.</w:t>
+        <w:t>FLICK</w:t>
+      </w:r>
+      <w:r>
+        <w:t xml:space="preserve"> → state machine; phone-IMU hold source; harmless IoT actuator to prove the pipeline.</w:t>
       </w:r>
     </w:p>
     <w:p>

</xml_diff>

<commit_message>
Document firmware internals mined from debug logs (Realtime raw lead)
decode_debuglog_PWT.py on the historical-dump capture revealed: two independently
toggled realtime modes (Realtime HR [ours via 0x03 01] and Realtime raw [target,
enable cmd unknown]); a config system (CONFIG_VALUE_OFF); internal stream IDs
R7/R10/R11; confirmation 0x16 = Send Historical Data; HELLO carries SOC + Nordic
Ver 17.2.2.0. Open question (raw over BLE vs app-gated/flash-only) needs an app
BLE sniff. Added §6.8b; regenerated PDF/DOCX.

Co-Authored-By: Claude Opus 4.8 <noreply@anthropic.com>
Claude-Session: https://claude.ai/code/session_01PeXJzKdFE3zg9AVZQtc4Pw
</commit_message>
<xml_diff>
--- a/docs/BUILD_LOG_PWT.docx
+++ b/docs/BUILD_LOG_PWT.docx
@@ -4219,6 +4219,268 @@
         <w:pStyle w:val="Heading2"/>
       </w:pPr>
       <w:r>
+        <w:t>6.8b Firmware internals (from the band's own debug-log strings)</w:t>
+      </w:r>
+    </w:p>
+    <w:p>
+      <w:r>
+        <w:t xml:space="preserve">Mined from </w:t>
+      </w:r>
+      <w:r>
+        <w:rPr>
+          <w:rFonts w:ascii="Consolas" w:hAnsi="Consolas"/>
+          <w:sz w:val="18"/>
+        </w:rPr>
+        <w:t>type 0x32</w:t>
+      </w:r>
+      <w:r>
+        <w:t xml:space="preserve"> debug text during a </w:t>
+      </w:r>
+      <w:r>
+        <w:rPr>
+          <w:rFonts w:ascii="Consolas" w:hAnsi="Consolas"/>
+          <w:sz w:val="18"/>
+        </w:rPr>
+        <w:t>0x16</w:t>
+      </w:r>
+      <w:r>
+        <w:t xml:space="preserve"> historical dump (</w:t>
+      </w:r>
+      <w:r>
+        <w:rPr>
+          <w:rFonts w:ascii="Consolas" w:hAnsi="Consolas"/>
+          <w:sz w:val="18"/>
+        </w:rPr>
+        <w:t>decode_debuglog_PWT.py</w:t>
+      </w:r>
+      <w:r>
+        <w:t>):</w:t>
+      </w:r>
+    </w:p>
+    <w:p>
+      <w:pPr>
+        <w:pStyle w:val="ListBullet"/>
+      </w:pPr>
+      <w:r>
+        <w:rPr>
+          <w:b/>
+        </w:rPr>
+        <w:t>Two realtime modes, independently toggled:</w:t>
+      </w:r>
+      <w:r>
+        <w:t xml:space="preserve"> </w:t>
+      </w:r>
+      <w:r>
+        <w:rPr>
+          <w:rFonts w:ascii="Consolas" w:hAnsi="Consolas"/>
+          <w:sz w:val="18"/>
+        </w:rPr>
+        <w:t>Sensors: Realtime HR</w:t>
+      </w:r>
+      <w:r>
+        <w:t xml:space="preserve"> and</w:t>
+      </w:r>
+    </w:p>
+    <w:p>
+      <w:r>
+        <w:rPr>
+          <w:rFonts w:ascii="Consolas" w:hAnsi="Consolas"/>
+          <w:sz w:val="18"/>
+        </w:rPr>
+        <w:t>Sensors: Realtime raw</w:t>
+      </w:r>
+      <w:r>
+        <w:t xml:space="preserve"> (both logged as </w:t>
+      </w:r>
+      <w:r>
+        <w:rPr>
+          <w:rFonts w:ascii="Consolas" w:hAnsi="Consolas"/>
+          <w:sz w:val="18"/>
+        </w:rPr>
+        <w:t>disabled</w:t>
+      </w:r>
+      <w:r>
+        <w:t xml:space="preserve"> when idle). We drive *HR* via </w:t>
+      </w:r>
+      <w:r>
+        <w:rPr>
+          <w:rFonts w:ascii="Consolas" w:hAnsi="Consolas"/>
+          <w:sz w:val="18"/>
+        </w:rPr>
+        <w:t>0x03 01</w:t>
+      </w:r>
+      <w:r>
+        <w:t xml:space="preserve">; </w:t>
+      </w:r>
+      <w:r>
+        <w:rPr>
+          <w:b/>
+        </w:rPr>
+        <w:t>`Realtime raw` is the target for live accel/PPG but its enable command is unknown</w:t>
+      </w:r>
+      <w:r>
+        <w:t xml:space="preserve"> (the </w:t>
+      </w:r>
+      <w:r>
+        <w:rPr>
+          <w:rFonts w:ascii="Consolas" w:hAnsi="Consolas"/>
+          <w:sz w:val="18"/>
+        </w:rPr>
+        <w:t>0x03</w:t>
+      </w:r>
+      <w:r>
+        <w:t xml:space="preserve"> payload only toggles HR).</w:t>
+      </w:r>
+    </w:p>
+    <w:p>
+      <w:pPr>
+        <w:pStyle w:val="ListBullet"/>
+      </w:pPr>
+      <w:r>
+        <w:rPr>
+          <w:b/>
+        </w:rPr>
+        <w:t>Config system exists:</w:t>
+      </w:r>
+      <w:r>
+        <w:t xml:space="preserve"> </w:t>
+      </w:r>
+      <w:r>
+        <w:rPr>
+          <w:rFonts w:ascii="Consolas" w:hAnsi="Consolas"/>
+          <w:sz w:val="18"/>
+        </w:rPr>
+        <w:t>CONFIG_VALUE_OFF</w:t>
+      </w:r>
+      <w:r>
+        <w:t xml:space="preserve"> (settable config enum).</w:t>
+      </w:r>
+    </w:p>
+    <w:p>
+      <w:pPr>
+        <w:pStyle w:val="ListBullet"/>
+      </w:pPr>
+      <w:r>
+        <w:rPr>
+          <w:b/>
+        </w:rPr>
+        <w:t>Internal stream/packet IDs:</w:t>
+      </w:r>
+      <w:r>
+        <w:t xml:space="preserve"> </w:t>
+      </w:r>
+      <w:r>
+        <w:rPr>
+          <w:rFonts w:ascii="Consolas" w:hAnsi="Consolas"/>
+          <w:sz w:val="18"/>
+        </w:rPr>
+        <w:t>R7 realtime stream</w:t>
+      </w:r>
+      <w:r>
+        <w:t>, `R10+R11 data packet</w:t>
+      </w:r>
+    </w:p>
+    <w:p>
+      <w:r>
+        <w:t>transmission default`.</w:t>
+      </w:r>
+    </w:p>
+    <w:p>
+      <w:pPr>
+        <w:pStyle w:val="ListBullet"/>
+      </w:pPr>
+      <w:r>
+        <w:rPr>
+          <w:rFonts w:ascii="Consolas" w:hAnsi="Consolas"/>
+          <w:sz w:val="18"/>
+        </w:rPr>
+        <w:t>BLE: Command Send Historical Data</w:t>
+      </w:r>
+      <w:r>
+        <w:t xml:space="preserve"> = our </w:t>
+      </w:r>
+      <w:r>
+        <w:rPr>
+          <w:rFonts w:ascii="Consolas" w:hAnsi="Consolas"/>
+          <w:sz w:val="18"/>
+        </w:rPr>
+        <w:t>0x16</w:t>
+      </w:r>
+      <w:r>
+        <w:t>; dump prints `History burst</w:t>
+      </w:r>
+    </w:p>
+    <w:p>
+      <w:r>
+        <w:t>success … Trim: 0x…</w:t>
+      </w:r>
+      <w:r>
+        <w:rPr>
+          <w:rFonts w:ascii="Consolas" w:hAnsi="Consolas"/>
+          <w:sz w:val="18"/>
+        </w:rPr>
+        <w:t xml:space="preserve"> and </w:t>
+      </w:r>
+      <w:r>
+        <w:t>PullStats: Data: N, Events: M, Bytes:…`.</w:t>
+      </w:r>
+    </w:p>
+    <w:p>
+      <w:pPr>
+        <w:pStyle w:val="ListBullet"/>
+      </w:pPr>
+      <w:r>
+        <w:rPr>
+          <w:rFonts w:ascii="Consolas" w:hAnsi="Consolas"/>
+          <w:sz w:val="18"/>
+        </w:rPr>
+        <w:t>HELLO</w:t>
+      </w:r>
+      <w:r>
+        <w:t xml:space="preserve"> reply carries </w:t>
+      </w:r>
+      <w:r>
+        <w:rPr>
+          <w:rFonts w:ascii="Consolas" w:hAnsi="Consolas"/>
+          <w:sz w:val="18"/>
+        </w:rPr>
+        <w:t>FG SOC (tenths)</w:t>
+      </w:r>
+      <w:r>
+        <w:t xml:space="preserve"> (state-of-charge) and `Nordic Ver:</w:t>
+      </w:r>
+    </w:p>
+    <w:p>
+      <w:r>
+        <w:t>17.2.2.0`.</w:t>
+      </w:r>
+    </w:p>
+    <w:p>
+      <w:r>
+        <w:rPr>
+          <w:b/>
+        </w:rPr>
+        <w:t>Open question:</w:t>
+      </w:r>
+      <w:r>
+        <w:t xml:space="preserve"> is </w:t>
+      </w:r>
+      <w:r>
+        <w:rPr>
+          <w:rFonts w:ascii="Consolas" w:hAnsi="Consolas"/>
+          <w:sz w:val="18"/>
+        </w:rPr>
+        <w:t>Realtime raw</w:t>
+      </w:r>
+      <w:r>
+        <w:t xml:space="preserve"> exposable over BLE to a third party, or is it app-auth-gated / flash-only? Not determinable by black-box probing; the definitive answer is a BLE sniff of the official app (HCI snoop log). See §9.</w:t>
+      </w:r>
+    </w:p>
+    <w:p>
+      <w:pPr>
+        <w:pStyle w:val="Heading2"/>
+      </w:pPr>
+      <w:r>
         <w:t>6.9 Live events — type `0x30` on `EVENT_CHAR` (`61080004`)</w:t>
       </w:r>
     </w:p>

</xml_diff>

<commit_message>
Add offline HTML dashboard generator + log confirmed raw capture
plot_rawstream_PWT.py: reads a decoded rawstream CSV and writes a single
self-contained .html (inline data, inline <canvas>, zero external requests) — the
seed of the biometric dashboard, kept fully local per the project's privacy rule.
Renders HR per-second and the gravity/orientation vector (gx/gy/gz/|g|) with stat
tiles (HR range/mean, skin temp, |g| mean).

BUILD_LOG §9.9: record the confirmed 2429-record capture — HR 42-80, 99% of |g|
within 0.9-1.1 g, skin temp 36.1 C, SpO2/resp present; Phase A HR-only (no Gen4
live IMU, as predicted). Regen PDF/DOCX.

Pipeline now end to end: ble_rawstream (capture) -> decode_rawstream (CSV) ->
plot_rawstream (offline HTML).

Co-Authored-By: Claude Opus 4.8 <noreply@anthropic.com>
Claude-Session: https://claude.ai/code/session_01PeXJzKdFE3zg9AVZQtc4Pw
</commit_message>
<xml_diff>
--- a/docs/BUILD_LOG_PWT.docx
+++ b/docs/BUILD_LOG_PWT.docx
@@ -7316,6 +7316,84 @@
         <w:rPr>
           <w:b/>
         </w:rPr>
+        <w:t>CONFIRMED on hardware (2026-10-04).</w:t>
+      </w:r>
+      <w:r>
+        <w:t xml:space="preserve"> One run drained </w:t>
+      </w:r>
+      <w:r>
+        <w:rPr>
+          <w:b/>
+        </w:rPr>
+        <w:t>2429 per-second records (v12, full DSP)</w:t>
+      </w:r>
+      <w:r>
+        <w:t xml:space="preserve"> spanning ~38.9 min. Decoded and validated end-to-end: HR 42–80 bpm (mean 50); gravity vectors with </w:t>
+      </w:r>
+      <w:r>
+        <w:rPr>
+          <w:b/>
+        </w:rPr>
+        <w:t>99% of |g| within 0.9–1.1 g</w:t>
+      </w:r>
+      <w:r>
+        <w:t xml:space="preserve"> after the float32 fix; SpO2 raw red/IR paired (~575/576); </w:t>
+      </w:r>
+      <w:r>
+        <w:rPr>
+          <w:rFonts w:ascii="Consolas" w:hAnsi="Consolas"/>
+          <w:sz w:val="18"/>
+        </w:rPr>
+        <w:t>skin_temp_raw</w:t>
+      </w:r>
+      <w:r>
+        <w:t xml:space="preserve"> 903 → </w:t>
+      </w:r>
+      <w:r>
+        <w:rPr>
+          <w:b/>
+        </w:rPr>
+        <w:t>36.1 °C</w:t>
+      </w:r>
+      <w:r>
+        <w:t xml:space="preserve">; respiration raw present. Pipeline: </w:t>
+      </w:r>
+      <w:r>
+        <w:rPr>
+          <w:rFonts w:ascii="Consolas" w:hAnsi="Consolas"/>
+          <w:sz w:val="18"/>
+        </w:rPr>
+        <w:t>ble_rawstream_PWT.py</w:t>
+      </w:r>
+      <w:r>
+        <w:t xml:space="preserve"> (capture) → </w:t>
+      </w:r>
+      <w:r>
+        <w:rPr>
+          <w:rFonts w:ascii="Consolas" w:hAnsi="Consolas"/>
+          <w:sz w:val="18"/>
+        </w:rPr>
+        <w:t>decode_rawstream_PWT.py</w:t>
+      </w:r>
+      <w:r>
+        <w:t xml:space="preserve"> (→ per-second CSV) → </w:t>
+      </w:r>
+      <w:r>
+        <w:rPr>
+          <w:rFonts w:ascii="Consolas" w:hAnsi="Consolas"/>
+          <w:sz w:val="18"/>
+        </w:rPr>
+        <w:t>plot_rawstream_PWT.py</w:t>
+      </w:r>
+      <w:r>
+        <w:t xml:space="preserve"> (→ offline self-contained HTML dashboard, no external requests, data never leaves the machine). Phase A stayed HR-only (type 0x28) with no live 0x33/0x2b — live IMU firehose confirmed absent on Gen4, as predicted. Absolute timestamps are the band's own (unset) clock; per-second ordering is exact.</w:t>
+      </w:r>
+    </w:p>
+    <w:p>
+      <w:r>
+        <w:rPr>
+          <w:b/>
+        </w:rPr>
         <w:t>Takeaway for the project:</w:t>
       </w:r>
       <w:r>

</xml_diff>

<commit_message>
Pipeline proven against real car; trust local signing-proxy TLS
Gesture-confirmed UNLOCK reached the real 2018 Model 3's cloud and returned the
expected 403 'Tesla Vehicle Command Protocol required' — the whole chain works;
only command signing remains.

- vehicle_actuator_PWT.py: use an unverified SSL context for localhost/127.0.0.1
  so the self-signed tesla-http-proxy cert is trusted (local only).
- BUILD_LOG §9.10: record the milestone + the signing last-mile. Regen PDF/DOCX.

Co-Authored-By: Claude Opus 4.8 <noreply@anthropic.com>
Claude-Session: https://claude.ai/code/session_01PeXJzKdFE3zg9AVZQtc4Pw
</commit_message>
<xml_diff>
--- a/docs/BUILD_LOG_PWT.docx
+++ b/docs/BUILD_LOG_PWT.docx
@@ -7728,7 +7728,27 @@
         <w:t>Status:</w:t>
       </w:r>
       <w:r>
-        <w:t xml:space="preserve"> pipeline works end-to-end today (sim + mock). Real-Tesla discrete is code-complete, pending the user's Fleet API credentials. DRIVE-by-hold (simulator) and gravity-pose arming are the next build.</w:t>
+        <w:t xml:space="preserve"> pipeline PROVEN end-to-end against the real car (2026-10-05). Fleet API app created, domain + hosted public key registered (partner_accounts), OAuth login done, vehicle found (2018 Model 3, online). A gesture-confirmed UNLOCK reached the car's cloud and returned HTTP 403 *"Tesla Vehicle Command Protocol required"* — i.e. the full chain (gesture → safety FSM → dispatch → Fleet API → vehicle) works; the car only requires the command to be SIGNED. Last mile: run </w:t>
+      </w:r>
+      <w:r>
+        <w:rPr>
+          <w:rFonts w:ascii="Consolas" w:hAnsi="Consolas"/>
+          <w:sz w:val="18"/>
+        </w:rPr>
+        <w:t>tesla-http-proxy</w:t>
+      </w:r>
+      <w:r>
+        <w:t xml:space="preserve"> locally (signs with private-key.pem) + pair the virtual key, then point </w:t>
+      </w:r>
+      <w:r>
+        <w:rPr>
+          <w:rFonts w:ascii="Consolas" w:hAnsi="Consolas"/>
+          <w:sz w:val="18"/>
+        </w:rPr>
+        <w:t>TESLA_FLEET_BASE</w:t>
+      </w:r>
+      <w:r>
+        <w:t xml:space="preserve"> at the proxy. Actuator already trusts the proxy's localhost self-signed cert. DRIVE-by-hold (simulator) + gravity-pose arming still to come.</w:t>
       </w:r>
     </w:p>
     <w:p>

</xml_diff>

<commit_message>
MILESTONE: gesture-confirmed UNLOCK executed on the real Model 3 (200 OK)
Full pipeline working end to end against the real car: gesture -> fail-closed
safety FSM -> dispatch -> tesla-http-proxy (signs with private key) -> Fleet API
-> 2018 Model 3, which returned 200 OK on the signed door_unlock after negotiating
sessions with DOMAIN_INFOTAINMENT + DOMAIN_VEHICLE_SECURITY.

BUILD_LOG §9.10: mark WORKING, record the full setup path and the gotchas fixed
(secret copy, partner scopes, .nojekyll, go build vs install, MSYS -subj mangling,
VIN-not-id in the command path). Regen PDF/DOCX.

Co-Authored-By: Claude Opus 4.8 <noreply@anthropic.com>
Claude-Session: https://claude.ai/code/session_01PeXJzKdFE3zg9AVZQtc4Pw
</commit_message>
<xml_diff>
--- a/docs/BUILD_LOG_PWT.docx
+++ b/docs/BUILD_LOG_PWT.docx
@@ -7725,10 +7725,10 @@
         <w:rPr>
           <w:b/>
         </w:rPr>
-        <w:t>Status:</w:t>
-      </w:r>
-      <w:r>
-        <w:t xml:space="preserve"> pipeline PROVEN end-to-end against the real car (2026-10-05). Fleet API app created, domain + hosted public key registered (partner_accounts), OAuth login done, vehicle found (2018 Model 3, online). A gesture-confirmed UNLOCK reached the car's cloud and returned HTTP 403 *"Tesla Vehicle Command Protocol required"* — i.e. the full chain (gesture → safety FSM → dispatch → Fleet API → vehicle) works; the car only requires the command to be SIGNED. Last mile: run </w:t>
+        <w:t>Status: ✅ WORKING — gesture-confirmed UNLOCK executed on the real car (2026-10-05).</w:t>
+      </w:r>
+      <w:r>
+        <w:t xml:space="preserve"> Full chain proven end to end: gesture → fail-closed safety FSM → dispatch → </w:t>
       </w:r>
       <w:r>
         <w:rPr>
@@ -7738,17 +7738,125 @@
         <w:t>tesla-http-proxy</w:t>
       </w:r>
       <w:r>
-        <w:t xml:space="preserve"> locally (signs with private-key.pem) + pair the virtual key, then point </w:t>
+        <w:t xml:space="preserve"> (signs with </w:t>
       </w:r>
       <w:r>
         <w:rPr>
           <w:rFonts w:ascii="Consolas" w:hAnsi="Consolas"/>
           <w:sz w:val="18"/>
         </w:rPr>
-        <w:t>TESLA_FLEET_BASE</w:t>
-      </w:r>
-      <w:r>
-        <w:t xml:space="preserve"> at the proxy. Actuator already trusts the proxy's localhost self-signed cert. DRIVE-by-hold (simulator) + gravity-pose arming still to come.</w:t>
+        <w:t>private-key.pem</w:t>
+      </w:r>
+      <w:r>
+        <w:t xml:space="preserve">) → Tesla Fleet API → 2018 Model 3. The car negotiated sessions with DOMAIN_INFOTAINMENT + DOMAIN_VEHICLE_SECURITY and returned </w:t>
+      </w:r>
+      <w:r>
+        <w:rPr>
+          <w:b/>
+        </w:rPr>
+        <w:t>200 OK</w:t>
+      </w:r>
+      <w:r>
+        <w:t xml:space="preserve"> on the signed </w:t>
+      </w:r>
+      <w:r>
+        <w:rPr>
+          <w:rFonts w:ascii="Consolas" w:hAnsi="Consolas"/>
+          <w:sz w:val="18"/>
+        </w:rPr>
+        <w:t>door_unlock</w:t>
+      </w:r>
+      <w:r>
+        <w:t xml:space="preserve">. Setup that got here: Fleet API app + OAuth (authorization-code), domain + hosted EC public key registered via </w:t>
+      </w:r>
+      <w:r>
+        <w:rPr>
+          <w:rFonts w:ascii="Consolas" w:hAnsi="Consolas"/>
+          <w:sz w:val="18"/>
+        </w:rPr>
+        <w:t>partner_accounts</w:t>
+      </w:r>
+      <w:r>
+        <w:t xml:space="preserve">, virtual key paired to the car, signed commands via the local proxy (TESLA_FLEET_BASE=https://localhost:4443), </w:t>
+      </w:r>
+      <w:r>
+        <w:rPr>
+          <w:b/>
+        </w:rPr>
+        <w:t>VIN</w:t>
+      </w:r>
+      <w:r>
+        <w:t xml:space="preserve"> (not the Fleet API id) as the vehicle tag in the command path.</w:t>
+      </w:r>
+    </w:p>
+    <w:p>
+      <w:r>
+        <w:t xml:space="preserve">Gotchas hit + fixed along the way: client secret truncated on hand-copy (use a verified full copy); partner token must drop openid/offline_access scopes; GitHub user-site Pages needs </w:t>
+      </w:r>
+      <w:r>
+        <w:rPr>
+          <w:rFonts w:ascii="Consolas" w:hAnsi="Consolas"/>
+          <w:sz w:val="18"/>
+        </w:rPr>
+        <w:t>.nojekyll</w:t>
+      </w:r>
+      <w:r>
+        <w:t xml:space="preserve"> or the </w:t>
+      </w:r>
+      <w:r>
+        <w:rPr>
+          <w:rFonts w:ascii="Consolas" w:hAnsi="Consolas"/>
+          <w:sz w:val="18"/>
+        </w:rPr>
+        <w:t>.well-known</w:t>
+      </w:r>
+      <w:r>
+        <w:t xml:space="preserve"> key 404s; </w:t>
+      </w:r>
+      <w:r>
+        <w:rPr>
+          <w:rFonts w:ascii="Consolas" w:hAnsi="Consolas"/>
+          <w:sz w:val="18"/>
+        </w:rPr>
+        <w:t>go install</w:t>
+      </w:r>
+      <w:r>
+        <w:t xml:space="preserve"> fails on this repo's replace directives (clone + </w:t>
+      </w:r>
+      <w:r>
+        <w:rPr>
+          <w:rFonts w:ascii="Consolas" w:hAnsi="Consolas"/>
+          <w:sz w:val="18"/>
+        </w:rPr>
+        <w:t>go build</w:t>
+      </w:r>
+      <w:r>
+        <w:t xml:space="preserve"> instead); Git Bash mangles </w:t>
+      </w:r>
+      <w:r>
+        <w:rPr>
+          <w:rFonts w:ascii="Consolas" w:hAnsi="Consolas"/>
+          <w:sz w:val="18"/>
+        </w:rPr>
+        <w:t>-subj "/CN=..."</w:t>
+      </w:r>
+      <w:r>
+        <w:t xml:space="preserve"> (prefix </w:t>
+      </w:r>
+      <w:r>
+        <w:rPr>
+          <w:rFonts w:ascii="Consolas" w:hAnsi="Consolas"/>
+          <w:sz w:val="18"/>
+        </w:rPr>
+        <w:t>MSYS_NO_PATHCONV=1</w:t>
+      </w:r>
+      <w:r>
+        <w:t>); the signing proxy requires the VIN in the path, not the numeric id.</w:t>
+      </w:r>
+    </w:p>
+    <w:p>
+      <w:r>
+        <w:t>Next: wire real band FLICKs into this (replace keyboard sim), extend the menu (lock/flash/honk/frunk/climate), the DRIVE-by-hold simulator demo, and gravity-pose arming.</w:t>
       </w:r>
     </w:p>
     <w:p>

</xml_diff>

<commit_message>
Add one-command launcher + compiled QUICKSTART; document haptics/ergonomics
- launch_PWT.ps1: one command does it all — refresh token, start the signing proxy
  (if not already up), wait for it, set env vars, launch gesture control, stop the
  proxy on exit. Tap to wake, tap-code to act.
- docs/QUICKSTART_PWT.md: start-to-finish compiled guide — what works, the pipeline,
  one-command + manual run, tap tuning, one-time setup recap, tool reference, safety.
- BUILD_LOG §9.11: tap-not-flick ergonomics (accelerometer wake-on-motion is firmware,
  not overridable), two-level recognizer, haptic feedback, the launcher.
- Regenerated PDF/DOCX for BUILD_LOG, QUICKSTART, and architecture.

Co-Authored-By: Claude Opus 4.8 <noreply@anthropic.com>
Claude-Session: https://claude.ai/code/session_01PeXJzKdFE3zg9AVZQtc4Pw
</commit_message>
<xml_diff>
--- a/docs/BUILD_LOG_PWT.docx
+++ b/docs/BUILD_LOG_PWT.docx
@@ -7857,6 +7857,212 @@
     <w:p>
       <w:r>
         <w:t>Next: wire real band FLICKs into this (replace keyboard sim), extend the menu (lock/flash/honk/frunk/climate), the DRIVE-by-hold simulator demo, and gravity-pose arming.</w:t>
+      </w:r>
+    </w:p>
+    <w:p>
+      <w:r>
+        <w:t>________________________________________</w:t>
+      </w:r>
+    </w:p>
+    <w:p>
+      <w:pPr>
+        <w:pStyle w:val="Heading1"/>
+      </w:pPr>
+      <w:r>
+        <w:t>9.11 Ergonomics + haptics + one-command launch</w:t>
+      </w:r>
+    </w:p>
+    <w:p>
+      <w:r>
+        <w:rPr>
+          <w:b/>
+        </w:rPr>
+        <w:t>Tap, don't flick.</w:t>
+      </w:r>
+      <w:r>
+        <w:t xml:space="preserve"> Hard wrist flicks hurt, and the band's accelerometer uses firmware wake-on-motion power management we can't override over BLE (keeping realtime HR on does NOT keep motion sampling awake — proven: HR streamed continuously while only one motion event fired, on the tap). The ergonomic fix: </w:t>
+      </w:r>
+      <w:r>
+        <w:rPr>
+          <w:b/>
+        </w:rPr>
+        <w:t>tap the band face</w:t>
+      </w:r>
+      <w:r>
+        <w:t xml:space="preserve"> (same </w:t>
+      </w:r>
+      <w:r>
+        <w:rPr>
+          <w:rFonts w:ascii="Consolas" w:hAnsi="Consolas"/>
+          <w:sz w:val="18"/>
+        </w:rPr>
+        <w:t>0x0e</w:t>
+      </w:r>
+      <w:r>
+        <w:t xml:space="preserve"> events, far less strain). First tap firm to wake the accelerometer, then light taps register. Calibration on the user's wrist showed noise under ~1600 and intentional light taps ~2400+, so the default </w:t>
+      </w:r>
+      <w:r>
+        <w:rPr>
+          <w:rFonts w:ascii="Consolas" w:hAnsi="Consolas"/>
+          <w:sz w:val="18"/>
+        </w:rPr>
+        <w:t>--strength</w:t>
+      </w:r>
+      <w:r>
+        <w:t xml:space="preserve"> is 2200; </w:t>
+      </w:r>
+      <w:r>
+        <w:rPr>
+          <w:rFonts w:ascii="Consolas" w:hAnsi="Consolas"/>
+          <w:sz w:val="18"/>
+        </w:rPr>
+        <w:t>--calibrate</w:t>
+      </w:r>
+      <w:r>
+        <w:t xml:space="preserve"> prints strengths with no commands sent.</w:t>
+      </w:r>
+    </w:p>
+    <w:p>
+      <w:r>
+        <w:rPr>
+          <w:b/>
+        </w:rPr>
+        <w:t>Flick/tap recognizer rebuilt</w:t>
+      </w:r>
+      <w:r>
+        <w:t xml:space="preserve"> with two-level timing: a refractory window (</w:t>
+      </w:r>
+      <w:r>
+        <w:rPr>
+          <w:rFonts w:ascii="Consolas" w:hAnsi="Consolas"/>
+          <w:sz w:val="18"/>
+        </w:rPr>
+        <w:t>--flick-gap</w:t>
+      </w:r>
+      <w:r>
+        <w:t xml:space="preserve"> 0.28 s) collapses one tap's ringing into a single tap, then a </w:t>
+      </w:r>
+      <w:r>
+        <w:rPr>
+          <w:rFonts w:ascii="Consolas" w:hAnsi="Consolas"/>
+          <w:sz w:val="18"/>
+        </w:rPr>
+        <w:t>--multi-window</w:t>
+      </w:r>
+      <w:r>
+        <w:t xml:space="preserve"> (0.6 s) groups distinct taps → 1 = FLICK, 2 = DOUBLE_FLICK, 3+ = SHAKE. This fixed "a single flick read as a double, a double read as two singles."</w:t>
+      </w:r>
+    </w:p>
+    <w:p>
+      <w:r>
+        <w:rPr>
+          <w:b/>
+        </w:rPr>
+        <w:t>Haptic feedback.</w:t>
+      </w:r>
+      <w:r>
+        <w:t xml:space="preserve"> The WHOOP 4.0 has a buzz motor; drive it via </w:t>
+      </w:r>
+      <w:r>
+        <w:rPr>
+          <w:rFonts w:ascii="Consolas" w:hAnsi="Consolas"/>
+          <w:sz w:val="18"/>
+        </w:rPr>
+        <w:t>RUN_HAPTICS_PATTERN</w:t>
+      </w:r>
+      <w:r>
+        <w:t xml:space="preserve"> (opcode 79, body </w:t>
+      </w:r>
+      <w:r>
+        <w:rPr>
+          <w:rFonts w:ascii="Consolas" w:hAnsi="Consolas"/>
+          <w:sz w:val="18"/>
+        </w:rPr>
+        <w:t>[pattern, loops, 0,0,0]</w:t>
+      </w:r>
+      <w:r>
+        <w:t xml:space="preserve">, pattern 2 = the 4.0 buzz; from whoop-rs </w:t>
+      </w:r>
+      <w:r>
+        <w:rPr>
+          <w:rFonts w:ascii="Consolas" w:hAnsi="Consolas"/>
+          <w:sz w:val="18"/>
+        </w:rPr>
+        <w:t>haptic.rs</w:t>
+      </w:r>
+      <w:r>
+        <w:t xml:space="preserve">). The controller now buzzes on connect / arm / confirm / panic, so the loop is closed: tap to arm → feel it arm → tap to confirm → feel it fire. </w:t>
+      </w:r>
+      <w:r>
+        <w:rPr>
+          <w:rFonts w:ascii="Consolas" w:hAnsi="Consolas"/>
+          <w:sz w:val="18"/>
+        </w:rPr>
+        <w:t>ble_haptic_PWT.py</w:t>
+      </w:r>
+      <w:r>
+        <w:t xml:space="preserve"> tests the motor (</w:t>
+      </w:r>
+      <w:r>
+        <w:rPr>
+          <w:rFonts w:ascii="Consolas" w:hAnsi="Consolas"/>
+          <w:sz w:val="18"/>
+        </w:rPr>
+        <w:t>--sweep</w:t>
+      </w:r>
+      <w:r>
+        <w:t xml:space="preserve"> compares patterns); </w:t>
+      </w:r>
+      <w:r>
+        <w:rPr>
+          <w:rFonts w:ascii="Consolas" w:hAnsi="Consolas"/>
+          <w:sz w:val="18"/>
+        </w:rPr>
+        <w:t>--no-haptics</w:t>
+      </w:r>
+      <w:r>
+        <w:t xml:space="preserve"> disables it.</w:t>
+      </w:r>
+    </w:p>
+    <w:p>
+      <w:r>
+        <w:rPr>
+          <w:b/>
+        </w:rPr>
+        <w:t>One-command launch.</w:t>
+      </w:r>
+      <w:r>
+        <w:t xml:space="preserve"> </w:t>
+      </w:r>
+      <w:r>
+        <w:rPr>
+          <w:rFonts w:ascii="Consolas" w:hAnsi="Consolas"/>
+          <w:sz w:val="18"/>
+        </w:rPr>
+        <w:t>launch_PWT.ps1</w:t>
+      </w:r>
+      <w:r>
+        <w:t xml:space="preserve"> (repo root) refreshes the token, starts the signing proxy if it isn't up, waits for it to listen, sets the env vars, and launches gesture control — then stops the proxy it started on exit. Run: </w:t>
+      </w:r>
+      <w:r>
+        <w:rPr>
+          <w:rFonts w:ascii="Consolas" w:hAnsi="Consolas"/>
+          <w:sz w:val="18"/>
+        </w:rPr>
+        <w:t>powershell -ExecutionPolicy Bypass -File launch_PWT.ps1</w:t>
+      </w:r>
+      <w:r>
+        <w:t xml:space="preserve">, tap to wake, tap-code to act. Full run/tuning/setup instructions live in </w:t>
+      </w:r>
+      <w:r>
+        <w:rPr>
+          <w:rFonts w:ascii="Consolas" w:hAnsi="Consolas"/>
+          <w:sz w:val="18"/>
+        </w:rPr>
+        <w:t>docs/QUICKSTART_PWT.md</w:t>
+      </w:r>
+      <w:r>
+        <w:t>.</w:t>
       </w:r>
     </w:p>
     <w:p>

</xml_diff>

<commit_message>
Docs + launcher text: reflect tap-to-cycle/pause-to-confirm band model
Confirmed working on the real car. Update QUICKSTART run/tuning sections, BUILD_LOG
§9.11, and the launcher's ready message to the dwell model (was stale 'two taps =
confirm'). Regen PDF/DOCX.

Co-Authored-By: Claude Opus 4.8 <noreply@anthropic.com>
Claude-Session: https://claude.ai/code/session_01PeXJzKdFE3zg9AVZQtc4Pw
</commit_message>
<xml_diff>
--- a/docs/BUILD_LOG_PWT.docx
+++ b/docs/BUILD_LOG_PWT.docx
@@ -7927,10 +7927,10 @@
         <w:rPr>
           <w:b/>
         </w:rPr>
-        <w:t>Flick/tap recognizer rebuilt</w:t>
-      </w:r>
-      <w:r>
-        <w:t xml:space="preserve"> with two-level timing: a refractory window (</w:t>
+        <w:t>Band interaction = tap-to-cycle, pause-to-confirm</w:t>
+      </w:r>
+      <w:r>
+        <w:t xml:space="preserve"> (the model that actually works). Counting taps (1/2/3) misfired because taps bounce: a double-tap's ringing added a phantom 3rd tap → read as SHAKE → accidental panic. The robust model: each debounced tap (</w:t>
       </w:r>
       <w:r>
         <w:rPr>
@@ -7940,17 +7940,66 @@
         <w:t>--flick-gap</w:t>
       </w:r>
       <w:r>
-        <w:t xml:space="preserve"> 0.28 s) collapses one tap's ringing into a single tap, then a </w:t>
+        <w:t xml:space="preserve"> 0.30 s collapses one tap's ringing) advances a menu; </w:t>
+      </w:r>
+      <w:r>
+        <w:rPr>
+          <w:b/>
+        </w:rPr>
+        <w:t>pausing `--dwell` (2.5 s) on a command fires it</w:t>
+      </w:r>
+      <w:r>
+        <w:t xml:space="preserve">. Bounce can only over-advance the menu (recoverable, and visible on screen) — it can never trigger the wrong action or panic. The menu ends in </w:t>
       </w:r>
       <w:r>
         <w:rPr>
           <w:rFonts w:ascii="Consolas" w:hAnsi="Consolas"/>
           <w:sz w:val="18"/>
         </w:rPr>
-        <w:t>--multi-window</w:t>
-      </w:r>
-      <w:r>
-        <w:t xml:space="preserve"> (0.6 s) groups distinct taps → 1 = FLICK, 2 = DOUBLE_FLICK, 3+ = SHAKE. This fixed "a single flick read as a double, a double read as two singles."</w:t>
+        <w:t>CANCEL</w:t>
+      </w:r>
+      <w:r>
+        <w:t xml:space="preserve"> so a dwell can back out safely. Confirmed on the real car: tap to </w:t>
+      </w:r>
+      <w:r>
+        <w:rPr>
+          <w:rFonts w:ascii="Consolas" w:hAnsi="Consolas"/>
+          <w:sz w:val="18"/>
+        </w:rPr>
+        <w:t>[UNLOCK]</w:t>
+      </w:r>
+      <w:r>
+        <w:t>/</w:t>
+      </w:r>
+      <w:r>
+        <w:rPr>
+          <w:rFonts w:ascii="Consolas" w:hAnsi="Consolas"/>
+          <w:sz w:val="18"/>
+        </w:rPr>
+        <w:t>[LOCK]</w:t>
+      </w:r>
+      <w:r>
+        <w:t>/</w:t>
+      </w:r>
+      <w:r>
+        <w:rPr>
+          <w:rFonts w:ascii="Consolas" w:hAnsi="Consolas"/>
+          <w:sz w:val="18"/>
+        </w:rPr>
+        <w:t>[FLASH]</w:t>
+      </w:r>
+      <w:r>
+        <w:t>/</w:t>
+      </w:r>
+      <w:r>
+        <w:rPr>
+          <w:rFonts w:ascii="Consolas" w:hAnsi="Consolas"/>
+          <w:sz w:val="18"/>
+        </w:rPr>
+        <w:t>[HONK]</w:t>
+      </w:r>
+      <w:r>
+        <w:t>, pause, command sent — clean every time, comfortable taps, no misfires.</w:t>
       </w:r>
     </w:p>
     <w:p>

</xml_diff>